<commit_message>
Added format of test-suite for task Teacher
</commit_message>
<xml_diff>
--- a/lab12/Report/Report.docx
+++ b/lab12/Report/Report.docx
@@ -2213,6 +2213,4692 @@
           <w:szCs w:val="28"/>
         </w:rPr>
       </w:pPr>
+    </w:p>
+    <w:p>
+      <w:pPr>
+        <w:rPr>
+          <w:lang w:val="en-US"/>
+        </w:rPr>
+      </w:pPr>
+      <w:r>
+        <w:rPr>
+          <w:lang w:val="ru-RU"/>
+        </w:rPr>
+        <w:t>Код класу</w:t>
+      </w:r>
+      <w:r>
+        <w:rPr>
+          <w:lang w:val="en-US"/>
+        </w:rPr>
+        <w:t>:</w:t>
+      </w:r>
+    </w:p>
+    <w:p>
+      <w:pPr>
+        <w:rPr>
+          <w:lang w:val="en-US"/>
+        </w:rPr>
+      </w:pPr>
+    </w:p>
+    <w:p>
+      <w:pPr>
+        <w:rPr>
+          <w:rFonts w:ascii="Courier New" w:hAnsi="Courier New" w:cs="Courier New"/>
+          <w:sz w:val="20"/>
+          <w:szCs w:val="20"/>
+          <w:lang w:val="en-US"/>
+        </w:rPr>
+      </w:pPr>
+      <w:r>
+        <w:rPr>
+          <w:rFonts w:ascii="Courier New" w:hAnsi="Courier New" w:cs="Courier New"/>
+          <w:sz w:val="20"/>
+          <w:szCs w:val="20"/>
+          <w:lang w:val="en-US"/>
+        </w:rPr>
+        <w:t>#ifndef MODULES_NIKOLENKO_H_INCLUDED</w:t>
+      </w:r>
+    </w:p>
+    <w:p>
+      <w:pPr>
+        <w:rPr>
+          <w:rFonts w:ascii="Courier New" w:hAnsi="Courier New" w:cs="Courier New"/>
+          <w:sz w:val="20"/>
+          <w:szCs w:val="20"/>
+          <w:lang w:val="en-US"/>
+        </w:rPr>
+      </w:pPr>
+      <w:r>
+        <w:rPr>
+          <w:rFonts w:ascii="Courier New" w:hAnsi="Courier New" w:cs="Courier New"/>
+          <w:sz w:val="20"/>
+          <w:szCs w:val="20"/>
+          <w:lang w:val="en-US"/>
+        </w:rPr>
+        <w:t>#define MODULES_NIKOLENKO_H_INCLUDED</w:t>
+      </w:r>
+    </w:p>
+    <w:p>
+      <w:pPr>
+        <w:rPr>
+          <w:rFonts w:ascii="Courier New" w:hAnsi="Courier New" w:cs="Courier New"/>
+          <w:sz w:val="20"/>
+          <w:szCs w:val="20"/>
+          <w:lang w:val="en-US"/>
+        </w:rPr>
+      </w:pPr>
+    </w:p>
+    <w:p>
+      <w:pPr>
+        <w:rPr>
+          <w:rFonts w:ascii="Courier New" w:hAnsi="Courier New" w:cs="Courier New"/>
+          <w:sz w:val="20"/>
+          <w:szCs w:val="20"/>
+          <w:lang w:val="en-US"/>
+        </w:rPr>
+      </w:pPr>
+      <w:r>
+        <w:rPr>
+          <w:rFonts w:ascii="Courier New" w:hAnsi="Courier New" w:cs="Courier New"/>
+          <w:sz w:val="20"/>
+          <w:szCs w:val="20"/>
+          <w:lang w:val="en-US"/>
+        </w:rPr>
+        <w:t>#include &lt;iostream&gt;</w:t>
+      </w:r>
+    </w:p>
+    <w:p>
+      <w:pPr>
+        <w:rPr>
+          <w:rFonts w:ascii="Courier New" w:hAnsi="Courier New" w:cs="Courier New"/>
+          <w:sz w:val="20"/>
+          <w:szCs w:val="20"/>
+          <w:lang w:val="en-US"/>
+        </w:rPr>
+      </w:pPr>
+    </w:p>
+    <w:p>
+      <w:pPr>
+        <w:rPr>
+          <w:rFonts w:ascii="Courier New" w:hAnsi="Courier New" w:cs="Courier New"/>
+          <w:sz w:val="20"/>
+          <w:szCs w:val="20"/>
+          <w:lang w:val="en-US"/>
+        </w:rPr>
+      </w:pPr>
+      <w:r>
+        <w:rPr>
+          <w:rFonts w:ascii="Courier New" w:hAnsi="Courier New" w:cs="Courier New"/>
+          <w:sz w:val="20"/>
+          <w:szCs w:val="20"/>
+          <w:lang w:val="en-US"/>
+        </w:rPr>
+        <w:t>class ClassLab12_Nikolenko {</w:t>
+      </w:r>
+    </w:p>
+    <w:p>
+      <w:pPr>
+        <w:rPr>
+          <w:rFonts w:ascii="Courier New" w:hAnsi="Courier New" w:cs="Courier New"/>
+          <w:sz w:val="20"/>
+          <w:szCs w:val="20"/>
+          <w:lang w:val="en-US"/>
+        </w:rPr>
+      </w:pPr>
+      <w:r>
+        <w:rPr>
+          <w:rFonts w:ascii="Courier New" w:hAnsi="Courier New" w:cs="Courier New"/>
+          <w:sz w:val="20"/>
+          <w:szCs w:val="20"/>
+          <w:lang w:val="en-US"/>
+        </w:rPr>
+        <w:t>private:</w:t>
+      </w:r>
+    </w:p>
+    <w:p>
+      <w:pPr>
+        <w:rPr>
+          <w:rFonts w:ascii="Courier New" w:hAnsi="Courier New" w:cs="Courier New"/>
+          <w:sz w:val="20"/>
+          <w:szCs w:val="20"/>
+          <w:lang w:val="en-US"/>
+        </w:rPr>
+      </w:pPr>
+      <w:r>
+        <w:rPr>
+          <w:rFonts w:ascii="Courier New" w:hAnsi="Courier New" w:cs="Courier New"/>
+          <w:sz w:val="20"/>
+          <w:szCs w:val="20"/>
+          <w:lang w:val="en-US"/>
+        </w:rPr>
+        <w:t xml:space="preserve">    double sideA; // Довжина</w:t>
+      </w:r>
+    </w:p>
+    <w:p>
+      <w:pPr>
+        <w:rPr>
+          <w:rFonts w:ascii="Courier New" w:hAnsi="Courier New" w:cs="Courier New"/>
+          <w:sz w:val="20"/>
+          <w:szCs w:val="20"/>
+          <w:lang w:val="en-US"/>
+        </w:rPr>
+      </w:pPr>
+      <w:r>
+        <w:rPr>
+          <w:rFonts w:ascii="Courier New" w:hAnsi="Courier New" w:cs="Courier New"/>
+          <w:sz w:val="20"/>
+          <w:szCs w:val="20"/>
+          <w:lang w:val="en-US"/>
+        </w:rPr>
+        <w:t xml:space="preserve">    double sideB; // Ширина</w:t>
+      </w:r>
+    </w:p>
+    <w:p>
+      <w:pPr>
+        <w:rPr>
+          <w:rFonts w:ascii="Courier New" w:hAnsi="Courier New" w:cs="Courier New"/>
+          <w:sz w:val="20"/>
+          <w:szCs w:val="20"/>
+          <w:lang w:val="en-US"/>
+        </w:rPr>
+      </w:pPr>
+      <w:r>
+        <w:rPr>
+          <w:rFonts w:ascii="Courier New" w:hAnsi="Courier New" w:cs="Courier New"/>
+          <w:sz w:val="20"/>
+          <w:szCs w:val="20"/>
+          <w:lang w:val="en-US"/>
+        </w:rPr>
+        <w:t xml:space="preserve">    double sideH; // Висота</w:t>
+      </w:r>
+    </w:p>
+    <w:p>
+      <w:pPr>
+        <w:rPr>
+          <w:rFonts w:ascii="Courier New" w:hAnsi="Courier New" w:cs="Courier New"/>
+          <w:sz w:val="20"/>
+          <w:szCs w:val="20"/>
+          <w:lang w:val="en-US"/>
+        </w:rPr>
+      </w:pPr>
+    </w:p>
+    <w:p>
+      <w:pPr>
+        <w:rPr>
+          <w:rFonts w:ascii="Courier New" w:hAnsi="Courier New" w:cs="Courier New"/>
+          <w:sz w:val="20"/>
+          <w:szCs w:val="20"/>
+          <w:lang w:val="en-US"/>
+        </w:rPr>
+      </w:pPr>
+      <w:r>
+        <w:rPr>
+          <w:rFonts w:ascii="Courier New" w:hAnsi="Courier New" w:cs="Courier New"/>
+          <w:sz w:val="20"/>
+          <w:szCs w:val="20"/>
+          <w:lang w:val="en-US"/>
+        </w:rPr>
+        <w:t>public:</w:t>
+      </w:r>
+    </w:p>
+    <w:p>
+      <w:pPr>
+        <w:rPr>
+          <w:rFonts w:ascii="Courier New" w:hAnsi="Courier New" w:cs="Courier New"/>
+          <w:sz w:val="20"/>
+          <w:szCs w:val="20"/>
+          <w:lang w:val="en-US"/>
+        </w:rPr>
+      </w:pPr>
+      <w:r>
+        <w:rPr>
+          <w:rFonts w:ascii="Courier New" w:hAnsi="Courier New" w:cs="Courier New"/>
+          <w:sz w:val="20"/>
+          <w:szCs w:val="20"/>
+          <w:lang w:val="en-US"/>
+        </w:rPr>
+        <w:t xml:space="preserve">    </w:t>
+      </w:r>
+    </w:p>
+    <w:p>
+      <w:pPr>
+        <w:rPr>
+          <w:rFonts w:ascii="Courier New" w:hAnsi="Courier New" w:cs="Courier New"/>
+          <w:sz w:val="20"/>
+          <w:szCs w:val="20"/>
+          <w:lang w:val="en-US"/>
+        </w:rPr>
+      </w:pPr>
+      <w:r>
+        <w:rPr>
+          <w:rFonts w:ascii="Courier New" w:hAnsi="Courier New" w:cs="Courier New"/>
+          <w:sz w:val="20"/>
+          <w:szCs w:val="20"/>
+          <w:lang w:val="en-US"/>
+        </w:rPr>
+        <w:t xml:space="preserve">    ClassLab12_Nikolenko(double a = 1.0, double b = 1.0, double h = 1.0);</w:t>
+      </w:r>
+    </w:p>
+    <w:p>
+      <w:pPr>
+        <w:rPr>
+          <w:rFonts w:ascii="Courier New" w:hAnsi="Courier New" w:cs="Courier New"/>
+          <w:sz w:val="20"/>
+          <w:szCs w:val="20"/>
+          <w:lang w:val="en-US"/>
+        </w:rPr>
+      </w:pPr>
+    </w:p>
+    <w:p>
+      <w:pPr>
+        <w:rPr>
+          <w:rFonts w:ascii="Courier New" w:hAnsi="Courier New" w:cs="Courier New"/>
+          <w:sz w:val="20"/>
+          <w:szCs w:val="20"/>
+          <w:lang w:val="en-US"/>
+        </w:rPr>
+      </w:pPr>
+      <w:r>
+        <w:rPr>
+          <w:rFonts w:ascii="Courier New" w:hAnsi="Courier New" w:cs="Courier New"/>
+          <w:sz w:val="20"/>
+          <w:szCs w:val="20"/>
+          <w:lang w:val="en-US"/>
+        </w:rPr>
+        <w:t xml:space="preserve">    </w:t>
+      </w:r>
+    </w:p>
+    <w:p>
+      <w:pPr>
+        <w:rPr>
+          <w:rFonts w:ascii="Courier New" w:hAnsi="Courier New" w:cs="Courier New"/>
+          <w:sz w:val="20"/>
+          <w:szCs w:val="20"/>
+          <w:lang w:val="en-US"/>
+        </w:rPr>
+      </w:pPr>
+      <w:r>
+        <w:rPr>
+          <w:rFonts w:ascii="Courier New" w:hAnsi="Courier New" w:cs="Courier New"/>
+          <w:sz w:val="20"/>
+          <w:szCs w:val="20"/>
+          <w:lang w:val="en-US"/>
+        </w:rPr>
+        <w:t xml:space="preserve">    void setA(double a);</w:t>
+      </w:r>
+    </w:p>
+    <w:p>
+      <w:pPr>
+        <w:rPr>
+          <w:rFonts w:ascii="Courier New" w:hAnsi="Courier New" w:cs="Courier New"/>
+          <w:sz w:val="20"/>
+          <w:szCs w:val="20"/>
+          <w:lang w:val="en-US"/>
+        </w:rPr>
+      </w:pPr>
+      <w:r>
+        <w:rPr>
+          <w:rFonts w:ascii="Courier New" w:hAnsi="Courier New" w:cs="Courier New"/>
+          <w:sz w:val="20"/>
+          <w:szCs w:val="20"/>
+          <w:lang w:val="en-US"/>
+        </w:rPr>
+        <w:t xml:space="preserve">    void setB(double b);</w:t>
+      </w:r>
+    </w:p>
+    <w:p>
+      <w:pPr>
+        <w:rPr>
+          <w:rFonts w:ascii="Courier New" w:hAnsi="Courier New" w:cs="Courier New"/>
+          <w:sz w:val="20"/>
+          <w:szCs w:val="20"/>
+          <w:lang w:val="en-US"/>
+        </w:rPr>
+      </w:pPr>
+      <w:r>
+        <w:rPr>
+          <w:rFonts w:ascii="Courier New" w:hAnsi="Courier New" w:cs="Courier New"/>
+          <w:sz w:val="20"/>
+          <w:szCs w:val="20"/>
+          <w:lang w:val="en-US"/>
+        </w:rPr>
+        <w:t xml:space="preserve">    void setH(double h);</w:t>
+      </w:r>
+    </w:p>
+    <w:p>
+      <w:pPr>
+        <w:rPr>
+          <w:rFonts w:ascii="Courier New" w:hAnsi="Courier New" w:cs="Courier New"/>
+          <w:sz w:val="20"/>
+          <w:szCs w:val="20"/>
+          <w:lang w:val="en-US"/>
+        </w:rPr>
+      </w:pPr>
+    </w:p>
+    <w:p>
+      <w:pPr>
+        <w:rPr>
+          <w:rFonts w:ascii="Courier New" w:hAnsi="Courier New" w:cs="Courier New"/>
+          <w:sz w:val="20"/>
+          <w:szCs w:val="20"/>
+          <w:lang w:val="en-US"/>
+        </w:rPr>
+      </w:pPr>
+      <w:r>
+        <w:rPr>
+          <w:rFonts w:ascii="Courier New" w:hAnsi="Courier New" w:cs="Courier New"/>
+          <w:sz w:val="20"/>
+          <w:szCs w:val="20"/>
+          <w:lang w:val="en-US"/>
+        </w:rPr>
+        <w:t xml:space="preserve">    double getA() const;</w:t>
+      </w:r>
+    </w:p>
+    <w:p>
+      <w:pPr>
+        <w:rPr>
+          <w:rFonts w:ascii="Courier New" w:hAnsi="Courier New" w:cs="Courier New"/>
+          <w:sz w:val="20"/>
+          <w:szCs w:val="20"/>
+          <w:lang w:val="en-US"/>
+        </w:rPr>
+      </w:pPr>
+      <w:r>
+        <w:rPr>
+          <w:rFonts w:ascii="Courier New" w:hAnsi="Courier New" w:cs="Courier New"/>
+          <w:sz w:val="20"/>
+          <w:szCs w:val="20"/>
+          <w:lang w:val="en-US"/>
+        </w:rPr>
+        <w:t xml:space="preserve">    double getB() const;</w:t>
+      </w:r>
+    </w:p>
+    <w:p>
+      <w:pPr>
+        <w:rPr>
+          <w:rFonts w:ascii="Courier New" w:hAnsi="Courier New" w:cs="Courier New"/>
+          <w:sz w:val="20"/>
+          <w:szCs w:val="20"/>
+          <w:lang w:val="en-US"/>
+        </w:rPr>
+      </w:pPr>
+      <w:r>
+        <w:rPr>
+          <w:rFonts w:ascii="Courier New" w:hAnsi="Courier New" w:cs="Courier New"/>
+          <w:sz w:val="20"/>
+          <w:szCs w:val="20"/>
+          <w:lang w:val="en-US"/>
+        </w:rPr>
+        <w:t xml:space="preserve">    double getH() const;</w:t>
+      </w:r>
+    </w:p>
+    <w:p>
+      <w:pPr>
+        <w:rPr>
+          <w:rFonts w:ascii="Courier New" w:hAnsi="Courier New" w:cs="Courier New"/>
+          <w:sz w:val="20"/>
+          <w:szCs w:val="20"/>
+          <w:lang w:val="en-US"/>
+        </w:rPr>
+      </w:pPr>
+    </w:p>
+    <w:p>
+      <w:pPr>
+        <w:rPr>
+          <w:rFonts w:ascii="Courier New" w:hAnsi="Courier New" w:cs="Courier New"/>
+          <w:sz w:val="20"/>
+          <w:szCs w:val="20"/>
+          <w:lang w:val="en-US"/>
+        </w:rPr>
+      </w:pPr>
+      <w:r>
+        <w:rPr>
+          <w:rFonts w:ascii="Courier New" w:hAnsi="Courier New" w:cs="Courier New"/>
+          <w:sz w:val="20"/>
+          <w:szCs w:val="20"/>
+          <w:lang w:val="en-US"/>
+        </w:rPr>
+        <w:t xml:space="preserve">    double calculateVolume() const;</w:t>
+      </w:r>
+    </w:p>
+    <w:p>
+      <w:pPr>
+        <w:rPr>
+          <w:rFonts w:ascii="Courier New" w:hAnsi="Courier New" w:cs="Courier New"/>
+          <w:sz w:val="20"/>
+          <w:szCs w:val="20"/>
+          <w:lang w:val="en-US"/>
+        </w:rPr>
+      </w:pPr>
+      <w:r>
+        <w:rPr>
+          <w:rFonts w:ascii="Courier New" w:hAnsi="Courier New" w:cs="Courier New"/>
+          <w:sz w:val="20"/>
+          <w:szCs w:val="20"/>
+          <w:lang w:val="en-US"/>
+        </w:rPr>
+        <w:t>};</w:t>
+      </w:r>
+    </w:p>
+    <w:p>
+      <w:pPr>
+        <w:rPr>
+          <w:rFonts w:ascii="Courier New" w:hAnsi="Courier New" w:cs="Courier New"/>
+          <w:sz w:val="20"/>
+          <w:szCs w:val="20"/>
+          <w:lang w:val="en-US"/>
+        </w:rPr>
+      </w:pPr>
+    </w:p>
+    <w:p>
+      <w:pPr>
+        <w:rPr>
+          <w:rFonts w:ascii="Courier New" w:hAnsi="Courier New" w:cs="Courier New"/>
+          <w:sz w:val="20"/>
+          <w:szCs w:val="20"/>
+          <w:lang w:val="en-US"/>
+        </w:rPr>
+      </w:pPr>
+      <w:r>
+        <w:rPr>
+          <w:rFonts w:ascii="Courier New" w:hAnsi="Courier New" w:cs="Courier New"/>
+          <w:sz w:val="20"/>
+          <w:szCs w:val="20"/>
+          <w:lang w:val="en-US"/>
+        </w:rPr>
+        <w:t>ClassLab12_Nikolenko::ClassLab12_Nikolenko(double a, double b, double h) {</w:t>
+      </w:r>
+    </w:p>
+    <w:p>
+      <w:pPr>
+        <w:rPr>
+          <w:rFonts w:ascii="Courier New" w:hAnsi="Courier New" w:cs="Courier New"/>
+          <w:sz w:val="20"/>
+          <w:szCs w:val="20"/>
+          <w:lang w:val="en-US"/>
+        </w:rPr>
+      </w:pPr>
+      <w:r>
+        <w:rPr>
+          <w:rFonts w:ascii="Courier New" w:hAnsi="Courier New" w:cs="Courier New"/>
+          <w:sz w:val="20"/>
+          <w:szCs w:val="20"/>
+          <w:lang w:val="en-US"/>
+        </w:rPr>
+        <w:t xml:space="preserve">    this-&gt;setA(a);</w:t>
+      </w:r>
+    </w:p>
+    <w:p>
+      <w:pPr>
+        <w:rPr>
+          <w:rFonts w:ascii="Courier New" w:hAnsi="Courier New" w:cs="Courier New"/>
+          <w:sz w:val="20"/>
+          <w:szCs w:val="20"/>
+          <w:lang w:val="en-US"/>
+        </w:rPr>
+      </w:pPr>
+      <w:r>
+        <w:rPr>
+          <w:rFonts w:ascii="Courier New" w:hAnsi="Courier New" w:cs="Courier New"/>
+          <w:sz w:val="20"/>
+          <w:szCs w:val="20"/>
+          <w:lang w:val="en-US"/>
+        </w:rPr>
+        <w:t xml:space="preserve">    this-&gt;setB(b);</w:t>
+      </w:r>
+    </w:p>
+    <w:p>
+      <w:pPr>
+        <w:rPr>
+          <w:rFonts w:ascii="Courier New" w:hAnsi="Courier New" w:cs="Courier New"/>
+          <w:sz w:val="20"/>
+          <w:szCs w:val="20"/>
+          <w:lang w:val="en-US"/>
+        </w:rPr>
+      </w:pPr>
+      <w:r>
+        <w:rPr>
+          <w:rFonts w:ascii="Courier New" w:hAnsi="Courier New" w:cs="Courier New"/>
+          <w:sz w:val="20"/>
+          <w:szCs w:val="20"/>
+          <w:lang w:val="en-US"/>
+        </w:rPr>
+        <w:t xml:space="preserve">    this-&gt;setH(h);</w:t>
+      </w:r>
+    </w:p>
+    <w:p>
+      <w:pPr>
+        <w:rPr>
+          <w:rFonts w:ascii="Courier New" w:hAnsi="Courier New" w:cs="Courier New"/>
+          <w:sz w:val="20"/>
+          <w:szCs w:val="20"/>
+          <w:lang w:val="en-US"/>
+        </w:rPr>
+      </w:pPr>
+      <w:r>
+        <w:rPr>
+          <w:rFonts w:ascii="Courier New" w:hAnsi="Courier New" w:cs="Courier New"/>
+          <w:sz w:val="20"/>
+          <w:szCs w:val="20"/>
+          <w:lang w:val="en-US"/>
+        </w:rPr>
+        <w:t>}</w:t>
+      </w:r>
+    </w:p>
+    <w:p>
+      <w:pPr>
+        <w:rPr>
+          <w:rFonts w:ascii="Courier New" w:hAnsi="Courier New" w:cs="Courier New"/>
+          <w:sz w:val="20"/>
+          <w:szCs w:val="20"/>
+          <w:lang w:val="en-US"/>
+        </w:rPr>
+      </w:pPr>
+    </w:p>
+    <w:p>
+      <w:pPr>
+        <w:rPr>
+          <w:rFonts w:ascii="Courier New" w:hAnsi="Courier New" w:cs="Courier New"/>
+          <w:sz w:val="20"/>
+          <w:szCs w:val="20"/>
+          <w:lang w:val="en-US"/>
+        </w:rPr>
+      </w:pPr>
+      <w:r>
+        <w:rPr>
+          <w:rFonts w:ascii="Courier New" w:hAnsi="Courier New" w:cs="Courier New"/>
+          <w:sz w:val="20"/>
+          <w:szCs w:val="20"/>
+          <w:lang w:val="en-US"/>
+        </w:rPr>
+        <w:t>void ClassLab12_Nikolenko::setA(double a) {</w:t>
+      </w:r>
+    </w:p>
+    <w:p>
+      <w:pPr>
+        <w:rPr>
+          <w:rFonts w:ascii="Courier New" w:hAnsi="Courier New" w:cs="Courier New"/>
+          <w:sz w:val="20"/>
+          <w:szCs w:val="20"/>
+          <w:lang w:val="en-US"/>
+        </w:rPr>
+      </w:pPr>
+      <w:r>
+        <w:rPr>
+          <w:rFonts w:ascii="Courier New" w:hAnsi="Courier New" w:cs="Courier New"/>
+          <w:sz w:val="20"/>
+          <w:szCs w:val="20"/>
+          <w:lang w:val="en-US"/>
+        </w:rPr>
+        <w:t xml:space="preserve">    if (a &gt; 0) {</w:t>
+      </w:r>
+    </w:p>
+    <w:p>
+      <w:pPr>
+        <w:rPr>
+          <w:rFonts w:ascii="Courier New" w:hAnsi="Courier New" w:cs="Courier New"/>
+          <w:sz w:val="20"/>
+          <w:szCs w:val="20"/>
+          <w:lang w:val="en-US"/>
+        </w:rPr>
+      </w:pPr>
+      <w:r>
+        <w:rPr>
+          <w:rFonts w:ascii="Courier New" w:hAnsi="Courier New" w:cs="Courier New"/>
+          <w:sz w:val="20"/>
+          <w:szCs w:val="20"/>
+          <w:lang w:val="en-US"/>
+        </w:rPr>
+        <w:t xml:space="preserve">        sideA = a;</w:t>
+      </w:r>
+    </w:p>
+    <w:p>
+      <w:pPr>
+        <w:rPr>
+          <w:rFonts w:ascii="Courier New" w:hAnsi="Courier New" w:cs="Courier New"/>
+          <w:sz w:val="20"/>
+          <w:szCs w:val="20"/>
+          <w:lang w:val="en-US"/>
+        </w:rPr>
+      </w:pPr>
+      <w:r>
+        <w:rPr>
+          <w:rFonts w:ascii="Courier New" w:hAnsi="Courier New" w:cs="Courier New"/>
+          <w:sz w:val="20"/>
+          <w:szCs w:val="20"/>
+          <w:lang w:val="en-US"/>
+        </w:rPr>
+        <w:t xml:space="preserve">    } else {</w:t>
+      </w:r>
+    </w:p>
+    <w:p>
+      <w:pPr>
+        <w:rPr>
+          <w:rFonts w:ascii="Courier New" w:hAnsi="Courier New" w:cs="Courier New"/>
+          <w:sz w:val="20"/>
+          <w:szCs w:val="20"/>
+          <w:lang w:val="en-US"/>
+        </w:rPr>
+      </w:pPr>
+      <w:r>
+        <w:rPr>
+          <w:rFonts w:ascii="Courier New" w:hAnsi="Courier New" w:cs="Courier New"/>
+          <w:sz w:val="20"/>
+          <w:szCs w:val="20"/>
+          <w:lang w:val="en-US"/>
+        </w:rPr>
+        <w:t xml:space="preserve">        sideA</w:t>
+      </w:r>
+      <w:r>
+        <w:rPr>
+          <w:rFonts w:ascii="Courier New" w:hAnsi="Courier New" w:cs="Courier New"/>
+          <w:sz w:val="20"/>
+          <w:szCs w:val="20"/>
+          <w:lang w:val="en-US"/>
+        </w:rPr>
+        <w:t xml:space="preserve"> = 1.0; </w:t>
+      </w:r>
+    </w:p>
+    <w:p>
+      <w:pPr>
+        <w:rPr>
+          <w:rFonts w:ascii="Courier New" w:hAnsi="Courier New" w:cs="Courier New"/>
+          <w:sz w:val="20"/>
+          <w:szCs w:val="20"/>
+          <w:lang w:val="en-US"/>
+        </w:rPr>
+      </w:pPr>
+      <w:r>
+        <w:rPr>
+          <w:rFonts w:ascii="Courier New" w:hAnsi="Courier New" w:cs="Courier New"/>
+          <w:sz w:val="20"/>
+          <w:szCs w:val="20"/>
+          <w:lang w:val="en-US"/>
+        </w:rPr>
+        <w:t xml:space="preserve">    </w:t>
+      </w:r>
+      <w:r>
+        <w:rPr>
+          <w:rFonts w:ascii="Courier New" w:hAnsi="Courier New" w:cs="Courier New"/>
+          <w:sz w:val="20"/>
+          <w:szCs w:val="20"/>
+          <w:lang w:val="en-US"/>
+        </w:rPr>
+        <w:t>}</w:t>
+      </w:r>
+    </w:p>
+    <w:p>
+      <w:pPr>
+        <w:rPr>
+          <w:rFonts w:ascii="Courier New" w:hAnsi="Courier New" w:cs="Courier New"/>
+          <w:sz w:val="20"/>
+          <w:szCs w:val="20"/>
+          <w:lang w:val="en-US"/>
+        </w:rPr>
+      </w:pPr>
+      <w:r>
+        <w:rPr>
+          <w:rFonts w:ascii="Courier New" w:hAnsi="Courier New" w:cs="Courier New"/>
+          <w:sz w:val="20"/>
+          <w:szCs w:val="20"/>
+          <w:lang w:val="en-US"/>
+        </w:rPr>
+        <w:t>}</w:t>
+      </w:r>
+    </w:p>
+    <w:p>
+      <w:pPr>
+        <w:rPr>
+          <w:rFonts w:ascii="Courier New" w:hAnsi="Courier New" w:cs="Courier New"/>
+          <w:sz w:val="20"/>
+          <w:szCs w:val="20"/>
+          <w:lang w:val="en-US"/>
+        </w:rPr>
+      </w:pPr>
+    </w:p>
+    <w:p>
+      <w:pPr>
+        <w:rPr>
+          <w:rFonts w:ascii="Courier New" w:hAnsi="Courier New" w:cs="Courier New"/>
+          <w:sz w:val="20"/>
+          <w:szCs w:val="20"/>
+          <w:lang w:val="en-US"/>
+        </w:rPr>
+      </w:pPr>
+      <w:r>
+        <w:rPr>
+          <w:rFonts w:ascii="Courier New" w:hAnsi="Courier New" w:cs="Courier New"/>
+          <w:sz w:val="20"/>
+          <w:szCs w:val="20"/>
+          <w:lang w:val="en-US"/>
+        </w:rPr>
+        <w:t>void ClassLab12_Nikolenko::setB(double b) {</w:t>
+      </w:r>
+    </w:p>
+    <w:p>
+      <w:pPr>
+        <w:rPr>
+          <w:rFonts w:ascii="Courier New" w:hAnsi="Courier New" w:cs="Courier New"/>
+          <w:sz w:val="20"/>
+          <w:szCs w:val="20"/>
+          <w:lang w:val="en-US"/>
+        </w:rPr>
+      </w:pPr>
+      <w:r>
+        <w:rPr>
+          <w:rFonts w:ascii="Courier New" w:hAnsi="Courier New" w:cs="Courier New"/>
+          <w:sz w:val="20"/>
+          <w:szCs w:val="20"/>
+          <w:lang w:val="en-US"/>
+        </w:rPr>
+        <w:t xml:space="preserve">    if (b &gt; 0) {</w:t>
+      </w:r>
+    </w:p>
+    <w:p>
+      <w:pPr>
+        <w:rPr>
+          <w:rFonts w:ascii="Courier New" w:hAnsi="Courier New" w:cs="Courier New"/>
+          <w:sz w:val="20"/>
+          <w:szCs w:val="20"/>
+          <w:lang w:val="en-US"/>
+        </w:rPr>
+      </w:pPr>
+      <w:r>
+        <w:rPr>
+          <w:rFonts w:ascii="Courier New" w:hAnsi="Courier New" w:cs="Courier New"/>
+          <w:sz w:val="20"/>
+          <w:szCs w:val="20"/>
+          <w:lang w:val="en-US"/>
+        </w:rPr>
+        <w:t xml:space="preserve">        sideB = b;</w:t>
+      </w:r>
+    </w:p>
+    <w:p>
+      <w:pPr>
+        <w:rPr>
+          <w:rFonts w:ascii="Courier New" w:hAnsi="Courier New" w:cs="Courier New"/>
+          <w:sz w:val="20"/>
+          <w:szCs w:val="20"/>
+          <w:lang w:val="en-US"/>
+        </w:rPr>
+      </w:pPr>
+      <w:r>
+        <w:rPr>
+          <w:rFonts w:ascii="Courier New" w:hAnsi="Courier New" w:cs="Courier New"/>
+          <w:sz w:val="20"/>
+          <w:szCs w:val="20"/>
+          <w:lang w:val="en-US"/>
+        </w:rPr>
+        <w:t xml:space="preserve">    } else {</w:t>
+      </w:r>
+    </w:p>
+    <w:p>
+      <w:pPr>
+        <w:rPr>
+          <w:rFonts w:ascii="Courier New" w:hAnsi="Courier New" w:cs="Courier New"/>
+          <w:sz w:val="20"/>
+          <w:szCs w:val="20"/>
+          <w:lang w:val="en-US"/>
+        </w:rPr>
+      </w:pPr>
+      <w:r>
+        <w:rPr>
+          <w:rFonts w:ascii="Courier New" w:hAnsi="Courier New" w:cs="Courier New"/>
+          <w:sz w:val="20"/>
+          <w:szCs w:val="20"/>
+          <w:lang w:val="en-US"/>
+        </w:rPr>
+        <w:t xml:space="preserve">        sideB = 1.0;</w:t>
+      </w:r>
+    </w:p>
+    <w:p>
+      <w:pPr>
+        <w:rPr>
+          <w:rFonts w:ascii="Courier New" w:hAnsi="Courier New" w:cs="Courier New"/>
+          <w:sz w:val="20"/>
+          <w:szCs w:val="20"/>
+          <w:lang w:val="en-US"/>
+        </w:rPr>
+      </w:pPr>
+      <w:r>
+        <w:rPr>
+          <w:rFonts w:ascii="Courier New" w:hAnsi="Courier New" w:cs="Courier New"/>
+          <w:sz w:val="20"/>
+          <w:szCs w:val="20"/>
+          <w:lang w:val="en-US"/>
+        </w:rPr>
+        <w:t xml:space="preserve">    }</w:t>
+      </w:r>
+    </w:p>
+    <w:p>
+      <w:pPr>
+        <w:rPr>
+          <w:rFonts w:ascii="Courier New" w:hAnsi="Courier New" w:cs="Courier New"/>
+          <w:sz w:val="20"/>
+          <w:szCs w:val="20"/>
+          <w:lang w:val="en-US"/>
+        </w:rPr>
+      </w:pPr>
+      <w:r>
+        <w:rPr>
+          <w:rFonts w:ascii="Courier New" w:hAnsi="Courier New" w:cs="Courier New"/>
+          <w:sz w:val="20"/>
+          <w:szCs w:val="20"/>
+          <w:lang w:val="en-US"/>
+        </w:rPr>
+        <w:t>}</w:t>
+      </w:r>
+    </w:p>
+    <w:p>
+      <w:pPr>
+        <w:rPr>
+          <w:rFonts w:ascii="Courier New" w:hAnsi="Courier New" w:cs="Courier New"/>
+          <w:sz w:val="20"/>
+          <w:szCs w:val="20"/>
+          <w:lang w:val="en-US"/>
+        </w:rPr>
+      </w:pPr>
+    </w:p>
+    <w:p>
+      <w:pPr>
+        <w:rPr>
+          <w:rFonts w:ascii="Courier New" w:hAnsi="Courier New" w:cs="Courier New"/>
+          <w:sz w:val="20"/>
+          <w:szCs w:val="20"/>
+          <w:lang w:val="en-US"/>
+        </w:rPr>
+      </w:pPr>
+      <w:r>
+        <w:rPr>
+          <w:rFonts w:ascii="Courier New" w:hAnsi="Courier New" w:cs="Courier New"/>
+          <w:sz w:val="20"/>
+          <w:szCs w:val="20"/>
+          <w:lang w:val="en-US"/>
+        </w:rPr>
+        <w:t>void ClassLab12_Nikolenko::setH(double h) {</w:t>
+      </w:r>
+    </w:p>
+    <w:p>
+      <w:pPr>
+        <w:rPr>
+          <w:rFonts w:ascii="Courier New" w:hAnsi="Courier New" w:cs="Courier New"/>
+          <w:sz w:val="20"/>
+          <w:szCs w:val="20"/>
+          <w:lang w:val="en-US"/>
+        </w:rPr>
+      </w:pPr>
+      <w:r>
+        <w:rPr>
+          <w:rFonts w:ascii="Courier New" w:hAnsi="Courier New" w:cs="Courier New"/>
+          <w:sz w:val="20"/>
+          <w:szCs w:val="20"/>
+          <w:lang w:val="en-US"/>
+        </w:rPr>
+        <w:t xml:space="preserve">    if (h &gt; 0) {</w:t>
+      </w:r>
+    </w:p>
+    <w:p>
+      <w:pPr>
+        <w:rPr>
+          <w:rFonts w:ascii="Courier New" w:hAnsi="Courier New" w:cs="Courier New"/>
+          <w:sz w:val="20"/>
+          <w:szCs w:val="20"/>
+          <w:lang w:val="en-US"/>
+        </w:rPr>
+      </w:pPr>
+      <w:r>
+        <w:rPr>
+          <w:rFonts w:ascii="Courier New" w:hAnsi="Courier New" w:cs="Courier New"/>
+          <w:sz w:val="20"/>
+          <w:szCs w:val="20"/>
+          <w:lang w:val="en-US"/>
+        </w:rPr>
+        <w:lastRenderedPageBreak/>
+        <w:t xml:space="preserve">        sideH = h;</w:t>
+      </w:r>
+    </w:p>
+    <w:p>
+      <w:pPr>
+        <w:rPr>
+          <w:rFonts w:ascii="Courier New" w:hAnsi="Courier New" w:cs="Courier New"/>
+          <w:sz w:val="20"/>
+          <w:szCs w:val="20"/>
+          <w:lang w:val="en-US"/>
+        </w:rPr>
+      </w:pPr>
+      <w:r>
+        <w:rPr>
+          <w:rFonts w:ascii="Courier New" w:hAnsi="Courier New" w:cs="Courier New"/>
+          <w:sz w:val="20"/>
+          <w:szCs w:val="20"/>
+          <w:lang w:val="en-US"/>
+        </w:rPr>
+        <w:t xml:space="preserve">    } else {</w:t>
+      </w:r>
+    </w:p>
+    <w:p>
+      <w:pPr>
+        <w:rPr>
+          <w:rFonts w:ascii="Courier New" w:hAnsi="Courier New" w:cs="Courier New"/>
+          <w:sz w:val="20"/>
+          <w:szCs w:val="20"/>
+          <w:lang w:val="en-US"/>
+        </w:rPr>
+      </w:pPr>
+      <w:r>
+        <w:rPr>
+          <w:rFonts w:ascii="Courier New" w:hAnsi="Courier New" w:cs="Courier New"/>
+          <w:sz w:val="20"/>
+          <w:szCs w:val="20"/>
+          <w:lang w:val="en-US"/>
+        </w:rPr>
+        <w:t xml:space="preserve">        sideH = 1.0;</w:t>
+      </w:r>
+    </w:p>
+    <w:p>
+      <w:pPr>
+        <w:rPr>
+          <w:rFonts w:ascii="Courier New" w:hAnsi="Courier New" w:cs="Courier New"/>
+          <w:sz w:val="20"/>
+          <w:szCs w:val="20"/>
+          <w:lang w:val="en-US"/>
+        </w:rPr>
+      </w:pPr>
+      <w:r>
+        <w:rPr>
+          <w:rFonts w:ascii="Courier New" w:hAnsi="Courier New" w:cs="Courier New"/>
+          <w:sz w:val="20"/>
+          <w:szCs w:val="20"/>
+          <w:lang w:val="en-US"/>
+        </w:rPr>
+        <w:t xml:space="preserve">    }</w:t>
+      </w:r>
+    </w:p>
+    <w:p>
+      <w:pPr>
+        <w:rPr>
+          <w:rFonts w:ascii="Courier New" w:hAnsi="Courier New" w:cs="Courier New"/>
+          <w:sz w:val="20"/>
+          <w:szCs w:val="20"/>
+          <w:lang w:val="en-US"/>
+        </w:rPr>
+      </w:pPr>
+      <w:r>
+        <w:rPr>
+          <w:rFonts w:ascii="Courier New" w:hAnsi="Courier New" w:cs="Courier New"/>
+          <w:sz w:val="20"/>
+          <w:szCs w:val="20"/>
+          <w:lang w:val="en-US"/>
+        </w:rPr>
+        <w:t>}</w:t>
+      </w:r>
+    </w:p>
+    <w:p>
+      <w:pPr>
+        <w:rPr>
+          <w:rFonts w:ascii="Courier New" w:hAnsi="Courier New" w:cs="Courier New"/>
+          <w:sz w:val="20"/>
+          <w:szCs w:val="20"/>
+          <w:lang w:val="en-US"/>
+        </w:rPr>
+      </w:pPr>
+    </w:p>
+    <w:p>
+      <w:pPr>
+        <w:rPr>
+          <w:rFonts w:ascii="Courier New" w:hAnsi="Courier New" w:cs="Courier New"/>
+          <w:sz w:val="20"/>
+          <w:szCs w:val="20"/>
+          <w:lang w:val="en-US"/>
+        </w:rPr>
+      </w:pPr>
+      <w:r>
+        <w:rPr>
+          <w:rFonts w:ascii="Courier New" w:hAnsi="Courier New" w:cs="Courier New"/>
+          <w:sz w:val="20"/>
+          <w:szCs w:val="20"/>
+          <w:lang w:val="en-US"/>
+        </w:rPr>
+        <w:t>double ClassLab12_Nikolenko::getA() const {</w:t>
+      </w:r>
+    </w:p>
+    <w:p>
+      <w:pPr>
+        <w:rPr>
+          <w:rFonts w:ascii="Courier New" w:hAnsi="Courier New" w:cs="Courier New"/>
+          <w:sz w:val="20"/>
+          <w:szCs w:val="20"/>
+          <w:lang w:val="en-US"/>
+        </w:rPr>
+      </w:pPr>
+      <w:r>
+        <w:rPr>
+          <w:rFonts w:ascii="Courier New" w:hAnsi="Courier New" w:cs="Courier New"/>
+          <w:sz w:val="20"/>
+          <w:szCs w:val="20"/>
+          <w:lang w:val="en-US"/>
+        </w:rPr>
+        <w:t xml:space="preserve">    return sideA;</w:t>
+      </w:r>
+    </w:p>
+    <w:p>
+      <w:pPr>
+        <w:rPr>
+          <w:rFonts w:ascii="Courier New" w:hAnsi="Courier New" w:cs="Courier New"/>
+          <w:sz w:val="20"/>
+          <w:szCs w:val="20"/>
+          <w:lang w:val="en-US"/>
+        </w:rPr>
+      </w:pPr>
+      <w:r>
+        <w:rPr>
+          <w:rFonts w:ascii="Courier New" w:hAnsi="Courier New" w:cs="Courier New"/>
+          <w:sz w:val="20"/>
+          <w:szCs w:val="20"/>
+          <w:lang w:val="en-US"/>
+        </w:rPr>
+        <w:t>}</w:t>
+      </w:r>
+    </w:p>
+    <w:p>
+      <w:pPr>
+        <w:rPr>
+          <w:rFonts w:ascii="Courier New" w:hAnsi="Courier New" w:cs="Courier New"/>
+          <w:sz w:val="20"/>
+          <w:szCs w:val="20"/>
+          <w:lang w:val="en-US"/>
+        </w:rPr>
+      </w:pPr>
+    </w:p>
+    <w:p>
+      <w:pPr>
+        <w:rPr>
+          <w:rFonts w:ascii="Courier New" w:hAnsi="Courier New" w:cs="Courier New"/>
+          <w:sz w:val="20"/>
+          <w:szCs w:val="20"/>
+          <w:lang w:val="en-US"/>
+        </w:rPr>
+      </w:pPr>
+      <w:r>
+        <w:rPr>
+          <w:rFonts w:ascii="Courier New" w:hAnsi="Courier New" w:cs="Courier New"/>
+          <w:sz w:val="20"/>
+          <w:szCs w:val="20"/>
+          <w:lang w:val="en-US"/>
+        </w:rPr>
+        <w:t>double ClassLab12_Nikolenko::getB() const {</w:t>
+      </w:r>
+    </w:p>
+    <w:p>
+      <w:pPr>
+        <w:rPr>
+          <w:rFonts w:ascii="Courier New" w:hAnsi="Courier New" w:cs="Courier New"/>
+          <w:sz w:val="20"/>
+          <w:szCs w:val="20"/>
+          <w:lang w:val="en-US"/>
+        </w:rPr>
+      </w:pPr>
+      <w:r>
+        <w:rPr>
+          <w:rFonts w:ascii="Courier New" w:hAnsi="Courier New" w:cs="Courier New"/>
+          <w:sz w:val="20"/>
+          <w:szCs w:val="20"/>
+          <w:lang w:val="en-US"/>
+        </w:rPr>
+        <w:t xml:space="preserve">    return sideB;</w:t>
+      </w:r>
+    </w:p>
+    <w:p>
+      <w:pPr>
+        <w:rPr>
+          <w:rFonts w:ascii="Courier New" w:hAnsi="Courier New" w:cs="Courier New"/>
+          <w:sz w:val="20"/>
+          <w:szCs w:val="20"/>
+          <w:lang w:val="en-US"/>
+        </w:rPr>
+      </w:pPr>
+      <w:r>
+        <w:rPr>
+          <w:rFonts w:ascii="Courier New" w:hAnsi="Courier New" w:cs="Courier New"/>
+          <w:sz w:val="20"/>
+          <w:szCs w:val="20"/>
+          <w:lang w:val="en-US"/>
+        </w:rPr>
+        <w:t>}</w:t>
+      </w:r>
+    </w:p>
+    <w:p>
+      <w:pPr>
+        <w:rPr>
+          <w:rFonts w:ascii="Courier New" w:hAnsi="Courier New" w:cs="Courier New"/>
+          <w:sz w:val="20"/>
+          <w:szCs w:val="20"/>
+          <w:lang w:val="en-US"/>
+        </w:rPr>
+      </w:pPr>
+    </w:p>
+    <w:p>
+      <w:pPr>
+        <w:rPr>
+          <w:rFonts w:ascii="Courier New" w:hAnsi="Courier New" w:cs="Courier New"/>
+          <w:sz w:val="20"/>
+          <w:szCs w:val="20"/>
+          <w:lang w:val="en-US"/>
+        </w:rPr>
+      </w:pPr>
+      <w:r>
+        <w:rPr>
+          <w:rFonts w:ascii="Courier New" w:hAnsi="Courier New" w:cs="Courier New"/>
+          <w:sz w:val="20"/>
+          <w:szCs w:val="20"/>
+          <w:lang w:val="en-US"/>
+        </w:rPr>
+        <w:t>double ClassLab12_Nikolenko::getH() const {</w:t>
+      </w:r>
+    </w:p>
+    <w:p>
+      <w:pPr>
+        <w:rPr>
+          <w:rFonts w:ascii="Courier New" w:hAnsi="Courier New" w:cs="Courier New"/>
+          <w:sz w:val="20"/>
+          <w:szCs w:val="20"/>
+          <w:lang w:val="en-US"/>
+        </w:rPr>
+      </w:pPr>
+      <w:r>
+        <w:rPr>
+          <w:rFonts w:ascii="Courier New" w:hAnsi="Courier New" w:cs="Courier New"/>
+          <w:sz w:val="20"/>
+          <w:szCs w:val="20"/>
+          <w:lang w:val="en-US"/>
+        </w:rPr>
+        <w:t xml:space="preserve">    return sideH;</w:t>
+      </w:r>
+    </w:p>
+    <w:p>
+      <w:pPr>
+        <w:rPr>
+          <w:rFonts w:ascii="Courier New" w:hAnsi="Courier New" w:cs="Courier New"/>
+          <w:sz w:val="20"/>
+          <w:szCs w:val="20"/>
+          <w:lang w:val="en-US"/>
+        </w:rPr>
+      </w:pPr>
+      <w:r>
+        <w:rPr>
+          <w:rFonts w:ascii="Courier New" w:hAnsi="Courier New" w:cs="Courier New"/>
+          <w:sz w:val="20"/>
+          <w:szCs w:val="20"/>
+          <w:lang w:val="en-US"/>
+        </w:rPr>
+        <w:t>}</w:t>
+      </w:r>
+    </w:p>
+    <w:p>
+      <w:pPr>
+        <w:rPr>
+          <w:rFonts w:ascii="Courier New" w:hAnsi="Courier New" w:cs="Courier New"/>
+          <w:sz w:val="20"/>
+          <w:szCs w:val="20"/>
+          <w:lang w:val="en-US"/>
+        </w:rPr>
+      </w:pPr>
+    </w:p>
+    <w:p>
+      <w:pPr>
+        <w:rPr>
+          <w:rFonts w:ascii="Courier New" w:hAnsi="Courier New" w:cs="Courier New"/>
+          <w:sz w:val="20"/>
+          <w:szCs w:val="20"/>
+          <w:lang w:val="en-US"/>
+        </w:rPr>
+      </w:pPr>
+      <w:r>
+        <w:rPr>
+          <w:rFonts w:ascii="Courier New" w:hAnsi="Courier New" w:cs="Courier New"/>
+          <w:sz w:val="20"/>
+          <w:szCs w:val="20"/>
+          <w:lang w:val="en-US"/>
+        </w:rPr>
+        <w:t>double ClassLab12_Nikolenko::calculateVolume() const {</w:t>
+      </w:r>
+    </w:p>
+    <w:p>
+      <w:pPr>
+        <w:rPr>
+          <w:rFonts w:ascii="Courier New" w:hAnsi="Courier New" w:cs="Courier New"/>
+          <w:sz w:val="20"/>
+          <w:szCs w:val="20"/>
+          <w:lang w:val="en-US"/>
+        </w:rPr>
+      </w:pPr>
+      <w:r>
+        <w:rPr>
+          <w:rFonts w:ascii="Courier New" w:hAnsi="Courier New" w:cs="Courier New"/>
+          <w:sz w:val="20"/>
+          <w:szCs w:val="20"/>
+          <w:lang w:val="en-US"/>
+        </w:rPr>
+        <w:t xml:space="preserve">    return sideA * sideB * sideH;</w:t>
+      </w:r>
+    </w:p>
+    <w:p>
+      <w:pPr>
+        <w:rPr>
+          <w:rFonts w:ascii="Courier New" w:hAnsi="Courier New" w:cs="Courier New"/>
+          <w:sz w:val="20"/>
+          <w:szCs w:val="20"/>
+          <w:lang w:val="en-US"/>
+        </w:rPr>
+      </w:pPr>
+      <w:r>
+        <w:rPr>
+          <w:rFonts w:ascii="Courier New" w:hAnsi="Courier New" w:cs="Courier New"/>
+          <w:sz w:val="20"/>
+          <w:szCs w:val="20"/>
+          <w:lang w:val="en-US"/>
+        </w:rPr>
+        <w:t>}</w:t>
+      </w:r>
+    </w:p>
+    <w:p>
+      <w:pPr>
+        <w:rPr>
+          <w:rFonts w:ascii="Courier New" w:hAnsi="Courier New" w:cs="Courier New"/>
+          <w:sz w:val="20"/>
+          <w:szCs w:val="20"/>
+          <w:lang w:val="en-US"/>
+        </w:rPr>
+      </w:pPr>
+    </w:p>
+    <w:p>
+      <w:pPr>
+        <w:rPr>
+          <w:rFonts w:ascii="Courier New" w:hAnsi="Courier New" w:cs="Courier New"/>
+          <w:sz w:val="20"/>
+          <w:szCs w:val="20"/>
+          <w:lang w:val="en-US"/>
+        </w:rPr>
+      </w:pPr>
+      <w:r>
+        <w:rPr>
+          <w:rFonts w:ascii="Courier New" w:hAnsi="Courier New" w:cs="Courier New"/>
+          <w:sz w:val="20"/>
+          <w:szCs w:val="20"/>
+          <w:lang w:val="en-US"/>
+        </w:rPr>
+        <w:t>#endif // MODULES_NIKOLENKO_H_INCLUDED</w:t>
+      </w:r>
+    </w:p>
+    <w:p/>
+    <w:p>
+      <w:pPr>
+        <w:pStyle w:val="3"/>
+        <w:spacing w:before="0" w:beforeAutospacing="0" w:after="0" w:afterAutospacing="0" w:line="360" w:lineRule="auto"/>
+        <w:ind w:firstLine="706"/>
+        <w:jc w:val="both"/>
+        <w:rPr>
+          <w:sz w:val="28"/>
+          <w:szCs w:val="28"/>
+        </w:rPr>
+      </w:pPr>
+      <w:r>
+        <w:rPr>
+          <w:sz w:val="28"/>
+          <w:szCs w:val="28"/>
+        </w:rPr>
+        <w:t>ПУНКТ 7. Аналіз і постановка задачі для додатка Teacher</w:t>
+      </w:r>
+    </w:p>
+    <w:p>
+      <w:pPr>
+        <w:pStyle w:val="a7"/>
+        <w:spacing w:before="0" w:beforeAutospacing="0" w:after="0" w:afterAutospacing="0" w:line="360" w:lineRule="auto"/>
+        <w:ind w:firstLine="706"/>
+        <w:jc w:val="both"/>
+        <w:rPr>
+          <w:sz w:val="28"/>
+          <w:szCs w:val="28"/>
+        </w:rPr>
+      </w:pPr>
+      <w:r>
+        <w:rPr>
+          <w:rStyle w:val="citation-742"/>
+          <w:b/>
+          <w:bCs/>
+          <w:sz w:val="28"/>
+          <w:szCs w:val="28"/>
+        </w:rPr>
+        <w:t>Призначення програмного засобу:</w:t>
+      </w:r>
+      <w:r>
+        <w:rPr>
+          <w:rStyle w:val="citation-742"/>
+          <w:sz w:val="28"/>
+          <w:szCs w:val="28"/>
+        </w:rPr>
+        <w:t xml:space="preserve"> Автоматизація верифікації структури папок лабораторного проєкту, захист від некоректного розміщення файлів під час звітності та проведення автоматизованого модульного (unit) тестування розробленого класу ClassLab12_Nikolenko</w:t>
+      </w:r>
+      <w:r>
+        <w:rPr>
+          <w:sz w:val="28"/>
+          <w:szCs w:val="28"/>
+        </w:rPr>
+        <w:t xml:space="preserve">. </w:t>
+      </w:r>
+    </w:p>
+    <w:p>
+      <w:pPr>
+        <w:pStyle w:val="a7"/>
+        <w:spacing w:before="0" w:beforeAutospacing="0" w:after="0" w:afterAutospacing="0" w:line="360" w:lineRule="auto"/>
+        <w:ind w:firstLine="706"/>
+        <w:jc w:val="both"/>
+        <w:rPr>
+          <w:sz w:val="28"/>
+          <w:szCs w:val="28"/>
+        </w:rPr>
+      </w:pPr>
+      <w:r>
+        <w:rPr>
+          <w:b/>
+          <w:bCs/>
+          <w:sz w:val="28"/>
+          <w:szCs w:val="28"/>
+        </w:rPr>
+        <w:t>Постановка задачі (алгоритм функціонування):</w:t>
+      </w:r>
+    </w:p>
+    <w:p>
+      <w:pPr>
+        <w:pStyle w:val="a7"/>
+        <w:numPr>
+          <w:ilvl w:val="0"/>
+          <w:numId w:val="21"/>
+        </w:numPr>
+        <w:spacing w:before="0" w:beforeAutospacing="0" w:after="0" w:afterAutospacing="0" w:line="360" w:lineRule="auto"/>
+        <w:ind w:left="0" w:firstLine="706"/>
+        <w:jc w:val="both"/>
+        <w:rPr>
+          <w:sz w:val="28"/>
+          <w:szCs w:val="28"/>
+        </w:rPr>
+      </w:pPr>
+      <w:r>
+        <w:rPr>
+          <w:rStyle w:val="citation-741"/>
+          <w:b/>
+          <w:bCs/>
+          <w:sz w:val="28"/>
+          <w:szCs w:val="28"/>
+        </w:rPr>
+        <w:t>Перевірка середовища:</w:t>
+      </w:r>
+      <w:r>
+        <w:rPr>
+          <w:rStyle w:val="citation-741"/>
+          <w:sz w:val="28"/>
+          <w:szCs w:val="28"/>
+        </w:rPr>
+        <w:t xml:space="preserve"> Під час запуску додаток має визначити абсолютний фізичний шлях, у якому знаходився файл вихідного коду в момент компіляції</w:t>
+      </w:r>
+      <w:r>
+        <w:rPr>
+          <w:sz w:val="28"/>
+          <w:szCs w:val="28"/>
+        </w:rPr>
+        <w:t xml:space="preserve">. </w:t>
+      </w:r>
+    </w:p>
+    <w:p>
+      <w:pPr>
+        <w:pStyle w:val="a7"/>
+        <w:numPr>
+          <w:ilvl w:val="0"/>
+          <w:numId w:val="21"/>
+        </w:numPr>
+        <w:spacing w:before="0" w:beforeAutospacing="0" w:after="0" w:afterAutospacing="0" w:line="360" w:lineRule="auto"/>
+        <w:ind w:left="0" w:firstLine="706"/>
+        <w:jc w:val="both"/>
+        <w:rPr>
+          <w:sz w:val="28"/>
+          <w:szCs w:val="28"/>
+        </w:rPr>
+      </w:pPr>
+      <w:r>
+        <w:rPr>
+          <w:rStyle w:val="citation-740"/>
+          <w:b/>
+          <w:bCs/>
+          <w:sz w:val="28"/>
+          <w:szCs w:val="28"/>
+        </w:rPr>
+        <w:t>Обробка порушень:</w:t>
+      </w:r>
+      <w:r>
+        <w:rPr>
+          <w:rStyle w:val="citation-740"/>
+          <w:sz w:val="28"/>
+          <w:szCs w:val="28"/>
+        </w:rPr>
+        <w:t xml:space="preserve"> Якщо у згаданому шляху відсутня правильна структура директорій (зокрема, підрядки \lab12\prj\Teacher\ або /lab12/prj/Teacher/), програма повинна заблокувати подальше виконання, згенерувати у файл TestResults.txt повідомлення: </w:t>
+      </w:r>
+      <w:r>
+        <w:rPr>
+          <w:rStyle w:val="citation-740"/>
+          <w:i/>
+          <w:iCs/>
+          <w:sz w:val="28"/>
+          <w:szCs w:val="28"/>
+        </w:rPr>
+        <w:t>"Встановлені вимоги порядку виконання лабораторної роботи порушено!"</w:t>
+      </w:r>
+      <w:r>
+        <w:rPr>
+          <w:rStyle w:val="citation-740"/>
+          <w:sz w:val="28"/>
+          <w:szCs w:val="28"/>
+        </w:rPr>
+        <w:t xml:space="preserve"> та запустити цикл із 100 послідовних звукових сигналів через системну функцію Beep()</w:t>
+      </w:r>
+      <w:r>
+        <w:rPr>
+          <w:sz w:val="28"/>
+          <w:szCs w:val="28"/>
+        </w:rPr>
+        <w:t xml:space="preserve">. </w:t>
+      </w:r>
+    </w:p>
+    <w:p>
+      <w:pPr>
+        <w:pStyle w:val="a7"/>
+        <w:numPr>
+          <w:ilvl w:val="0"/>
+          <w:numId w:val="21"/>
+        </w:numPr>
+        <w:spacing w:before="0" w:beforeAutospacing="0" w:after="0" w:afterAutospacing="0" w:line="360" w:lineRule="auto"/>
+        <w:ind w:left="0" w:firstLine="706"/>
+        <w:jc w:val="both"/>
+        <w:rPr>
+          <w:sz w:val="28"/>
+          <w:szCs w:val="28"/>
+        </w:rPr>
+      </w:pPr>
+      <w:r>
+        <w:rPr>
+          <w:rStyle w:val="citation-739"/>
+          <w:b/>
+          <w:bCs/>
+          <w:sz w:val="28"/>
+          <w:szCs w:val="28"/>
+        </w:rPr>
+        <w:t>Ініціалізація тестування:</w:t>
+      </w:r>
+      <w:r>
+        <w:rPr>
+          <w:rStyle w:val="citation-739"/>
+          <w:sz w:val="28"/>
+          <w:szCs w:val="28"/>
+        </w:rPr>
+        <w:t xml:space="preserve"> Якщо перевірку шляху пройдено успішно, програма сповіщає про це користувача в консолі, відкриває лог-файл за відносним шляхом ../TestSuite/TestResults.txt та починає зчитування тест-кейсів</w:t>
+      </w:r>
+      <w:r>
+        <w:rPr>
+          <w:sz w:val="28"/>
+          <w:szCs w:val="28"/>
+        </w:rPr>
+        <w:t xml:space="preserve">. </w:t>
+      </w:r>
+    </w:p>
+    <w:p>
+      <w:pPr>
+        <w:pStyle w:val="a7"/>
+        <w:numPr>
+          <w:ilvl w:val="0"/>
+          <w:numId w:val="21"/>
+        </w:numPr>
+        <w:spacing w:before="0" w:beforeAutospacing="0" w:after="0" w:afterAutospacing="0" w:line="360" w:lineRule="auto"/>
+        <w:ind w:left="0" w:firstLine="706"/>
+        <w:jc w:val="both"/>
+        <w:rPr>
+          <w:sz w:val="28"/>
+          <w:szCs w:val="28"/>
+        </w:rPr>
+      </w:pPr>
+      <w:r>
+        <w:rPr>
+          <w:rStyle w:val="citation-738"/>
+          <w:b/>
+          <w:bCs/>
+          <w:sz w:val="28"/>
+          <w:szCs w:val="28"/>
+        </w:rPr>
+        <w:lastRenderedPageBreak/>
+        <w:t>Unit-тестування:</w:t>
+      </w:r>
+      <w:r>
+        <w:rPr>
+          <w:rStyle w:val="citation-738"/>
+          <w:sz w:val="28"/>
+          <w:szCs w:val="28"/>
+        </w:rPr>
+        <w:t xml:space="preserve"> Програма послідовно завантажує тестові вектори, створює екземпляри класу ClassLab12_Nikolenko, порівнює фактично обчислені значення об'єму з очікуваними та протоколює результати у фінальний звіт</w:t>
+      </w:r>
+      <w:r>
+        <w:rPr>
+          <w:sz w:val="28"/>
+          <w:szCs w:val="28"/>
+        </w:rPr>
+        <w:t xml:space="preserve">. </w:t>
+      </w:r>
+    </w:p>
+    <w:p>
+      <w:pPr>
+        <w:pStyle w:val="3"/>
+        <w:spacing w:before="0" w:beforeAutospacing="0" w:after="0" w:afterAutospacing="0" w:line="360" w:lineRule="auto"/>
+        <w:ind w:firstLine="706"/>
+        <w:jc w:val="both"/>
+        <w:rPr>
+          <w:sz w:val="28"/>
+          <w:szCs w:val="28"/>
+        </w:rPr>
+      </w:pPr>
+      <w:r>
+        <w:rPr>
+          <w:sz w:val="28"/>
+          <w:szCs w:val="28"/>
+        </w:rPr>
+        <w:t>ПУНКТ 8. Текстовий формат тест-кейса та протокол його читання</w:t>
+      </w:r>
+    </w:p>
+    <w:p>
+      <w:pPr>
+        <w:pStyle w:val="a7"/>
+        <w:spacing w:before="0" w:beforeAutospacing="0" w:after="0" w:afterAutospacing="0" w:line="360" w:lineRule="auto"/>
+        <w:ind w:firstLine="706"/>
+        <w:jc w:val="both"/>
+        <w:rPr>
+          <w:sz w:val="28"/>
+          <w:szCs w:val="28"/>
+        </w:rPr>
+      </w:pPr>
+      <w:r>
+        <w:rPr>
+          <w:rStyle w:val="citation-737"/>
+          <w:sz w:val="28"/>
+          <w:szCs w:val="28"/>
+        </w:rPr>
+        <w:t>Для забезпечення можливості автоматичного зчитування та парсингу вхідних даних додатком Teacher, розроблено такий стандартизований текстовий формат</w:t>
+      </w:r>
+      <w:r>
+        <w:rPr>
+          <w:sz w:val="28"/>
+          <w:szCs w:val="28"/>
+        </w:rPr>
+        <w:t xml:space="preserve">: </w:t>
+      </w:r>
+    </w:p>
+    <w:p>
+      <w:pPr>
+        <w:pStyle w:val="a7"/>
+        <w:numPr>
+          <w:ilvl w:val="0"/>
+          <w:numId w:val="22"/>
+        </w:numPr>
+        <w:spacing w:before="0" w:beforeAutospacing="0" w:after="0" w:afterAutospacing="0" w:line="360" w:lineRule="auto"/>
+        <w:ind w:left="0" w:firstLine="706"/>
+        <w:jc w:val="both"/>
+        <w:rPr>
+          <w:sz w:val="28"/>
+          <w:szCs w:val="28"/>
+        </w:rPr>
+      </w:pPr>
+      <w:r>
+        <w:rPr>
+          <w:b/>
+          <w:bCs/>
+          <w:sz w:val="28"/>
+          <w:szCs w:val="28"/>
+        </w:rPr>
+        <w:t>Синтаксична структура рядка:</w:t>
+      </w:r>
+      <w:r>
+        <w:rPr>
+          <w:sz w:val="28"/>
+          <w:szCs w:val="28"/>
+        </w:rPr>
+        <w:t xml:space="preserve"> </w:t>
+      </w:r>
+      <w:r>
+        <w:rPr>
+          <w:rStyle w:val="HTML"/>
+          <w:rFonts w:ascii="Times New Roman" w:hAnsi="Times New Roman" w:cs="Times New Roman"/>
+          <w:sz w:val="28"/>
+          <w:szCs w:val="28"/>
+        </w:rPr>
+        <w:t xml:space="preserve">[Ідентифікатор_Тесту] | [Параметр_A] [Параметр_B] [Параметр_H] | </w:t>
+      </w:r>
+      <w:r>
+        <w:rPr>
+          <w:rStyle w:val="citation-736"/>
+          <w:sz w:val="28"/>
+          <w:szCs w:val="28"/>
+        </w:rPr>
+        <w:t>[Очікуваний_Результат]</w:t>
+      </w:r>
+      <w:r>
+        <w:rPr>
+          <w:sz w:val="28"/>
+          <w:szCs w:val="28"/>
+        </w:rPr>
+        <w:t xml:space="preserve">. </w:t>
+      </w:r>
+    </w:p>
+    <w:p>
+      <w:pPr>
+        <w:pStyle w:val="a7"/>
+        <w:numPr>
+          <w:ilvl w:val="0"/>
+          <w:numId w:val="22"/>
+        </w:numPr>
+        <w:spacing w:before="0" w:beforeAutospacing="0" w:after="0" w:afterAutospacing="0" w:line="360" w:lineRule="auto"/>
+        <w:ind w:left="0" w:firstLine="706"/>
+        <w:jc w:val="both"/>
+        <w:rPr>
+          <w:sz w:val="28"/>
+          <w:szCs w:val="28"/>
+        </w:rPr>
+      </w:pPr>
+      <w:r>
+        <w:rPr>
+          <w:b/>
+          <w:bCs/>
+          <w:sz w:val="28"/>
+          <w:szCs w:val="28"/>
+        </w:rPr>
+        <w:t>Приклад запису вхідного рядка:</w:t>
+      </w:r>
+      <w:r>
+        <w:rPr>
+          <w:sz w:val="28"/>
+          <w:szCs w:val="28"/>
+        </w:rPr>
+        <w:t xml:space="preserve"> </w:t>
+      </w:r>
+      <w:r>
+        <w:rPr>
+          <w:rStyle w:val="HTML"/>
+          <w:rFonts w:ascii="Times New Roman" w:hAnsi="Times New Roman" w:cs="Times New Roman"/>
+          <w:sz w:val="28"/>
+          <w:szCs w:val="28"/>
+        </w:rPr>
+        <w:t>TC_12_01 | 2.0 3.0 4.0 | 24.0</w:t>
+      </w:r>
+    </w:p>
+    <w:p>
+      <w:pPr>
+        <w:pStyle w:val="a7"/>
+        <w:spacing w:before="0" w:beforeAutospacing="0" w:after="0" w:afterAutospacing="0" w:line="360" w:lineRule="auto"/>
+        <w:ind w:firstLine="706"/>
+        <w:jc w:val="both"/>
+        <w:rPr>
+          <w:sz w:val="28"/>
+          <w:szCs w:val="28"/>
+        </w:rPr>
+      </w:pPr>
+      <w:r>
+        <w:rPr>
+          <w:rStyle w:val="citation-735"/>
+          <w:b/>
+          <w:bCs/>
+          <w:sz w:val="28"/>
+          <w:szCs w:val="28"/>
+        </w:rPr>
+        <w:t>Протокол читання (алгоритм роботи парсера):</w:t>
+      </w:r>
+      <w:r>
+        <w:rPr>
+          <w:rStyle w:val="citation-735"/>
+          <w:sz w:val="28"/>
+          <w:szCs w:val="28"/>
+        </w:rPr>
+        <w:t xml:space="preserve"> </w:t>
+      </w:r>
+    </w:p>
+    <w:p>
+      <w:pPr>
+        <w:pStyle w:val="a7"/>
+        <w:numPr>
+          <w:ilvl w:val="0"/>
+          <w:numId w:val="23"/>
+        </w:numPr>
+        <w:spacing w:before="0" w:beforeAutospacing="0" w:after="0" w:afterAutospacing="0" w:line="360" w:lineRule="auto"/>
+        <w:ind w:left="0" w:firstLine="706"/>
+        <w:jc w:val="both"/>
+        <w:rPr>
+          <w:sz w:val="28"/>
+          <w:szCs w:val="28"/>
+        </w:rPr>
+      </w:pPr>
+      <w:r>
+        <w:rPr>
+          <w:rStyle w:val="citation-734"/>
+          <w:sz w:val="28"/>
+          <w:szCs w:val="28"/>
+        </w:rPr>
+        <w:t>Вхідний файл відкривається у режимі читання через об'єкт std::ifstream</w:t>
+      </w:r>
+      <w:r>
+        <w:rPr>
+          <w:sz w:val="28"/>
+          <w:szCs w:val="28"/>
+        </w:rPr>
+        <w:t xml:space="preserve">. </w:t>
+      </w:r>
+    </w:p>
+    <w:p>
+      <w:pPr>
+        <w:pStyle w:val="a7"/>
+        <w:numPr>
+          <w:ilvl w:val="0"/>
+          <w:numId w:val="23"/>
+        </w:numPr>
+        <w:spacing w:before="0" w:beforeAutospacing="0" w:after="0" w:afterAutospacing="0" w:line="360" w:lineRule="auto"/>
+        <w:ind w:left="0" w:firstLine="706"/>
+        <w:jc w:val="both"/>
+        <w:rPr>
+          <w:sz w:val="28"/>
+          <w:szCs w:val="28"/>
+        </w:rPr>
+      </w:pPr>
+      <w:r>
+        <w:rPr>
+          <w:rStyle w:val="citation-733"/>
+          <w:sz w:val="28"/>
+          <w:szCs w:val="28"/>
+        </w:rPr>
+        <w:t>У циклі while відбувається потокове зчитування рядка, розділеного пробілами</w:t>
+      </w:r>
+      <w:r>
+        <w:rPr>
+          <w:sz w:val="28"/>
+          <w:szCs w:val="28"/>
+        </w:rPr>
+        <w:t xml:space="preserve">. </w:t>
+      </w:r>
+    </w:p>
+    <w:p>
+      <w:pPr>
+        <w:pStyle w:val="a7"/>
+        <w:numPr>
+          <w:ilvl w:val="0"/>
+          <w:numId w:val="23"/>
+        </w:numPr>
+        <w:spacing w:before="0" w:beforeAutospacing="0" w:after="0" w:afterAutospacing="0" w:line="360" w:lineRule="auto"/>
+        <w:ind w:left="0" w:firstLine="706"/>
+        <w:jc w:val="both"/>
+        <w:rPr>
+          <w:sz w:val="28"/>
+          <w:szCs w:val="28"/>
+        </w:rPr>
+      </w:pPr>
+      <w:r>
+        <w:rPr>
+          <w:sz w:val="28"/>
+          <w:szCs w:val="28"/>
+        </w:rPr>
+        <w:t xml:space="preserve">Перша лексема записується у строкову змінну </w:t>
+      </w:r>
+      <w:r>
+        <w:rPr>
+          <w:rStyle w:val="HTML"/>
+          <w:rFonts w:ascii="Times New Roman" w:hAnsi="Times New Roman" w:cs="Times New Roman"/>
+          <w:sz w:val="28"/>
+          <w:szCs w:val="28"/>
+        </w:rPr>
+        <w:t>tc_id</w:t>
+      </w:r>
+      <w:r>
+        <w:rPr>
+          <w:sz w:val="28"/>
+          <w:szCs w:val="28"/>
+        </w:rPr>
+        <w:t>.</w:t>
+      </w:r>
+    </w:p>
+    <w:p>
+      <w:pPr>
+        <w:pStyle w:val="a7"/>
+        <w:numPr>
+          <w:ilvl w:val="0"/>
+          <w:numId w:val="23"/>
+        </w:numPr>
+        <w:spacing w:before="0" w:beforeAutospacing="0" w:after="0" w:afterAutospacing="0" w:line="360" w:lineRule="auto"/>
+        <w:ind w:left="0" w:firstLine="706"/>
+        <w:jc w:val="both"/>
+        <w:rPr>
+          <w:sz w:val="28"/>
+          <w:szCs w:val="28"/>
+        </w:rPr>
+      </w:pPr>
+      <w:r>
+        <w:rPr>
+          <w:sz w:val="28"/>
+          <w:szCs w:val="28"/>
+        </w:rPr>
+        <w:t xml:space="preserve">Символ вертикальної риски </w:t>
+      </w:r>
+      <w:r>
+        <w:rPr>
+          <w:rStyle w:val="HTML"/>
+          <w:rFonts w:ascii="Times New Roman" w:hAnsi="Times New Roman" w:cs="Times New Roman"/>
+          <w:sz w:val="28"/>
+          <w:szCs w:val="28"/>
+        </w:rPr>
+        <w:t>|</w:t>
+      </w:r>
+      <w:r>
+        <w:rPr>
+          <w:sz w:val="28"/>
+          <w:szCs w:val="28"/>
+        </w:rPr>
+        <w:t xml:space="preserve"> зчитується у транзитну буферну змінну </w:t>
+      </w:r>
+      <w:r>
+        <w:rPr>
+          <w:rStyle w:val="HTML"/>
+          <w:rFonts w:ascii="Times New Roman" w:hAnsi="Times New Roman" w:cs="Times New Roman"/>
+          <w:sz w:val="28"/>
+          <w:szCs w:val="28"/>
+        </w:rPr>
+        <w:t>delimiter</w:t>
+      </w:r>
+      <w:r>
+        <w:rPr>
+          <w:sz w:val="28"/>
+          <w:szCs w:val="28"/>
+        </w:rPr>
+        <w:t xml:space="preserve"> та ігнорується.</w:t>
+      </w:r>
+    </w:p>
+    <w:p>
+      <w:pPr>
+        <w:pStyle w:val="a7"/>
+        <w:numPr>
+          <w:ilvl w:val="0"/>
+          <w:numId w:val="23"/>
+        </w:numPr>
+        <w:spacing w:before="0" w:beforeAutospacing="0" w:after="0" w:afterAutospacing="0" w:line="360" w:lineRule="auto"/>
+        <w:ind w:left="0" w:firstLine="706"/>
+        <w:jc w:val="both"/>
+        <w:rPr>
+          <w:sz w:val="28"/>
+          <w:szCs w:val="28"/>
+        </w:rPr>
+      </w:pPr>
+      <w:r>
+        <w:rPr>
+          <w:sz w:val="28"/>
+          <w:szCs w:val="28"/>
+        </w:rPr>
+        <w:t xml:space="preserve">Наступні три числових значення зчитуються як змінні типу </w:t>
+      </w:r>
+      <w:r>
+        <w:rPr>
+          <w:rStyle w:val="HTML"/>
+          <w:rFonts w:ascii="Times New Roman" w:hAnsi="Times New Roman" w:cs="Times New Roman"/>
+          <w:sz w:val="28"/>
+          <w:szCs w:val="28"/>
+        </w:rPr>
+        <w:t>double</w:t>
+      </w:r>
+      <w:r>
+        <w:rPr>
+          <w:sz w:val="28"/>
+          <w:szCs w:val="28"/>
+        </w:rPr>
+        <w:t xml:space="preserve"> (</w:t>
+      </w:r>
+      <w:r>
+        <w:rPr>
+          <w:rStyle w:val="HTML"/>
+          <w:rFonts w:ascii="Times New Roman" w:hAnsi="Times New Roman" w:cs="Times New Roman"/>
+          <w:sz w:val="28"/>
+          <w:szCs w:val="28"/>
+        </w:rPr>
+        <w:t>a</w:t>
+      </w:r>
+      <w:r>
+        <w:rPr>
+          <w:sz w:val="28"/>
+          <w:szCs w:val="28"/>
+        </w:rPr>
+        <w:t xml:space="preserve">, </w:t>
+      </w:r>
+      <w:r>
+        <w:rPr>
+          <w:rStyle w:val="HTML"/>
+          <w:rFonts w:ascii="Times New Roman" w:hAnsi="Times New Roman" w:cs="Times New Roman"/>
+          <w:sz w:val="28"/>
+          <w:szCs w:val="28"/>
+        </w:rPr>
+        <w:t>b</w:t>
+      </w:r>
+      <w:r>
+        <w:rPr>
+          <w:sz w:val="28"/>
+          <w:szCs w:val="28"/>
+        </w:rPr>
+        <w:t xml:space="preserve">, </w:t>
+      </w:r>
+      <w:r>
+        <w:rPr>
+          <w:rStyle w:val="HTML"/>
+          <w:rFonts w:ascii="Times New Roman" w:hAnsi="Times New Roman" w:cs="Times New Roman"/>
+          <w:sz w:val="28"/>
+          <w:szCs w:val="28"/>
+        </w:rPr>
+        <w:t>h</w:t>
+      </w:r>
+      <w:r>
+        <w:rPr>
+          <w:sz w:val="28"/>
+          <w:szCs w:val="28"/>
+        </w:rPr>
+        <w:t>) та передаються у відповідні сетери об'єкта класу (</w:t>
+      </w:r>
+      <w:r>
+        <w:rPr>
+          <w:rStyle w:val="HTML"/>
+          <w:rFonts w:ascii="Times New Roman" w:hAnsi="Times New Roman" w:cs="Times New Roman"/>
+          <w:sz w:val="28"/>
+          <w:szCs w:val="28"/>
+        </w:rPr>
+        <w:t>setA</w:t>
+      </w:r>
+      <w:r>
+        <w:rPr>
+          <w:sz w:val="28"/>
+          <w:szCs w:val="28"/>
+        </w:rPr>
+        <w:t xml:space="preserve">, </w:t>
+      </w:r>
+      <w:r>
+        <w:rPr>
+          <w:rStyle w:val="HTML"/>
+          <w:rFonts w:ascii="Times New Roman" w:hAnsi="Times New Roman" w:cs="Times New Roman"/>
+          <w:sz w:val="28"/>
+          <w:szCs w:val="28"/>
+        </w:rPr>
+        <w:t>setB</w:t>
+      </w:r>
+      <w:r>
+        <w:rPr>
+          <w:sz w:val="28"/>
+          <w:szCs w:val="28"/>
+        </w:rPr>
+        <w:t xml:space="preserve">, </w:t>
+      </w:r>
+      <w:r>
+        <w:rPr>
+          <w:rStyle w:val="HTML"/>
+          <w:rFonts w:ascii="Times New Roman" w:hAnsi="Times New Roman" w:cs="Times New Roman"/>
+          <w:sz w:val="28"/>
+          <w:szCs w:val="28"/>
+        </w:rPr>
+        <w:t>setH</w:t>
+      </w:r>
+      <w:r>
+        <w:rPr>
+          <w:sz w:val="28"/>
+          <w:szCs w:val="28"/>
+        </w:rPr>
+        <w:t>).</w:t>
+      </w:r>
+    </w:p>
+    <w:p>
+      <w:pPr>
+        <w:pStyle w:val="a7"/>
+        <w:numPr>
+          <w:ilvl w:val="0"/>
+          <w:numId w:val="23"/>
+        </w:numPr>
+        <w:spacing w:before="0" w:beforeAutospacing="0" w:after="0" w:afterAutospacing="0" w:line="360" w:lineRule="auto"/>
+        <w:ind w:left="0" w:firstLine="706"/>
+        <w:jc w:val="both"/>
+        <w:rPr>
+          <w:sz w:val="28"/>
+          <w:szCs w:val="28"/>
+        </w:rPr>
+      </w:pPr>
+      <w:r>
+        <w:rPr>
+          <w:sz w:val="28"/>
+          <w:szCs w:val="28"/>
+        </w:rPr>
+        <w:t xml:space="preserve">Другий символ </w:t>
+      </w:r>
+      <w:r>
+        <w:rPr>
+          <w:rStyle w:val="HTML"/>
+          <w:rFonts w:ascii="Times New Roman" w:hAnsi="Times New Roman" w:cs="Times New Roman"/>
+          <w:sz w:val="28"/>
+          <w:szCs w:val="28"/>
+        </w:rPr>
+        <w:t>|</w:t>
+      </w:r>
+      <w:r>
+        <w:rPr>
+          <w:sz w:val="28"/>
+          <w:szCs w:val="28"/>
+        </w:rPr>
+        <w:t xml:space="preserve"> знову зчитується у буфер </w:t>
+      </w:r>
+      <w:r>
+        <w:rPr>
+          <w:rStyle w:val="HTML"/>
+          <w:rFonts w:ascii="Times New Roman" w:hAnsi="Times New Roman" w:cs="Times New Roman"/>
+          <w:sz w:val="28"/>
+          <w:szCs w:val="28"/>
+        </w:rPr>
+        <w:t>delimiter</w:t>
+      </w:r>
+      <w:r>
+        <w:rPr>
+          <w:sz w:val="28"/>
+          <w:szCs w:val="28"/>
+        </w:rPr>
+        <w:t>.</w:t>
+      </w:r>
+    </w:p>
+    <w:p>
+      <w:pPr>
+        <w:pStyle w:val="a7"/>
+        <w:numPr>
+          <w:ilvl w:val="0"/>
+          <w:numId w:val="23"/>
+        </w:numPr>
+        <w:spacing w:before="0" w:beforeAutospacing="0" w:after="0" w:afterAutospacing="0" w:line="360" w:lineRule="auto"/>
+        <w:ind w:left="0" w:firstLine="706"/>
+        <w:jc w:val="both"/>
+        <w:rPr>
+          <w:sz w:val="28"/>
+          <w:szCs w:val="28"/>
+        </w:rPr>
+      </w:pPr>
+      <w:r>
+        <w:rPr>
+          <w:sz w:val="28"/>
+          <w:szCs w:val="28"/>
+        </w:rPr>
+        <w:t xml:space="preserve">Фінальне число зчитується у змінну </w:t>
+      </w:r>
+      <w:r>
+        <w:rPr>
+          <w:rStyle w:val="HTML"/>
+          <w:rFonts w:ascii="Times New Roman" w:hAnsi="Times New Roman" w:cs="Times New Roman"/>
+          <w:sz w:val="28"/>
+          <w:szCs w:val="28"/>
+        </w:rPr>
+        <w:t>expectedVolume</w:t>
+      </w:r>
+      <w:r>
+        <w:rPr>
+          <w:sz w:val="28"/>
+          <w:szCs w:val="28"/>
+        </w:rPr>
+        <w:t xml:space="preserve"> для подальшого математичного порівняння з результатом роботи методу </w:t>
+      </w:r>
+      <w:r>
+        <w:rPr>
+          <w:rStyle w:val="HTML"/>
+          <w:rFonts w:ascii="Times New Roman" w:hAnsi="Times New Roman" w:cs="Times New Roman"/>
+          <w:sz w:val="28"/>
+          <w:szCs w:val="28"/>
+        </w:rPr>
+        <w:t>calculateVolume()</w:t>
+      </w:r>
+      <w:r>
+        <w:rPr>
+          <w:sz w:val="28"/>
+          <w:szCs w:val="28"/>
+        </w:rPr>
+        <w:t>.</w:t>
+      </w:r>
+    </w:p>
+    <w:p>
+      <w:pPr>
+        <w:pStyle w:val="3"/>
+        <w:spacing w:before="0" w:beforeAutospacing="0" w:after="0" w:afterAutospacing="0" w:line="360" w:lineRule="auto"/>
+        <w:ind w:firstLine="706"/>
+        <w:jc w:val="both"/>
+        <w:rPr>
+          <w:sz w:val="28"/>
+          <w:szCs w:val="28"/>
+        </w:rPr>
+      </w:pPr>
+      <w:r>
+        <w:rPr>
+          <w:sz w:val="28"/>
+          <w:szCs w:val="28"/>
+        </w:rPr>
+        <w:t>ПУНКТ 10. Аналіз вимог, проєктування архітектури та детальне проєктування ПЗ Teacher</w:t>
+      </w:r>
+    </w:p>
+    <w:p>
+      <w:pPr>
+        <w:pStyle w:val="4"/>
+        <w:spacing w:before="0" w:line="360" w:lineRule="auto"/>
+        <w:ind w:firstLine="706"/>
+        <w:jc w:val="both"/>
+        <w:rPr>
+          <w:rFonts w:ascii="Times New Roman" w:hAnsi="Times New Roman" w:cs="Times New Roman"/>
+          <w:sz w:val="28"/>
+          <w:szCs w:val="28"/>
+        </w:rPr>
+      </w:pPr>
+      <w:r>
+        <w:rPr>
+          <w:rFonts w:ascii="Times New Roman" w:hAnsi="Times New Roman" w:cs="Times New Roman"/>
+          <w:sz w:val="28"/>
+          <w:szCs w:val="28"/>
+        </w:rPr>
+        <w:t>10.1. Аналіз вимог до програмного засобу (ПЗ)</w:t>
+      </w:r>
+    </w:p>
+    <w:p>
+      <w:pPr>
+        <w:pStyle w:val="a7"/>
+        <w:numPr>
+          <w:ilvl w:val="0"/>
+          <w:numId w:val="24"/>
+        </w:numPr>
+        <w:spacing w:before="0" w:beforeAutospacing="0" w:after="0" w:afterAutospacing="0" w:line="360" w:lineRule="auto"/>
+        <w:ind w:left="0" w:firstLine="706"/>
+        <w:jc w:val="both"/>
+        <w:rPr>
+          <w:sz w:val="28"/>
+          <w:szCs w:val="28"/>
+        </w:rPr>
+      </w:pPr>
+      <w:r>
+        <w:rPr>
+          <w:rStyle w:val="citation-732"/>
+          <w:b/>
+          <w:bCs/>
+          <w:sz w:val="28"/>
+          <w:szCs w:val="28"/>
+        </w:rPr>
+        <w:t>Функціональні вимоги:</w:t>
+      </w:r>
+      <w:r>
+        <w:rPr>
+          <w:rStyle w:val="citation-732"/>
+          <w:sz w:val="28"/>
+          <w:szCs w:val="28"/>
+        </w:rPr>
+        <w:t xml:space="preserve"> </w:t>
+      </w:r>
+    </w:p>
+    <w:p>
+      <w:pPr>
+        <w:pStyle w:val="a7"/>
+        <w:numPr>
+          <w:ilvl w:val="1"/>
+          <w:numId w:val="24"/>
+        </w:numPr>
+        <w:spacing w:before="0" w:beforeAutospacing="0" w:after="0" w:afterAutospacing="0" w:line="360" w:lineRule="auto"/>
+        <w:ind w:left="0" w:firstLine="706"/>
+        <w:jc w:val="both"/>
+        <w:rPr>
+          <w:sz w:val="28"/>
+          <w:szCs w:val="28"/>
+        </w:rPr>
+      </w:pPr>
+      <w:r>
+        <w:rPr>
+          <w:sz w:val="28"/>
+          <w:szCs w:val="28"/>
+        </w:rPr>
+        <w:t>Автоматичний аналіз шляху компіляції проєкту на основі метаданих компілятора.</w:t>
+      </w:r>
+    </w:p>
+    <w:p>
+      <w:pPr>
+        <w:pStyle w:val="a7"/>
+        <w:numPr>
+          <w:ilvl w:val="1"/>
+          <w:numId w:val="24"/>
+        </w:numPr>
+        <w:spacing w:before="0" w:beforeAutospacing="0" w:after="0" w:afterAutospacing="0" w:line="360" w:lineRule="auto"/>
+        <w:ind w:left="0" w:firstLine="706"/>
+        <w:jc w:val="both"/>
+        <w:rPr>
+          <w:sz w:val="28"/>
+          <w:szCs w:val="28"/>
+        </w:rPr>
+      </w:pPr>
+      <w:r>
+        <w:rPr>
+          <w:sz w:val="28"/>
+          <w:szCs w:val="28"/>
+        </w:rPr>
+        <w:t>Подавання 100 звукових сигналів фіксованої частоти у разі виявлення списування або неправильного розміщення папок.</w:t>
+      </w:r>
+    </w:p>
+    <w:p>
+      <w:pPr>
+        <w:pStyle w:val="a7"/>
+        <w:numPr>
+          <w:ilvl w:val="1"/>
+          <w:numId w:val="24"/>
+        </w:numPr>
+        <w:spacing w:before="0" w:beforeAutospacing="0" w:after="0" w:afterAutospacing="0" w:line="360" w:lineRule="auto"/>
+        <w:ind w:left="0" w:firstLine="706"/>
+        <w:jc w:val="both"/>
+        <w:rPr>
+          <w:sz w:val="28"/>
+          <w:szCs w:val="28"/>
+        </w:rPr>
+      </w:pPr>
+      <w:r>
+        <w:rPr>
+          <w:sz w:val="28"/>
+          <w:szCs w:val="28"/>
+        </w:rPr>
+        <w:t>Забезпечення зчитування зовнішніх текстових файлів конфігурації тестів.</w:t>
+      </w:r>
+    </w:p>
+    <w:p>
+      <w:pPr>
+        <w:pStyle w:val="a7"/>
+        <w:numPr>
+          <w:ilvl w:val="1"/>
+          <w:numId w:val="24"/>
+        </w:numPr>
+        <w:spacing w:before="0" w:beforeAutospacing="0" w:after="0" w:afterAutospacing="0" w:line="360" w:lineRule="auto"/>
+        <w:ind w:left="0" w:firstLine="706"/>
+        <w:jc w:val="both"/>
+        <w:rPr>
+          <w:sz w:val="28"/>
+          <w:szCs w:val="28"/>
+        </w:rPr>
+      </w:pPr>
+      <w:r>
+        <w:rPr>
+          <w:sz w:val="28"/>
+          <w:szCs w:val="28"/>
+        </w:rPr>
+        <w:t xml:space="preserve">Ведення детального протоколу тестування із фіксацією результатів </w:t>
+      </w:r>
+      <w:r>
+        <w:rPr>
+          <w:rStyle w:val="HTML"/>
+          <w:rFonts w:ascii="Times New Roman" w:hAnsi="Times New Roman" w:cs="Times New Roman"/>
+          <w:sz w:val="28"/>
+          <w:szCs w:val="28"/>
+        </w:rPr>
+        <w:t>PASSED</w:t>
+      </w:r>
+      <w:r>
+        <w:rPr>
+          <w:sz w:val="28"/>
+          <w:szCs w:val="28"/>
+        </w:rPr>
+        <w:t>/</w:t>
+      </w:r>
+      <w:r>
+        <w:rPr>
+          <w:rStyle w:val="HTML"/>
+          <w:rFonts w:ascii="Times New Roman" w:hAnsi="Times New Roman" w:cs="Times New Roman"/>
+          <w:sz w:val="28"/>
+          <w:szCs w:val="28"/>
+        </w:rPr>
+        <w:t>FAILED</w:t>
+      </w:r>
+      <w:r>
+        <w:rPr>
+          <w:sz w:val="28"/>
+          <w:szCs w:val="28"/>
+        </w:rPr>
+        <w:t xml:space="preserve"> для кожного тест-кейса.</w:t>
+      </w:r>
+    </w:p>
+    <w:p>
+      <w:pPr>
+        <w:pStyle w:val="a7"/>
+        <w:numPr>
+          <w:ilvl w:val="0"/>
+          <w:numId w:val="24"/>
+        </w:numPr>
+        <w:spacing w:before="0" w:beforeAutospacing="0" w:after="0" w:afterAutospacing="0" w:line="360" w:lineRule="auto"/>
+        <w:ind w:left="0" w:firstLine="706"/>
+        <w:jc w:val="both"/>
+        <w:rPr>
+          <w:sz w:val="28"/>
+          <w:szCs w:val="28"/>
+        </w:rPr>
+      </w:pPr>
+      <w:r>
+        <w:rPr>
+          <w:b/>
+          <w:bCs/>
+          <w:sz w:val="28"/>
+          <w:szCs w:val="28"/>
+        </w:rPr>
+        <w:lastRenderedPageBreak/>
+        <w:t>Нефункциональні вимоги:</w:t>
+      </w:r>
+    </w:p>
+    <w:p>
+      <w:pPr>
+        <w:pStyle w:val="a7"/>
+        <w:numPr>
+          <w:ilvl w:val="1"/>
+          <w:numId w:val="24"/>
+        </w:numPr>
+        <w:spacing w:before="0" w:beforeAutospacing="0" w:after="0" w:afterAutospacing="0" w:line="360" w:lineRule="auto"/>
+        <w:ind w:left="0" w:firstLine="706"/>
+        <w:jc w:val="both"/>
+        <w:rPr>
+          <w:sz w:val="28"/>
+          <w:szCs w:val="28"/>
+        </w:rPr>
+      </w:pPr>
+      <w:r>
+        <w:rPr>
+          <w:sz w:val="28"/>
+          <w:szCs w:val="28"/>
+        </w:rPr>
+        <w:t>Тип додатка: консольний (Console Application) мовою С++.</w:t>
+      </w:r>
+    </w:p>
+    <w:p>
+      <w:pPr>
+        <w:pStyle w:val="a7"/>
+        <w:numPr>
+          <w:ilvl w:val="1"/>
+          <w:numId w:val="24"/>
+        </w:numPr>
+        <w:spacing w:before="0" w:beforeAutospacing="0" w:after="0" w:afterAutospacing="0" w:line="360" w:lineRule="auto"/>
+        <w:ind w:left="0" w:firstLine="706"/>
+        <w:jc w:val="both"/>
+        <w:rPr>
+          <w:sz w:val="28"/>
+          <w:szCs w:val="28"/>
+        </w:rPr>
+      </w:pPr>
+      <w:r>
+        <w:rPr>
+          <w:rStyle w:val="citation-731"/>
+          <w:sz w:val="28"/>
+          <w:szCs w:val="28"/>
+        </w:rPr>
+        <w:t>Сумісність: робота у кросплатформовому середовищі Code::Blocks</w:t>
+      </w:r>
+      <w:r>
+        <w:rPr>
+          <w:sz w:val="28"/>
+          <w:szCs w:val="28"/>
+        </w:rPr>
+        <w:t xml:space="preserve">. </w:t>
+      </w:r>
+    </w:p>
+    <w:p>
+      <w:pPr>
+        <w:pStyle w:val="a7"/>
+        <w:numPr>
+          <w:ilvl w:val="1"/>
+          <w:numId w:val="24"/>
+        </w:numPr>
+        <w:spacing w:before="0" w:beforeAutospacing="0" w:after="0" w:afterAutospacing="0" w:line="360" w:lineRule="auto"/>
+        <w:ind w:left="0" w:firstLine="706"/>
+        <w:jc w:val="both"/>
+        <w:rPr>
+          <w:sz w:val="28"/>
+          <w:szCs w:val="28"/>
+        </w:rPr>
+      </w:pPr>
+      <w:r>
+        <w:rPr>
+          <w:sz w:val="28"/>
+          <w:szCs w:val="28"/>
+        </w:rPr>
+        <w:t>Локалізація: повна підтримка відображення українського тексту в консолі Windows без деформації символів (за допомогою кодування UTF-8).</w:t>
+      </w:r>
+    </w:p>
+    <w:p>
+      <w:pPr>
+        <w:pStyle w:val="4"/>
+        <w:spacing w:before="0" w:line="360" w:lineRule="auto"/>
+        <w:ind w:firstLine="706"/>
+        <w:jc w:val="both"/>
+        <w:rPr>
+          <w:rFonts w:ascii="Times New Roman" w:hAnsi="Times New Roman" w:cs="Times New Roman"/>
+          <w:sz w:val="28"/>
+          <w:szCs w:val="28"/>
+        </w:rPr>
+      </w:pPr>
+      <w:r>
+        <w:rPr>
+          <w:rFonts w:ascii="Times New Roman" w:hAnsi="Times New Roman" w:cs="Times New Roman"/>
+          <w:sz w:val="28"/>
+          <w:szCs w:val="28"/>
+        </w:rPr>
+        <w:t>10.2. Архітектура програмного засобу</w:t>
+      </w:r>
+    </w:p>
+    <w:p>
+      <w:pPr>
+        <w:pStyle w:val="a7"/>
+        <w:spacing w:before="0" w:beforeAutospacing="0" w:after="0" w:afterAutospacing="0" w:line="360" w:lineRule="auto"/>
+        <w:ind w:firstLine="706"/>
+        <w:jc w:val="both"/>
+        <w:rPr>
+          <w:sz w:val="28"/>
+          <w:szCs w:val="28"/>
+        </w:rPr>
+      </w:pPr>
+      <w:r>
+        <w:rPr>
+          <w:sz w:val="28"/>
+          <w:szCs w:val="28"/>
+        </w:rPr>
+        <w:t>Програма спроєктована за модульним принципом і складається з чотирьох взаємопов'язаних архітектурних компонентів:</w:t>
+      </w:r>
+    </w:p>
+    <w:p>
+      <w:pPr>
+        <w:pStyle w:val="a7"/>
+        <w:numPr>
+          <w:ilvl w:val="0"/>
+          <w:numId w:val="25"/>
+        </w:numPr>
+        <w:spacing w:before="0" w:beforeAutospacing="0" w:after="0" w:afterAutospacing="0" w:line="360" w:lineRule="auto"/>
+        <w:ind w:left="0" w:firstLine="706"/>
+        <w:jc w:val="both"/>
+        <w:rPr>
+          <w:sz w:val="28"/>
+          <w:szCs w:val="28"/>
+        </w:rPr>
+      </w:pPr>
+      <w:r>
+        <w:rPr>
+          <w:rStyle w:val="citation-730"/>
+          <w:b/>
+          <w:bCs/>
+          <w:sz w:val="28"/>
+          <w:szCs w:val="28"/>
+        </w:rPr>
+        <w:t>Модуль валідації середовища:</w:t>
+      </w:r>
+      <w:r>
+        <w:rPr>
+          <w:rStyle w:val="citation-730"/>
+          <w:sz w:val="28"/>
+          <w:szCs w:val="28"/>
+        </w:rPr>
+        <w:t xml:space="preserve"> Функція isPathCorrect(), яка ізолює логіку перевірки рядка __FILE__</w:t>
+      </w:r>
+      <w:r>
+        <w:rPr>
+          <w:sz w:val="28"/>
+          <w:szCs w:val="28"/>
+        </w:rPr>
+        <w:t xml:space="preserve">. </w:t>
+      </w:r>
+    </w:p>
+    <w:p>
+      <w:pPr>
+        <w:pStyle w:val="a7"/>
+        <w:numPr>
+          <w:ilvl w:val="0"/>
+          <w:numId w:val="25"/>
+        </w:numPr>
+        <w:spacing w:before="0" w:beforeAutospacing="0" w:after="0" w:afterAutospacing="0" w:line="360" w:lineRule="auto"/>
+        <w:ind w:left="0" w:firstLine="706"/>
+        <w:jc w:val="both"/>
+        <w:rPr>
+          <w:sz w:val="28"/>
+          <w:szCs w:val="28"/>
+        </w:rPr>
+      </w:pPr>
+      <w:r>
+        <w:rPr>
+          <w:rStyle w:val="citation-729"/>
+          <w:b/>
+          <w:bCs/>
+          <w:sz w:val="28"/>
+          <w:szCs w:val="28"/>
+        </w:rPr>
+        <w:t>Диспетчер виконання (main):</w:t>
+      </w:r>
+      <w:r>
+        <w:rPr>
+          <w:rStyle w:val="citation-729"/>
+          <w:sz w:val="28"/>
+          <w:szCs w:val="28"/>
+        </w:rPr>
+        <w:t xml:space="preserve"> Центральний модуль, що ініціалізує параметри консолі, обробляє логічне розгалуження (успіх/аварія) та викликає підсистему тестів</w:t>
+      </w:r>
+      <w:r>
+        <w:rPr>
+          <w:sz w:val="28"/>
+          <w:szCs w:val="28"/>
+        </w:rPr>
+        <w:t xml:space="preserve">. </w:t>
+      </w:r>
+    </w:p>
+    <w:p>
+      <w:pPr>
+        <w:pStyle w:val="a7"/>
+        <w:numPr>
+          <w:ilvl w:val="0"/>
+          <w:numId w:val="25"/>
+        </w:numPr>
+        <w:spacing w:before="0" w:beforeAutospacing="0" w:after="0" w:afterAutospacing="0" w:line="360" w:lineRule="auto"/>
+        <w:ind w:left="0" w:firstLine="706"/>
+        <w:jc w:val="both"/>
+        <w:rPr>
+          <w:sz w:val="28"/>
+          <w:szCs w:val="28"/>
+        </w:rPr>
+      </w:pPr>
+      <w:r>
+        <w:rPr>
+          <w:rStyle w:val="citation-728"/>
+          <w:b/>
+          <w:bCs/>
+          <w:sz w:val="28"/>
+          <w:szCs w:val="28"/>
+        </w:rPr>
+        <w:t>Модуль Unit-тестування:</w:t>
+      </w:r>
+      <w:r>
+        <w:rPr>
+          <w:rStyle w:val="citation-728"/>
+          <w:sz w:val="28"/>
+          <w:szCs w:val="28"/>
+        </w:rPr>
+        <w:t xml:space="preserve"> Локальний клас TestRunner зі статичним методом, що повністю інкапсулює роботу з тестованим класом ClassLab12_Nikolenko та файловими потоками</w:t>
+      </w:r>
+      <w:r>
+        <w:rPr>
+          <w:sz w:val="28"/>
+          <w:szCs w:val="28"/>
+        </w:rPr>
+        <w:t xml:space="preserve">. </w:t>
+      </w:r>
+    </w:p>
+    <w:p>
+      <w:pPr>
+        <w:pStyle w:val="a7"/>
+        <w:numPr>
+          <w:ilvl w:val="0"/>
+          <w:numId w:val="25"/>
+        </w:numPr>
+        <w:spacing w:before="0" w:beforeAutospacing="0" w:after="0" w:afterAutospacing="0" w:line="360" w:lineRule="auto"/>
+        <w:ind w:left="0" w:firstLine="706"/>
+        <w:jc w:val="both"/>
+        <w:rPr>
+          <w:sz w:val="28"/>
+          <w:szCs w:val="28"/>
+        </w:rPr>
+      </w:pPr>
+      <w:r>
+        <w:rPr>
+          <w:rStyle w:val="citation-727"/>
+          <w:b/>
+          <w:bCs/>
+          <w:sz w:val="28"/>
+          <w:szCs w:val="28"/>
+        </w:rPr>
+        <w:t>Модуль звітності:</w:t>
+      </w:r>
+      <w:r>
+        <w:rPr>
+          <w:rStyle w:val="citation-727"/>
+          <w:sz w:val="28"/>
+          <w:szCs w:val="28"/>
+        </w:rPr>
+        <w:t xml:space="preserve"> Потокова підсистема std::ofstream, яка здійснює фізичний запис логів на диск</w:t>
+      </w:r>
+      <w:r>
+        <w:rPr>
+          <w:sz w:val="28"/>
+          <w:szCs w:val="28"/>
+        </w:rPr>
+        <w:t xml:space="preserve">. </w:t>
+      </w:r>
+    </w:p>
+    <w:p>
+      <w:pPr>
+        <w:pStyle w:val="4"/>
+        <w:spacing w:before="0" w:line="360" w:lineRule="auto"/>
+        <w:ind w:firstLine="706"/>
+        <w:jc w:val="both"/>
+        <w:rPr>
+          <w:rFonts w:ascii="Times New Roman" w:hAnsi="Times New Roman" w:cs="Times New Roman"/>
+          <w:sz w:val="28"/>
+          <w:szCs w:val="28"/>
+        </w:rPr>
+      </w:pPr>
+      <w:r>
+        <w:rPr>
+          <w:rFonts w:ascii="Times New Roman" w:hAnsi="Times New Roman" w:cs="Times New Roman"/>
+          <w:sz w:val="28"/>
+          <w:szCs w:val="28"/>
+        </w:rPr>
+        <w:t>10.3. Детальне проєктування модулів</w:t>
+      </w:r>
+    </w:p>
+    <w:p>
+      <w:pPr>
+        <w:pStyle w:val="a7"/>
+        <w:numPr>
+          <w:ilvl w:val="0"/>
+          <w:numId w:val="26"/>
+        </w:numPr>
+        <w:spacing w:before="0" w:beforeAutospacing="0" w:after="0" w:afterAutospacing="0" w:line="360" w:lineRule="auto"/>
+        <w:ind w:left="0" w:firstLine="706"/>
+        <w:jc w:val="both"/>
+        <w:rPr>
+          <w:sz w:val="28"/>
+          <w:szCs w:val="28"/>
+        </w:rPr>
+      </w:pPr>
+      <w:r>
+        <w:rPr>
+          <w:rStyle w:val="citation-726"/>
+          <w:rFonts w:eastAsiaTheme="majorEastAsia"/>
+          <w:b/>
+          <w:bCs/>
+          <w:sz w:val="28"/>
+          <w:szCs w:val="28"/>
+        </w:rPr>
+        <w:t>Реалізація перевірки шляху:</w:t>
+      </w:r>
+      <w:r>
+        <w:rPr>
+          <w:rStyle w:val="citation-726"/>
+          <w:rFonts w:eastAsiaTheme="majorEastAsia"/>
+          <w:sz w:val="28"/>
+          <w:szCs w:val="28"/>
+        </w:rPr>
+        <w:t xml:space="preserve"> Використовується вбудований макрос препроцесора __FILE__</w:t>
+      </w:r>
+      <w:r>
+        <w:rPr>
+          <w:sz w:val="28"/>
+          <w:szCs w:val="28"/>
+        </w:rPr>
+        <w:t xml:space="preserve">. Пошук підрядків </w:t>
+      </w:r>
+      <w:r>
+        <w:rPr>
+          <w:rStyle w:val="HTML"/>
+          <w:rFonts w:ascii="Times New Roman" w:hAnsi="Times New Roman" w:cs="Times New Roman"/>
+          <w:sz w:val="28"/>
+          <w:szCs w:val="28"/>
+        </w:rPr>
+        <w:t>\\lab12\\prj\\Teacher\\</w:t>
+      </w:r>
+      <w:r>
+        <w:rPr>
+          <w:sz w:val="28"/>
+          <w:szCs w:val="28"/>
+        </w:rPr>
+        <w:t xml:space="preserve"> реалізується за допомогою стандартного методу </w:t>
+      </w:r>
+      <w:r>
+        <w:rPr>
+          <w:rStyle w:val="HTML"/>
+          <w:rFonts w:ascii="Times New Roman" w:hAnsi="Times New Roman" w:cs="Times New Roman"/>
+          <w:sz w:val="28"/>
+          <w:szCs w:val="28"/>
+        </w:rPr>
+        <w:t>std::string::find()</w:t>
+      </w:r>
+      <w:r>
+        <w:rPr>
+          <w:sz w:val="28"/>
+          <w:szCs w:val="28"/>
+        </w:rPr>
+        <w:t xml:space="preserve">. Результат порівнюється з константою </w:t>
+      </w:r>
+      <w:r>
+        <w:rPr>
+          <w:rStyle w:val="HTML"/>
+          <w:rFonts w:ascii="Times New Roman" w:hAnsi="Times New Roman" w:cs="Times New Roman"/>
+          <w:sz w:val="28"/>
+          <w:szCs w:val="28"/>
+        </w:rPr>
+        <w:t>std::string::npos</w:t>
+      </w:r>
+      <w:r>
+        <w:rPr>
+          <w:sz w:val="28"/>
+          <w:szCs w:val="28"/>
+        </w:rPr>
+        <w:t xml:space="preserve">. </w:t>
+      </w:r>
+    </w:p>
+    <w:p>
+      <w:pPr>
+        <w:pStyle w:val="a7"/>
+        <w:numPr>
+          <w:ilvl w:val="0"/>
+          <w:numId w:val="26"/>
+        </w:numPr>
+        <w:spacing w:before="0" w:beforeAutospacing="0" w:after="0" w:afterAutospacing="0" w:line="360" w:lineRule="auto"/>
+        <w:ind w:left="0" w:firstLine="706"/>
+        <w:jc w:val="both"/>
+        <w:rPr>
+          <w:sz w:val="28"/>
+          <w:szCs w:val="28"/>
+        </w:rPr>
+      </w:pPr>
+      <w:r>
+        <w:rPr>
+          <w:rStyle w:val="citation-725"/>
+          <w:b/>
+          <w:bCs/>
+          <w:sz w:val="28"/>
+          <w:szCs w:val="28"/>
+        </w:rPr>
+        <w:t>Реалізація звукового бар'єра:</w:t>
+      </w:r>
+      <w:r>
+        <w:rPr>
+          <w:rStyle w:val="citation-725"/>
+          <w:sz w:val="28"/>
+          <w:szCs w:val="28"/>
+        </w:rPr>
+        <w:t xml:space="preserve"> Використовується функція Windows API Beep(1000, 150), поміщена всередину ітераційного циклу for (int i = 0; i &lt; 100; ++i) із мікрозатримкою Sleep(50) для запобігання злиттю звуку в один сигнал</w:t>
+      </w:r>
+      <w:r>
+        <w:rPr>
+          <w:sz w:val="28"/>
+          <w:szCs w:val="28"/>
+        </w:rPr>
+        <w:t xml:space="preserve">. </w:t>
+      </w:r>
+    </w:p>
+    <w:p>
+      <w:pPr>
+        <w:pStyle w:val="a7"/>
+        <w:numPr>
+          <w:ilvl w:val="0"/>
+          <w:numId w:val="26"/>
+        </w:numPr>
+        <w:spacing w:before="0" w:beforeAutospacing="0" w:after="0" w:afterAutospacing="0" w:line="360" w:lineRule="auto"/>
+        <w:ind w:left="0" w:firstLine="706"/>
+        <w:jc w:val="both"/>
+        <w:rPr>
+          <w:sz w:val="28"/>
+          <w:szCs w:val="28"/>
+        </w:rPr>
+      </w:pPr>
+      <w:r>
+        <w:rPr>
+          <w:rStyle w:val="citation-724"/>
+          <w:b/>
+          <w:bCs/>
+          <w:sz w:val="28"/>
+          <w:szCs w:val="28"/>
+        </w:rPr>
+        <w:t>Реалізація парсера тестів:</w:t>
+      </w:r>
+      <w:r>
+        <w:rPr>
+          <w:rStyle w:val="citation-724"/>
+          <w:sz w:val="28"/>
+          <w:szCs w:val="28"/>
+        </w:rPr>
+        <w:t xml:space="preserve"> Згідно з пунктом 12 порядку виконання роботи, зчитування проєктується через </w:t>
+      </w:r>
+      <w:r>
+        <w:rPr>
+          <w:rStyle w:val="citation-724"/>
+          <w:b/>
+          <w:bCs/>
+          <w:sz w:val="28"/>
+          <w:szCs w:val="28"/>
+        </w:rPr>
+        <w:t>локальний клас</w:t>
+      </w:r>
+      <w:r>
+        <w:rPr>
+          <w:rStyle w:val="citation-724"/>
+          <w:sz w:val="28"/>
+          <w:szCs w:val="28"/>
+        </w:rPr>
+        <w:t xml:space="preserve"> TestRunner, визначений безпосередньо всередині функції main()</w:t>
+      </w:r>
+      <w:r>
+        <w:rPr>
+          <w:sz w:val="28"/>
+          <w:szCs w:val="28"/>
+        </w:rPr>
+        <w:t>. Це обмежує область видимості інструментарію тестування та захищає логіку тесту від зовнішнього втручання. Порівняння результатів об'єму (</w:t>
+      </w:r>
+      <w:r>
+        <w:rPr>
+          <w:rStyle w:val="HTML"/>
+          <w:rFonts w:ascii="Times New Roman" w:hAnsi="Times New Roman" w:cs="Times New Roman"/>
+          <w:sz w:val="28"/>
+          <w:szCs w:val="28"/>
+        </w:rPr>
+        <w:t>double</w:t>
+      </w:r>
+      <w:r>
+        <w:rPr>
+          <w:sz w:val="28"/>
+          <w:szCs w:val="28"/>
+        </w:rPr>
+        <w:t xml:space="preserve">) виконується за формулою </w:t>
+      </w:r>
+      <w:r>
+        <w:rPr>
+          <w:rStyle w:val="HTML"/>
+          <w:rFonts w:ascii="Times New Roman" w:hAnsi="Times New Roman" w:cs="Times New Roman"/>
+          <w:sz w:val="28"/>
+          <w:szCs w:val="28"/>
+        </w:rPr>
+        <w:t>abs(actual - expected) &lt; 0.0001</w:t>
+      </w:r>
+      <w:r>
+        <w:rPr>
+          <w:sz w:val="28"/>
+          <w:szCs w:val="28"/>
+        </w:rPr>
+        <w:t xml:space="preserve"> для уникнення похибок представлення чисел із рухомою комою. </w:t>
+      </w:r>
+    </w:p>
+    <w:p/>
+    <w:p/>
+    <w:p/>
+    <w:p/>
+    <w:p/>
+    <w:p>
+      <w:pPr>
+        <w:rPr>
+          <w:lang w:val="ru-RU"/>
+        </w:rPr>
+      </w:pPr>
+      <w:r>
+        <w:rPr>
+          <w:lang w:val="ru-RU"/>
+        </w:rPr>
+        <w:t>Текстовий тест-кейс для тестування</w:t>
+      </w:r>
+      <w:r>
+        <w:rPr>
+          <w:lang w:val="ru-RU"/>
+        </w:rPr>
+        <w:t>:</w:t>
+      </w:r>
+    </w:p>
+    <w:p>
+      <w:pPr>
+        <w:rPr>
+          <w:lang w:val="ru-RU"/>
+        </w:rPr>
+      </w:pPr>
+    </w:p>
+    <w:p>
+      <w:r>
+        <w:t>=== ПРОТОКОЛ АВТОМАТИЗОВАНОГО ТЕСТУВАННЯ ===</w:t>
+      </w:r>
+    </w:p>
+    <w:p>
+      <w:r>
+        <w:t>TC_12_01 -&gt; Inputs: a=2, b=3, h=4 -&gt; Expected Volume: 24 -&gt; Actual Volume: 24 -&gt; Result: PASSED</w:t>
+      </w:r>
+    </w:p>
+    <w:p>
+      <w:r>
+        <w:t>TC_12_02 -&gt; Inputs: a=1, b=1, h=1 -&gt; Expected Volume: 1 -&gt; Actual Volume: 1 -&gt; Result: PASSED</w:t>
+      </w:r>
+    </w:p>
+    <w:p>
+      <w:r>
+        <w:t>TC_12_03 -&gt; Inputs: a=5.5, b=2, h=10 -&gt; Expected Volume: 110 -&gt; Actual Volume: 110 -&gt; Result: PASSED</w:t>
+      </w:r>
+    </w:p>
+    <w:p>
+      <w:r>
+        <w:t>TC_12_04 -&gt; Inputs: a=-5, b=3, h=2 -&gt; Expected Volume: 6 -&gt; Actual Volume: 6 -&gt; Result: PASSED</w:t>
+      </w:r>
+    </w:p>
+    <w:p>
+      <w:r>
+        <w:t>TC_12_05 -&gt; Inputs: a=4, b=0, h=5 -&gt; Expected Volume: 20 -&gt; Actual Volume: 20 -&gt; Result: PASSED</w:t>
+      </w:r>
+    </w:p>
+    <w:p>
+      <w:r>
+        <w:t>TC_12_06 -&gt; Inputs: a=-2.5, b=-3, h=-4 -&gt; Expected Volume: 1 -&gt; Actual Volume: 1 -&gt; Result: PASSED</w:t>
+      </w:r>
+    </w:p>
+    <w:p>
+      <w:r>
+        <w:t>=== ТЕСТУВАННЯ ЗАВЕРШЕНО ===</w:t>
+      </w:r>
+    </w:p>
+    <w:p/>
+    <w:p>
+      <w:pPr>
+        <w:rPr>
+          <w:lang w:val="ru-RU"/>
+        </w:rPr>
+      </w:pPr>
+      <w:r>
+        <w:t>Код</w:t>
+      </w:r>
+      <w:r>
+        <w:rPr>
+          <w:lang w:val="ru-RU"/>
+        </w:rPr>
+        <w:t>:</w:t>
+      </w:r>
+    </w:p>
+    <w:p>
+      <w:pPr>
+        <w:rPr>
+          <w:lang w:val="ru-RU"/>
+        </w:rPr>
+      </w:pPr>
+    </w:p>
+    <w:p>
+      <w:pPr>
+        <w:rPr>
+          <w:rFonts w:ascii="Courier New" w:hAnsi="Courier New" w:cs="Courier New"/>
+          <w:sz w:val="20"/>
+          <w:szCs w:val="20"/>
+          <w:lang w:val="ru-RU"/>
+        </w:rPr>
+      </w:pPr>
+      <w:r>
+        <w:rPr>
+          <w:rFonts w:ascii="Courier New" w:hAnsi="Courier New" w:cs="Courier New"/>
+          <w:sz w:val="20"/>
+          <w:szCs w:val="20"/>
+          <w:lang w:val="ru-RU"/>
+        </w:rPr>
+        <w:t>#</w:t>
+      </w:r>
+      <w:r>
+        <w:rPr>
+          <w:rFonts w:ascii="Courier New" w:hAnsi="Courier New" w:cs="Courier New"/>
+          <w:sz w:val="20"/>
+          <w:szCs w:val="20"/>
+          <w:lang w:val="en-US"/>
+        </w:rPr>
+        <w:t>include</w:t>
+      </w:r>
+      <w:r>
+        <w:rPr>
+          <w:rFonts w:ascii="Courier New" w:hAnsi="Courier New" w:cs="Courier New"/>
+          <w:sz w:val="20"/>
+          <w:szCs w:val="20"/>
+          <w:lang w:val="ru-RU"/>
+        </w:rPr>
+        <w:t xml:space="preserve"> &lt;</w:t>
+      </w:r>
+      <w:r>
+        <w:rPr>
+          <w:rFonts w:ascii="Courier New" w:hAnsi="Courier New" w:cs="Courier New"/>
+          <w:sz w:val="20"/>
+          <w:szCs w:val="20"/>
+          <w:lang w:val="en-US"/>
+        </w:rPr>
+        <w:t>iostream</w:t>
+      </w:r>
+      <w:r>
+        <w:rPr>
+          <w:rFonts w:ascii="Courier New" w:hAnsi="Courier New" w:cs="Courier New"/>
+          <w:sz w:val="20"/>
+          <w:szCs w:val="20"/>
+          <w:lang w:val="ru-RU"/>
+        </w:rPr>
+        <w:t>&gt;</w:t>
+      </w:r>
+    </w:p>
+    <w:p>
+      <w:pPr>
+        <w:rPr>
+          <w:rFonts w:ascii="Courier New" w:hAnsi="Courier New" w:cs="Courier New"/>
+          <w:sz w:val="20"/>
+          <w:szCs w:val="20"/>
+          <w:lang w:val="en-US"/>
+        </w:rPr>
+      </w:pPr>
+      <w:r>
+        <w:rPr>
+          <w:rFonts w:ascii="Courier New" w:hAnsi="Courier New" w:cs="Courier New"/>
+          <w:sz w:val="20"/>
+          <w:szCs w:val="20"/>
+          <w:lang w:val="en-US"/>
+        </w:rPr>
+        <w:t>#include &lt;fstream&gt;</w:t>
+      </w:r>
+    </w:p>
+    <w:p>
+      <w:pPr>
+        <w:rPr>
+          <w:rFonts w:ascii="Courier New" w:hAnsi="Courier New" w:cs="Courier New"/>
+          <w:sz w:val="20"/>
+          <w:szCs w:val="20"/>
+          <w:lang w:val="en-US"/>
+        </w:rPr>
+      </w:pPr>
+      <w:r>
+        <w:rPr>
+          <w:rFonts w:ascii="Courier New" w:hAnsi="Courier New" w:cs="Courier New"/>
+          <w:sz w:val="20"/>
+          <w:szCs w:val="20"/>
+          <w:lang w:val="en-US"/>
+        </w:rPr>
+        <w:t>#include &lt;string&gt;</w:t>
+      </w:r>
+    </w:p>
+    <w:p>
+      <w:pPr>
+        <w:rPr>
+          <w:rFonts w:ascii="Courier New" w:hAnsi="Courier New" w:cs="Courier New"/>
+          <w:sz w:val="20"/>
+          <w:szCs w:val="20"/>
+          <w:lang w:val="en-US"/>
+        </w:rPr>
+      </w:pPr>
+      <w:r>
+        <w:rPr>
+          <w:rFonts w:ascii="Courier New" w:hAnsi="Courier New" w:cs="Courier New"/>
+          <w:sz w:val="20"/>
+          <w:szCs w:val="20"/>
+          <w:lang w:val="en-US"/>
+        </w:rPr>
+        <w:t>#include &lt;windows.h&gt;</w:t>
+      </w:r>
+    </w:p>
+    <w:p>
+      <w:pPr>
+        <w:rPr>
+          <w:rFonts w:ascii="Courier New" w:hAnsi="Courier New" w:cs="Courier New"/>
+          <w:sz w:val="20"/>
+          <w:szCs w:val="20"/>
+          <w:lang w:val="en-US"/>
+        </w:rPr>
+      </w:pPr>
+      <w:r>
+        <w:rPr>
+          <w:rFonts w:ascii="Courier New" w:hAnsi="Courier New" w:cs="Courier New"/>
+          <w:sz w:val="20"/>
+          <w:szCs w:val="20"/>
+          <w:lang w:val="en-US"/>
+        </w:rPr>
+        <w:t>#include &lt;clocale&gt;</w:t>
+      </w:r>
+    </w:p>
+    <w:p>
+      <w:pPr>
+        <w:rPr>
+          <w:rFonts w:ascii="Courier New" w:hAnsi="Courier New" w:cs="Courier New"/>
+          <w:sz w:val="20"/>
+          <w:szCs w:val="20"/>
+          <w:lang w:val="en-US"/>
+        </w:rPr>
+      </w:pPr>
+      <w:r>
+        <w:rPr>
+          <w:rFonts w:ascii="Courier New" w:hAnsi="Courier New" w:cs="Courier New"/>
+          <w:sz w:val="20"/>
+          <w:szCs w:val="20"/>
+          <w:lang w:val="en-US"/>
+        </w:rPr>
+        <w:t>#include "ModulesNikolenko.h"</w:t>
+      </w:r>
+    </w:p>
+    <w:p>
+      <w:pPr>
+        <w:rPr>
+          <w:rFonts w:ascii="Courier New" w:hAnsi="Courier New" w:cs="Courier New"/>
+          <w:sz w:val="20"/>
+          <w:szCs w:val="20"/>
+          <w:lang w:val="en-US"/>
+        </w:rPr>
+      </w:pPr>
+    </w:p>
+    <w:p>
+      <w:pPr>
+        <w:rPr>
+          <w:rFonts w:ascii="Courier New" w:hAnsi="Courier New" w:cs="Courier New"/>
+          <w:sz w:val="20"/>
+          <w:szCs w:val="20"/>
+          <w:lang w:val="en-US"/>
+        </w:rPr>
+      </w:pPr>
+      <w:r>
+        <w:rPr>
+          <w:rFonts w:ascii="Courier New" w:hAnsi="Courier New" w:cs="Courier New"/>
+          <w:sz w:val="20"/>
+          <w:szCs w:val="20"/>
+          <w:lang w:val="en-US"/>
+        </w:rPr>
+        <w:t>using namespace std;</w:t>
+      </w:r>
+    </w:p>
+    <w:p>
+      <w:pPr>
+        <w:rPr>
+          <w:rFonts w:ascii="Courier New" w:hAnsi="Courier New" w:cs="Courier New"/>
+          <w:sz w:val="20"/>
+          <w:szCs w:val="20"/>
+          <w:lang w:val="en-US"/>
+        </w:rPr>
+      </w:pPr>
+    </w:p>
+    <w:p>
+      <w:pPr>
+        <w:rPr>
+          <w:rFonts w:ascii="Courier New" w:hAnsi="Courier New" w:cs="Courier New"/>
+          <w:sz w:val="20"/>
+          <w:szCs w:val="20"/>
+          <w:lang w:val="en-US"/>
+        </w:rPr>
+      </w:pPr>
+    </w:p>
+    <w:p>
+      <w:pPr>
+        <w:rPr>
+          <w:rFonts w:ascii="Courier New" w:hAnsi="Courier New" w:cs="Courier New"/>
+          <w:sz w:val="20"/>
+          <w:szCs w:val="20"/>
+          <w:lang w:val="en-US"/>
+        </w:rPr>
+      </w:pPr>
+      <w:r>
+        <w:rPr>
+          <w:rFonts w:ascii="Courier New" w:hAnsi="Courier New" w:cs="Courier New"/>
+          <w:sz w:val="20"/>
+          <w:szCs w:val="20"/>
+          <w:lang w:val="en-US"/>
+        </w:rPr>
+        <w:t>bool isPathCorrect() {</w:t>
+      </w:r>
+    </w:p>
+    <w:p>
+      <w:pPr>
+        <w:rPr>
+          <w:rFonts w:ascii="Courier New" w:hAnsi="Courier New" w:cs="Courier New"/>
+          <w:sz w:val="20"/>
+          <w:szCs w:val="20"/>
+          <w:lang w:val="en-US"/>
+        </w:rPr>
+      </w:pPr>
+      <w:r>
+        <w:rPr>
+          <w:rFonts w:ascii="Courier New" w:hAnsi="Courier New" w:cs="Courier New"/>
+          <w:sz w:val="20"/>
+          <w:szCs w:val="20"/>
+          <w:lang w:val="en-US"/>
+        </w:rPr>
+        <w:t xml:space="preserve">    string compilePath = __FILE__;</w:t>
+      </w:r>
+    </w:p>
+    <w:p>
+      <w:pPr>
+        <w:rPr>
+          <w:rFonts w:ascii="Courier New" w:hAnsi="Courier New" w:cs="Courier New"/>
+          <w:sz w:val="20"/>
+          <w:szCs w:val="20"/>
+          <w:lang w:val="en-US"/>
+        </w:rPr>
+      </w:pPr>
+    </w:p>
+    <w:p>
+      <w:pPr>
+        <w:rPr>
+          <w:rFonts w:ascii="Courier New" w:hAnsi="Courier New" w:cs="Courier New"/>
+          <w:sz w:val="20"/>
+          <w:szCs w:val="20"/>
+          <w:lang w:val="en-US"/>
+        </w:rPr>
+      </w:pPr>
+      <w:r>
+        <w:rPr>
+          <w:rFonts w:ascii="Courier New" w:hAnsi="Courier New" w:cs="Courier New"/>
+          <w:sz w:val="20"/>
+          <w:szCs w:val="20"/>
+          <w:lang w:val="en-US"/>
+        </w:rPr>
+        <w:t xml:space="preserve">    if (compilePath.find("\\lab12\\prj\\Teacher\\") != string::npos ||</w:t>
+      </w:r>
+    </w:p>
+    <w:p>
+      <w:pPr>
+        <w:rPr>
+          <w:rFonts w:ascii="Courier New" w:hAnsi="Courier New" w:cs="Courier New"/>
+          <w:sz w:val="20"/>
+          <w:szCs w:val="20"/>
+          <w:lang w:val="en-US"/>
+        </w:rPr>
+      </w:pPr>
+      <w:r>
+        <w:rPr>
+          <w:rFonts w:ascii="Courier New" w:hAnsi="Courier New" w:cs="Courier New"/>
+          <w:sz w:val="20"/>
+          <w:szCs w:val="20"/>
+          <w:lang w:val="en-US"/>
+        </w:rPr>
+        <w:t xml:space="preserve">        compilePath.find("/lab12/prj/Teacher/") != string::npos) {</w:t>
+      </w:r>
+    </w:p>
+    <w:p>
+      <w:pPr>
+        <w:rPr>
+          <w:rFonts w:ascii="Courier New" w:hAnsi="Courier New" w:cs="Courier New"/>
+          <w:sz w:val="20"/>
+          <w:szCs w:val="20"/>
+          <w:lang w:val="en-US"/>
+        </w:rPr>
+      </w:pPr>
+      <w:r>
+        <w:rPr>
+          <w:rFonts w:ascii="Courier New" w:hAnsi="Courier New" w:cs="Courier New"/>
+          <w:sz w:val="20"/>
+          <w:szCs w:val="20"/>
+          <w:lang w:val="en-US"/>
+        </w:rPr>
+        <w:t xml:space="preserve">        return true;</w:t>
+      </w:r>
+    </w:p>
+    <w:p>
+      <w:pPr>
+        <w:rPr>
+          <w:rFonts w:ascii="Courier New" w:hAnsi="Courier New" w:cs="Courier New"/>
+          <w:sz w:val="20"/>
+          <w:szCs w:val="20"/>
+          <w:lang w:val="en-US"/>
+        </w:rPr>
+      </w:pPr>
+      <w:r>
+        <w:rPr>
+          <w:rFonts w:ascii="Courier New" w:hAnsi="Courier New" w:cs="Courier New"/>
+          <w:sz w:val="20"/>
+          <w:szCs w:val="20"/>
+          <w:lang w:val="en-US"/>
+        </w:rPr>
+        <w:t xml:space="preserve">    }</w:t>
+      </w:r>
+    </w:p>
+    <w:p>
+      <w:pPr>
+        <w:rPr>
+          <w:rFonts w:ascii="Courier New" w:hAnsi="Courier New" w:cs="Courier New"/>
+          <w:sz w:val="20"/>
+          <w:szCs w:val="20"/>
+          <w:lang w:val="en-US"/>
+        </w:rPr>
+      </w:pPr>
+      <w:r>
+        <w:rPr>
+          <w:rFonts w:ascii="Courier New" w:hAnsi="Courier New" w:cs="Courier New"/>
+          <w:sz w:val="20"/>
+          <w:szCs w:val="20"/>
+          <w:lang w:val="en-US"/>
+        </w:rPr>
+        <w:t xml:space="preserve">    return false;</w:t>
+      </w:r>
+    </w:p>
+    <w:p>
+      <w:pPr>
+        <w:rPr>
+          <w:rFonts w:ascii="Courier New" w:hAnsi="Courier New" w:cs="Courier New"/>
+          <w:sz w:val="20"/>
+          <w:szCs w:val="20"/>
+          <w:lang w:val="en-US"/>
+        </w:rPr>
+      </w:pPr>
+      <w:r>
+        <w:rPr>
+          <w:rFonts w:ascii="Courier New" w:hAnsi="Courier New" w:cs="Courier New"/>
+          <w:sz w:val="20"/>
+          <w:szCs w:val="20"/>
+          <w:lang w:val="en-US"/>
+        </w:rPr>
+        <w:t>}</w:t>
+      </w:r>
+    </w:p>
+    <w:p>
+      <w:pPr>
+        <w:rPr>
+          <w:rFonts w:ascii="Courier New" w:hAnsi="Courier New" w:cs="Courier New"/>
+          <w:sz w:val="20"/>
+          <w:szCs w:val="20"/>
+          <w:lang w:val="en-US"/>
+        </w:rPr>
+      </w:pPr>
+    </w:p>
+    <w:p>
+      <w:pPr>
+        <w:rPr>
+          <w:rFonts w:ascii="Courier New" w:hAnsi="Courier New" w:cs="Courier New"/>
+          <w:sz w:val="20"/>
+          <w:szCs w:val="20"/>
+          <w:lang w:val="en-US"/>
+        </w:rPr>
+      </w:pPr>
+      <w:r>
+        <w:rPr>
+          <w:rFonts w:ascii="Courier New" w:hAnsi="Courier New" w:cs="Courier New"/>
+          <w:sz w:val="20"/>
+          <w:szCs w:val="20"/>
+          <w:lang w:val="en-US"/>
+        </w:rPr>
+        <w:t>int main() {</w:t>
+      </w:r>
+    </w:p>
+    <w:p>
+      <w:pPr>
+        <w:rPr>
+          <w:rFonts w:ascii="Courier New" w:hAnsi="Courier New" w:cs="Courier New"/>
+          <w:sz w:val="20"/>
+          <w:szCs w:val="20"/>
+          <w:lang w:val="en-US"/>
+        </w:rPr>
+      </w:pPr>
+      <w:r>
+        <w:rPr>
+          <w:rFonts w:ascii="Courier New" w:hAnsi="Courier New" w:cs="Courier New"/>
+          <w:sz w:val="20"/>
+          <w:szCs w:val="20"/>
+          <w:lang w:val="en-US"/>
+        </w:rPr>
+        <w:t xml:space="preserve">    SetConsoleCP(CP_UTF8);</w:t>
+      </w:r>
+    </w:p>
+    <w:p>
+      <w:pPr>
+        <w:rPr>
+          <w:rFonts w:ascii="Courier New" w:hAnsi="Courier New" w:cs="Courier New"/>
+          <w:sz w:val="20"/>
+          <w:szCs w:val="20"/>
+          <w:lang w:val="en-US"/>
+        </w:rPr>
+      </w:pPr>
+      <w:r>
+        <w:rPr>
+          <w:rFonts w:ascii="Courier New" w:hAnsi="Courier New" w:cs="Courier New"/>
+          <w:sz w:val="20"/>
+          <w:szCs w:val="20"/>
+          <w:lang w:val="en-US"/>
+        </w:rPr>
+        <w:t xml:space="preserve">    SetConsoleOutputCP(CP_UTF8);</w:t>
+      </w:r>
+    </w:p>
+    <w:p>
+      <w:pPr>
+        <w:rPr>
+          <w:rFonts w:ascii="Courier New" w:hAnsi="Courier New" w:cs="Courier New"/>
+          <w:sz w:val="20"/>
+          <w:szCs w:val="20"/>
+          <w:lang w:val="en-US"/>
+        </w:rPr>
+      </w:pPr>
+    </w:p>
+    <w:p>
+      <w:pPr>
+        <w:rPr>
+          <w:rFonts w:ascii="Courier New" w:hAnsi="Courier New" w:cs="Courier New"/>
+          <w:sz w:val="20"/>
+          <w:szCs w:val="20"/>
+          <w:lang w:val="en-US"/>
+        </w:rPr>
+      </w:pPr>
+      <w:r>
+        <w:rPr>
+          <w:rFonts w:ascii="Courier New" w:hAnsi="Courier New" w:cs="Courier New"/>
+          <w:sz w:val="20"/>
+          <w:szCs w:val="20"/>
+          <w:lang w:val="en-US"/>
+        </w:rPr>
+        <w:t xml:space="preserve">    if (!isPathCorrect()) {</w:t>
+      </w:r>
+    </w:p>
+    <w:p>
+      <w:pPr>
+        <w:rPr>
+          <w:rFonts w:ascii="Courier New" w:hAnsi="Courier New" w:cs="Courier New"/>
+          <w:sz w:val="20"/>
+          <w:szCs w:val="20"/>
+          <w:lang w:val="en-US"/>
+        </w:rPr>
+      </w:pPr>
+      <w:r>
+        <w:rPr>
+          <w:rFonts w:ascii="Courier New" w:hAnsi="Courier New" w:cs="Courier New"/>
+          <w:sz w:val="20"/>
+          <w:szCs w:val="20"/>
+          <w:lang w:val="en-US"/>
+        </w:rPr>
+        <w:t xml:space="preserve">        ofstream errorFile("TestResults.txt");</w:t>
+      </w:r>
+    </w:p>
+    <w:p>
+      <w:pPr>
+        <w:rPr>
+          <w:rFonts w:ascii="Courier New" w:hAnsi="Courier New" w:cs="Courier New"/>
+          <w:sz w:val="20"/>
+          <w:szCs w:val="20"/>
+          <w:lang w:val="en-US"/>
+        </w:rPr>
+      </w:pPr>
+      <w:r>
+        <w:rPr>
+          <w:rFonts w:ascii="Courier New" w:hAnsi="Courier New" w:cs="Courier New"/>
+          <w:sz w:val="20"/>
+          <w:szCs w:val="20"/>
+          <w:lang w:val="en-US"/>
+        </w:rPr>
+        <w:t xml:space="preserve">        if (errorFile.is_open()) {</w:t>
+      </w:r>
+    </w:p>
+    <w:p>
+      <w:pPr>
+        <w:rPr>
+          <w:rFonts w:ascii="Courier New" w:hAnsi="Courier New" w:cs="Courier New"/>
+          <w:sz w:val="20"/>
+          <w:szCs w:val="20"/>
+          <w:lang w:val="en-US"/>
+        </w:rPr>
+      </w:pPr>
+      <w:r>
+        <w:rPr>
+          <w:rFonts w:ascii="Courier New" w:hAnsi="Courier New" w:cs="Courier New"/>
+          <w:sz w:val="20"/>
+          <w:szCs w:val="20"/>
+          <w:lang w:val="en-US"/>
+        </w:rPr>
+        <w:t xml:space="preserve">            errorFile &lt;&lt; "Встановлені вимоги порядку виконання лабораторної роботи порушено!" &lt;&lt; endl;</w:t>
+      </w:r>
+    </w:p>
+    <w:p>
+      <w:pPr>
+        <w:rPr>
+          <w:rFonts w:ascii="Courier New" w:hAnsi="Courier New" w:cs="Courier New"/>
+          <w:sz w:val="20"/>
+          <w:szCs w:val="20"/>
+          <w:lang w:val="en-US"/>
+        </w:rPr>
+      </w:pPr>
+      <w:r>
+        <w:rPr>
+          <w:rFonts w:ascii="Courier New" w:hAnsi="Courier New" w:cs="Courier New"/>
+          <w:sz w:val="20"/>
+          <w:szCs w:val="20"/>
+          <w:lang w:val="en-US"/>
+        </w:rPr>
+        <w:t xml:space="preserve">            errorFile.close();</w:t>
+      </w:r>
+    </w:p>
+    <w:p>
+      <w:pPr>
+        <w:rPr>
+          <w:rFonts w:ascii="Courier New" w:hAnsi="Courier New" w:cs="Courier New"/>
+          <w:sz w:val="20"/>
+          <w:szCs w:val="20"/>
+          <w:lang w:val="en-US"/>
+        </w:rPr>
+      </w:pPr>
+      <w:r>
+        <w:rPr>
+          <w:rFonts w:ascii="Courier New" w:hAnsi="Courier New" w:cs="Courier New"/>
+          <w:sz w:val="20"/>
+          <w:szCs w:val="20"/>
+          <w:lang w:val="en-US"/>
+        </w:rPr>
+        <w:t xml:space="preserve">        }</w:t>
+      </w:r>
+    </w:p>
+    <w:p>
+      <w:pPr>
+        <w:rPr>
+          <w:rFonts w:ascii="Courier New" w:hAnsi="Courier New" w:cs="Courier New"/>
+          <w:sz w:val="20"/>
+          <w:szCs w:val="20"/>
+          <w:lang w:val="en-US"/>
+        </w:rPr>
+      </w:pPr>
+    </w:p>
+    <w:p>
+      <w:pPr>
+        <w:rPr>
+          <w:rFonts w:ascii="Courier New" w:hAnsi="Courier New" w:cs="Courier New"/>
+          <w:sz w:val="20"/>
+          <w:szCs w:val="20"/>
+          <w:lang w:val="en-US"/>
+        </w:rPr>
+      </w:pPr>
+      <w:r>
+        <w:rPr>
+          <w:rFonts w:ascii="Courier New" w:hAnsi="Courier New" w:cs="Courier New"/>
+          <w:sz w:val="20"/>
+          <w:szCs w:val="20"/>
+          <w:lang w:val="en-US"/>
+        </w:rPr>
+        <w:t xml:space="preserve">        cout &lt;&lt; "Порушено вимоги розташування проєкту! Запуск звукових сигналів..." &lt;&lt; endl;</w:t>
+      </w:r>
+    </w:p>
+    <w:p>
+      <w:pPr>
+        <w:rPr>
+          <w:rFonts w:ascii="Courier New" w:hAnsi="Courier New" w:cs="Courier New"/>
+          <w:sz w:val="20"/>
+          <w:szCs w:val="20"/>
+          <w:lang w:val="en-US"/>
+        </w:rPr>
+      </w:pPr>
+      <w:r>
+        <w:rPr>
+          <w:rFonts w:ascii="Courier New" w:hAnsi="Courier New" w:cs="Courier New"/>
+          <w:sz w:val="20"/>
+          <w:szCs w:val="20"/>
+          <w:lang w:val="en-US"/>
+        </w:rPr>
+        <w:t xml:space="preserve">        for (int i = 0; i &lt; 100; ++i) {</w:t>
+      </w:r>
+    </w:p>
+    <w:p>
+      <w:pPr>
+        <w:rPr>
+          <w:rFonts w:ascii="Courier New" w:hAnsi="Courier New" w:cs="Courier New"/>
+          <w:sz w:val="20"/>
+          <w:szCs w:val="20"/>
+          <w:lang w:val="en-US"/>
+        </w:rPr>
+      </w:pPr>
+      <w:r>
+        <w:rPr>
+          <w:rFonts w:ascii="Courier New" w:hAnsi="Courier New" w:cs="Courier New"/>
+          <w:sz w:val="20"/>
+          <w:szCs w:val="20"/>
+          <w:lang w:val="en-US"/>
+        </w:rPr>
+        <w:t xml:space="preserve">            Beep(1000, 150);</w:t>
+      </w:r>
+    </w:p>
+    <w:p>
+      <w:pPr>
+        <w:rPr>
+          <w:rFonts w:ascii="Courier New" w:hAnsi="Courier New" w:cs="Courier New"/>
+          <w:sz w:val="20"/>
+          <w:szCs w:val="20"/>
+          <w:lang w:val="en-US"/>
+        </w:rPr>
+      </w:pPr>
+      <w:r>
+        <w:rPr>
+          <w:rFonts w:ascii="Courier New" w:hAnsi="Courier New" w:cs="Courier New"/>
+          <w:sz w:val="20"/>
+          <w:szCs w:val="20"/>
+          <w:lang w:val="en-US"/>
+        </w:rPr>
+        <w:t xml:space="preserve">            Sleep(50);</w:t>
+      </w:r>
+    </w:p>
+    <w:p>
+      <w:pPr>
+        <w:rPr>
+          <w:rFonts w:ascii="Courier New" w:hAnsi="Courier New" w:cs="Courier New"/>
+          <w:sz w:val="20"/>
+          <w:szCs w:val="20"/>
+          <w:lang w:val="en-US"/>
+        </w:rPr>
+      </w:pPr>
+      <w:r>
+        <w:rPr>
+          <w:rFonts w:ascii="Courier New" w:hAnsi="Courier New" w:cs="Courier New"/>
+          <w:sz w:val="20"/>
+          <w:szCs w:val="20"/>
+          <w:lang w:val="en-US"/>
+        </w:rPr>
+        <w:t xml:space="preserve">        }</w:t>
+      </w:r>
+    </w:p>
+    <w:p>
+      <w:pPr>
+        <w:rPr>
+          <w:rFonts w:ascii="Courier New" w:hAnsi="Courier New" w:cs="Courier New"/>
+          <w:sz w:val="20"/>
+          <w:szCs w:val="20"/>
+          <w:lang w:val="en-US"/>
+        </w:rPr>
+      </w:pPr>
+      <w:r>
+        <w:rPr>
+          <w:rFonts w:ascii="Courier New" w:hAnsi="Courier New" w:cs="Courier New"/>
+          <w:sz w:val="20"/>
+          <w:szCs w:val="20"/>
+          <w:lang w:val="en-US"/>
+        </w:rPr>
+        <w:t xml:space="preserve">        return 0;</w:t>
+      </w:r>
+    </w:p>
+    <w:p>
+      <w:pPr>
+        <w:rPr>
+          <w:rFonts w:ascii="Courier New" w:hAnsi="Courier New" w:cs="Courier New"/>
+          <w:sz w:val="20"/>
+          <w:szCs w:val="20"/>
+          <w:lang w:val="en-US"/>
+        </w:rPr>
+      </w:pPr>
+      <w:r>
+        <w:rPr>
+          <w:rFonts w:ascii="Courier New" w:hAnsi="Courier New" w:cs="Courier New"/>
+          <w:sz w:val="20"/>
+          <w:szCs w:val="20"/>
+          <w:lang w:val="en-US"/>
+        </w:rPr>
+        <w:t xml:space="preserve">    }</w:t>
+      </w:r>
+    </w:p>
+    <w:p>
+      <w:pPr>
+        <w:rPr>
+          <w:rFonts w:ascii="Courier New" w:hAnsi="Courier New" w:cs="Courier New"/>
+          <w:sz w:val="20"/>
+          <w:szCs w:val="20"/>
+          <w:lang w:val="en-US"/>
+        </w:rPr>
+      </w:pPr>
+    </w:p>
+    <w:p>
+      <w:pPr>
+        <w:rPr>
+          <w:rFonts w:ascii="Courier New" w:hAnsi="Courier New" w:cs="Courier New"/>
+          <w:sz w:val="20"/>
+          <w:szCs w:val="20"/>
+          <w:lang w:val="en-US"/>
+        </w:rPr>
+      </w:pPr>
+      <w:r>
+        <w:rPr>
+          <w:rFonts w:ascii="Courier New" w:hAnsi="Courier New" w:cs="Courier New"/>
+          <w:sz w:val="20"/>
+          <w:szCs w:val="20"/>
+          <w:lang w:val="en-US"/>
+        </w:rPr>
+        <w:t xml:space="preserve">    cout &lt;&lt; "Перевірку шляху пройдено успішно. Починаємо Unit-тестування класу..." &lt;&lt; endl;</w:t>
+      </w:r>
+    </w:p>
+    <w:p>
+      <w:pPr>
+        <w:rPr>
+          <w:rFonts w:ascii="Courier New" w:hAnsi="Courier New" w:cs="Courier New"/>
+          <w:sz w:val="20"/>
+          <w:szCs w:val="20"/>
+          <w:lang w:val="en-US"/>
+        </w:rPr>
+      </w:pPr>
+      <w:r>
+        <w:rPr>
+          <w:rFonts w:ascii="Courier New" w:hAnsi="Courier New" w:cs="Courier New"/>
+          <w:sz w:val="20"/>
+          <w:szCs w:val="20"/>
+          <w:lang w:val="en-US"/>
+        </w:rPr>
+        <w:t xml:space="preserve">    ofstream logFile("../TestSuite/TestResults.txt");</w:t>
+      </w:r>
+    </w:p>
+    <w:p>
+      <w:pPr>
+        <w:rPr>
+          <w:rFonts w:ascii="Courier New" w:hAnsi="Courier New" w:cs="Courier New"/>
+          <w:sz w:val="20"/>
+          <w:szCs w:val="20"/>
+          <w:lang w:val="en-US"/>
+        </w:rPr>
+      </w:pPr>
+      <w:r>
+        <w:rPr>
+          <w:rFonts w:ascii="Courier New" w:hAnsi="Courier New" w:cs="Courier New"/>
+          <w:sz w:val="20"/>
+          <w:szCs w:val="20"/>
+          <w:lang w:val="en-US"/>
+        </w:rPr>
+        <w:t xml:space="preserve">    if (!logFile.is_open()) {</w:t>
+      </w:r>
+    </w:p>
+    <w:p>
+      <w:pPr>
+        <w:rPr>
+          <w:rFonts w:ascii="Courier New" w:hAnsi="Courier New" w:cs="Courier New"/>
+          <w:sz w:val="20"/>
+          <w:szCs w:val="20"/>
+          <w:lang w:val="en-US"/>
+        </w:rPr>
+      </w:pPr>
+      <w:r>
+        <w:rPr>
+          <w:rFonts w:ascii="Courier New" w:hAnsi="Courier New" w:cs="Courier New"/>
+          <w:sz w:val="20"/>
+          <w:szCs w:val="20"/>
+          <w:lang w:val="en-US"/>
+        </w:rPr>
+        <w:lastRenderedPageBreak/>
+        <w:t xml:space="preserve">        logFile.open("TestResults.txt");</w:t>
+      </w:r>
+    </w:p>
+    <w:p>
+      <w:pPr>
+        <w:rPr>
+          <w:rFonts w:ascii="Courier New" w:hAnsi="Courier New" w:cs="Courier New"/>
+          <w:sz w:val="20"/>
+          <w:szCs w:val="20"/>
+          <w:lang w:val="ru-RU"/>
+        </w:rPr>
+      </w:pPr>
+      <w:r>
+        <w:rPr>
+          <w:rFonts w:ascii="Courier New" w:hAnsi="Courier New" w:cs="Courier New"/>
+          <w:sz w:val="20"/>
+          <w:szCs w:val="20"/>
+          <w:lang w:val="en-US"/>
+        </w:rPr>
+        <w:t xml:space="preserve">    </w:t>
+      </w:r>
+      <w:r>
+        <w:rPr>
+          <w:rFonts w:ascii="Courier New" w:hAnsi="Courier New" w:cs="Courier New"/>
+          <w:sz w:val="20"/>
+          <w:szCs w:val="20"/>
+          <w:lang w:val="ru-RU"/>
+        </w:rPr>
+        <w:t>}</w:t>
+      </w:r>
+    </w:p>
+    <w:p>
+      <w:pPr>
+        <w:rPr>
+          <w:rFonts w:ascii="Courier New" w:hAnsi="Courier New" w:cs="Courier New"/>
+          <w:sz w:val="20"/>
+          <w:szCs w:val="20"/>
+          <w:lang w:val="ru-RU"/>
+        </w:rPr>
+      </w:pPr>
+    </w:p>
+    <w:p>
+      <w:pPr>
+        <w:rPr>
+          <w:rFonts w:ascii="Courier New" w:hAnsi="Courier New" w:cs="Courier New"/>
+          <w:sz w:val="20"/>
+          <w:szCs w:val="20"/>
+          <w:lang w:val="ru-RU"/>
+        </w:rPr>
+      </w:pPr>
+      <w:r>
+        <w:rPr>
+          <w:rFonts w:ascii="Courier New" w:hAnsi="Courier New" w:cs="Courier New"/>
+          <w:sz w:val="20"/>
+          <w:szCs w:val="20"/>
+          <w:lang w:val="ru-RU"/>
+        </w:rPr>
+        <w:t xml:space="preserve">    </w:t>
+      </w:r>
+      <w:r>
+        <w:rPr>
+          <w:rFonts w:ascii="Courier New" w:hAnsi="Courier New" w:cs="Courier New"/>
+          <w:sz w:val="20"/>
+          <w:szCs w:val="20"/>
+          <w:lang w:val="en-US"/>
+        </w:rPr>
+        <w:t>logFile</w:t>
+      </w:r>
+      <w:r>
+        <w:rPr>
+          <w:rFonts w:ascii="Courier New" w:hAnsi="Courier New" w:cs="Courier New"/>
+          <w:sz w:val="20"/>
+          <w:szCs w:val="20"/>
+          <w:lang w:val="ru-RU"/>
+        </w:rPr>
+        <w:t xml:space="preserve"> &lt;&lt; "=== ПРОТОКОЛ АВТОМАТИЗОВАНОГО ТЕСТУВАННЯ ===" &lt;&lt; </w:t>
+      </w:r>
+      <w:r>
+        <w:rPr>
+          <w:rFonts w:ascii="Courier New" w:hAnsi="Courier New" w:cs="Courier New"/>
+          <w:sz w:val="20"/>
+          <w:szCs w:val="20"/>
+          <w:lang w:val="en-US"/>
+        </w:rPr>
+        <w:t>endl</w:t>
+      </w:r>
+      <w:r>
+        <w:rPr>
+          <w:rFonts w:ascii="Courier New" w:hAnsi="Courier New" w:cs="Courier New"/>
+          <w:sz w:val="20"/>
+          <w:szCs w:val="20"/>
+          <w:lang w:val="ru-RU"/>
+        </w:rPr>
+        <w:t>;</w:t>
+      </w:r>
+    </w:p>
+    <w:p>
+      <w:pPr>
+        <w:rPr>
+          <w:rFonts w:ascii="Courier New" w:hAnsi="Courier New" w:cs="Courier New"/>
+          <w:sz w:val="20"/>
+          <w:szCs w:val="20"/>
+          <w:lang w:val="ru-RU"/>
+        </w:rPr>
+      </w:pPr>
+    </w:p>
+    <w:p>
+      <w:pPr>
+        <w:rPr>
+          <w:rFonts w:ascii="Courier New" w:hAnsi="Courier New" w:cs="Courier New"/>
+          <w:sz w:val="20"/>
+          <w:szCs w:val="20"/>
+          <w:lang w:val="en-US"/>
+        </w:rPr>
+      </w:pPr>
+      <w:r>
+        <w:rPr>
+          <w:rFonts w:ascii="Courier New" w:hAnsi="Courier New" w:cs="Courier New"/>
+          <w:sz w:val="20"/>
+          <w:szCs w:val="20"/>
+          <w:lang w:val="ru-RU"/>
+        </w:rPr>
+        <w:t xml:space="preserve">    </w:t>
+      </w:r>
+      <w:r>
+        <w:rPr>
+          <w:rFonts w:ascii="Courier New" w:hAnsi="Courier New" w:cs="Courier New"/>
+          <w:sz w:val="20"/>
+          <w:szCs w:val="20"/>
+          <w:lang w:val="en-US"/>
+        </w:rPr>
+        <w:t>class TestRunner {</w:t>
+      </w:r>
+    </w:p>
+    <w:p>
+      <w:pPr>
+        <w:rPr>
+          <w:rFonts w:ascii="Courier New" w:hAnsi="Courier New" w:cs="Courier New"/>
+          <w:sz w:val="20"/>
+          <w:szCs w:val="20"/>
+          <w:lang w:val="en-US"/>
+        </w:rPr>
+      </w:pPr>
+      <w:r>
+        <w:rPr>
+          <w:rFonts w:ascii="Courier New" w:hAnsi="Courier New" w:cs="Courier New"/>
+          <w:sz w:val="20"/>
+          <w:szCs w:val="20"/>
+          <w:lang w:val="en-US"/>
+        </w:rPr>
+        <w:t xml:space="preserve">    public:</w:t>
+      </w:r>
+    </w:p>
+    <w:p>
+      <w:pPr>
+        <w:rPr>
+          <w:rFonts w:ascii="Courier New" w:hAnsi="Courier New" w:cs="Courier New"/>
+          <w:sz w:val="20"/>
+          <w:szCs w:val="20"/>
+          <w:lang w:val="en-US"/>
+        </w:rPr>
+      </w:pPr>
+      <w:r>
+        <w:rPr>
+          <w:rFonts w:ascii="Courier New" w:hAnsi="Courier New" w:cs="Courier New"/>
+          <w:sz w:val="20"/>
+          <w:szCs w:val="20"/>
+          <w:lang w:val="en-US"/>
+        </w:rPr>
+        <w:t xml:space="preserve">        static void executeTestSuite(const string&amp; filename, ofstream&amp; log) {</w:t>
+      </w:r>
+    </w:p>
+    <w:p>
+      <w:pPr>
+        <w:rPr>
+          <w:rFonts w:ascii="Courier New" w:hAnsi="Courier New" w:cs="Courier New"/>
+          <w:sz w:val="20"/>
+          <w:szCs w:val="20"/>
+          <w:lang w:val="en-US"/>
+        </w:rPr>
+      </w:pPr>
+      <w:r>
+        <w:rPr>
+          <w:rFonts w:ascii="Courier New" w:hAnsi="Courier New" w:cs="Courier New"/>
+          <w:sz w:val="20"/>
+          <w:szCs w:val="20"/>
+          <w:lang w:val="en-US"/>
+        </w:rPr>
+        <w:t xml:space="preserve">            ifstream testFile(filename);</w:t>
+      </w:r>
+    </w:p>
+    <w:p>
+      <w:pPr>
+        <w:rPr>
+          <w:rFonts w:ascii="Courier New" w:hAnsi="Courier New" w:cs="Courier New"/>
+          <w:sz w:val="20"/>
+          <w:szCs w:val="20"/>
+          <w:lang w:val="en-US"/>
+        </w:rPr>
+      </w:pPr>
+      <w:r>
+        <w:rPr>
+          <w:rFonts w:ascii="Courier New" w:hAnsi="Courier New" w:cs="Courier New"/>
+          <w:sz w:val="20"/>
+          <w:szCs w:val="20"/>
+          <w:lang w:val="en-US"/>
+        </w:rPr>
+        <w:t xml:space="preserve">            if (!testFile.is_open()) {</w:t>
+      </w:r>
+    </w:p>
+    <w:p>
+      <w:pPr>
+        <w:rPr>
+          <w:rFonts w:ascii="Courier New" w:hAnsi="Courier New" w:cs="Courier New"/>
+          <w:sz w:val="20"/>
+          <w:szCs w:val="20"/>
+          <w:lang w:val="en-US"/>
+        </w:rPr>
+      </w:pPr>
+      <w:r>
+        <w:rPr>
+          <w:rFonts w:ascii="Courier New" w:hAnsi="Courier New" w:cs="Courier New"/>
+          <w:sz w:val="20"/>
+          <w:szCs w:val="20"/>
+          <w:lang w:val="en-US"/>
+        </w:rPr>
+        <w:t xml:space="preserve">                log &lt;&lt; "Помилка: Не вдалося відкрити файл тестів: " &lt;&lt; filename &lt;&lt; endl;</w:t>
+      </w:r>
+    </w:p>
+    <w:p>
+      <w:pPr>
+        <w:rPr>
+          <w:rFonts w:ascii="Courier New" w:hAnsi="Courier New" w:cs="Courier New"/>
+          <w:sz w:val="20"/>
+          <w:szCs w:val="20"/>
+          <w:lang w:val="en-US"/>
+        </w:rPr>
+      </w:pPr>
+      <w:r>
+        <w:rPr>
+          <w:rFonts w:ascii="Courier New" w:hAnsi="Courier New" w:cs="Courier New"/>
+          <w:sz w:val="20"/>
+          <w:szCs w:val="20"/>
+          <w:lang w:val="en-US"/>
+        </w:rPr>
+        <w:t xml:space="preserve">                cout</w:t>
+      </w:r>
+      <w:r>
+        <w:rPr>
+          <w:rFonts w:ascii="Courier New" w:hAnsi="Courier New" w:cs="Courier New"/>
+          <w:sz w:val="20"/>
+          <w:szCs w:val="20"/>
+          <w:lang w:val="ru-RU"/>
+        </w:rPr>
+        <w:t xml:space="preserve"> &lt;&lt; "Файл тестів не знайдено!" </w:t>
+      </w:r>
+      <w:r>
+        <w:rPr>
+          <w:rFonts w:ascii="Courier New" w:hAnsi="Courier New" w:cs="Courier New"/>
+          <w:sz w:val="20"/>
+          <w:szCs w:val="20"/>
+          <w:lang w:val="en-US"/>
+        </w:rPr>
+        <w:t>&lt;&lt; endl;</w:t>
+      </w:r>
+    </w:p>
+    <w:p>
+      <w:pPr>
+        <w:rPr>
+          <w:rFonts w:ascii="Courier New" w:hAnsi="Courier New" w:cs="Courier New"/>
+          <w:sz w:val="20"/>
+          <w:szCs w:val="20"/>
+          <w:lang w:val="en-US"/>
+        </w:rPr>
+      </w:pPr>
+      <w:r>
+        <w:rPr>
+          <w:rFonts w:ascii="Courier New" w:hAnsi="Courier New" w:cs="Courier New"/>
+          <w:sz w:val="20"/>
+          <w:szCs w:val="20"/>
+          <w:lang w:val="en-US"/>
+        </w:rPr>
+        <w:t xml:space="preserve">                return;</w:t>
+      </w:r>
+    </w:p>
+    <w:p>
+      <w:pPr>
+        <w:rPr>
+          <w:rFonts w:ascii="Courier New" w:hAnsi="Courier New" w:cs="Courier New"/>
+          <w:sz w:val="20"/>
+          <w:szCs w:val="20"/>
+          <w:lang w:val="en-US"/>
+        </w:rPr>
+      </w:pPr>
+      <w:r>
+        <w:rPr>
+          <w:rFonts w:ascii="Courier New" w:hAnsi="Courier New" w:cs="Courier New"/>
+          <w:sz w:val="20"/>
+          <w:szCs w:val="20"/>
+          <w:lang w:val="en-US"/>
+        </w:rPr>
+        <w:t xml:space="preserve">            }</w:t>
+      </w:r>
+    </w:p>
+    <w:p>
+      <w:pPr>
+        <w:rPr>
+          <w:rFonts w:ascii="Courier New" w:hAnsi="Courier New" w:cs="Courier New"/>
+          <w:sz w:val="20"/>
+          <w:szCs w:val="20"/>
+          <w:lang w:val="en-US"/>
+        </w:rPr>
+      </w:pPr>
+    </w:p>
+    <w:p>
+      <w:pPr>
+        <w:rPr>
+          <w:rFonts w:ascii="Courier New" w:hAnsi="Courier New" w:cs="Courier New"/>
+          <w:sz w:val="20"/>
+          <w:szCs w:val="20"/>
+          <w:lang w:val="en-US"/>
+        </w:rPr>
+      </w:pPr>
+      <w:r>
+        <w:rPr>
+          <w:rFonts w:ascii="Courier New" w:hAnsi="Courier New" w:cs="Courier New"/>
+          <w:sz w:val="20"/>
+          <w:szCs w:val="20"/>
+          <w:lang w:val="en-US"/>
+        </w:rPr>
+        <w:t xml:space="preserve">            string tc_id, delimiter;</w:t>
+      </w:r>
+    </w:p>
+    <w:p>
+      <w:pPr>
+        <w:rPr>
+          <w:rFonts w:ascii="Courier New" w:hAnsi="Courier New" w:cs="Courier New"/>
+          <w:sz w:val="20"/>
+          <w:szCs w:val="20"/>
+          <w:lang w:val="en-US"/>
+        </w:rPr>
+      </w:pPr>
+      <w:r>
+        <w:rPr>
+          <w:rFonts w:ascii="Courier New" w:hAnsi="Courier New" w:cs="Courier New"/>
+          <w:sz w:val="20"/>
+          <w:szCs w:val="20"/>
+          <w:lang w:val="en-US"/>
+        </w:rPr>
+        <w:t xml:space="preserve">            double a, b, h, expectedVolume;</w:t>
+      </w:r>
+    </w:p>
+    <w:p>
+      <w:pPr>
+        <w:rPr>
+          <w:rFonts w:ascii="Courier New" w:hAnsi="Courier New" w:cs="Courier New"/>
+          <w:sz w:val="20"/>
+          <w:szCs w:val="20"/>
+          <w:lang w:val="en-US"/>
+        </w:rPr>
+      </w:pPr>
+    </w:p>
+    <w:p>
+      <w:pPr>
+        <w:rPr>
+          <w:rFonts w:ascii="Courier New" w:hAnsi="Courier New" w:cs="Courier New"/>
+          <w:sz w:val="20"/>
+          <w:szCs w:val="20"/>
+          <w:lang w:val="en-US"/>
+        </w:rPr>
+      </w:pPr>
+      <w:r>
+        <w:rPr>
+          <w:rFonts w:ascii="Courier New" w:hAnsi="Courier New" w:cs="Courier New"/>
+          <w:sz w:val="20"/>
+          <w:szCs w:val="20"/>
+          <w:lang w:val="en-US"/>
+        </w:rPr>
+        <w:t xml:space="preserve">            while (testFile &gt;&gt; tc_id &gt;&gt; delimiter &gt;&gt; a &gt;&gt; b &gt;&gt; h &gt;&gt; delimiter &gt;&gt; expectedVolume) {</w:t>
+      </w:r>
+    </w:p>
+    <w:p>
+      <w:pPr>
+        <w:rPr>
+          <w:rFonts w:ascii="Courier New" w:hAnsi="Courier New" w:cs="Courier New"/>
+          <w:sz w:val="20"/>
+          <w:szCs w:val="20"/>
+          <w:lang w:val="en-US"/>
+        </w:rPr>
+      </w:pPr>
+      <w:r>
+        <w:rPr>
+          <w:rFonts w:ascii="Courier New" w:hAnsi="Courier New" w:cs="Courier New"/>
+          <w:sz w:val="20"/>
+          <w:szCs w:val="20"/>
+          <w:lang w:val="en-US"/>
+        </w:rPr>
+        <w:t xml:space="preserve">                ClassLab12_Nikolenko aquarium;</w:t>
+      </w:r>
+    </w:p>
+    <w:p>
+      <w:pPr>
+        <w:rPr>
+          <w:rFonts w:ascii="Courier New" w:hAnsi="Courier New" w:cs="Courier New"/>
+          <w:sz w:val="20"/>
+          <w:szCs w:val="20"/>
+          <w:lang w:val="en-US"/>
+        </w:rPr>
+      </w:pPr>
+      <w:r>
+        <w:rPr>
+          <w:rFonts w:ascii="Courier New" w:hAnsi="Courier New" w:cs="Courier New"/>
+          <w:sz w:val="20"/>
+          <w:szCs w:val="20"/>
+          <w:lang w:val="en-US"/>
+        </w:rPr>
+        <w:t xml:space="preserve">                aquarium.setA(a);</w:t>
+      </w:r>
+    </w:p>
+    <w:p>
+      <w:pPr>
+        <w:rPr>
+          <w:rFonts w:ascii="Courier New" w:hAnsi="Courier New" w:cs="Courier New"/>
+          <w:sz w:val="20"/>
+          <w:szCs w:val="20"/>
+          <w:lang w:val="en-US"/>
+        </w:rPr>
+      </w:pPr>
+      <w:r>
+        <w:rPr>
+          <w:rFonts w:ascii="Courier New" w:hAnsi="Courier New" w:cs="Courier New"/>
+          <w:sz w:val="20"/>
+          <w:szCs w:val="20"/>
+          <w:lang w:val="en-US"/>
+        </w:rPr>
+        <w:t xml:space="preserve">                aquarium.setB(b);</w:t>
+      </w:r>
+    </w:p>
+    <w:p>
+      <w:pPr>
+        <w:rPr>
+          <w:rFonts w:ascii="Courier New" w:hAnsi="Courier New" w:cs="Courier New"/>
+          <w:sz w:val="20"/>
+          <w:szCs w:val="20"/>
+          <w:lang w:val="en-US"/>
+        </w:rPr>
+      </w:pPr>
+      <w:r>
+        <w:rPr>
+          <w:rFonts w:ascii="Courier New" w:hAnsi="Courier New" w:cs="Courier New"/>
+          <w:sz w:val="20"/>
+          <w:szCs w:val="20"/>
+          <w:lang w:val="en-US"/>
+        </w:rPr>
+        <w:t xml:space="preserve">                aquarium.setH(h);</w:t>
+      </w:r>
+    </w:p>
+    <w:p>
+      <w:pPr>
+        <w:rPr>
+          <w:rFonts w:ascii="Courier New" w:hAnsi="Courier New" w:cs="Courier New"/>
+          <w:sz w:val="20"/>
+          <w:szCs w:val="20"/>
+          <w:lang w:val="en-US"/>
+        </w:rPr>
+      </w:pPr>
+    </w:p>
+    <w:p>
+      <w:pPr>
+        <w:rPr>
+          <w:rFonts w:ascii="Courier New" w:hAnsi="Courier New" w:cs="Courier New"/>
+          <w:sz w:val="20"/>
+          <w:szCs w:val="20"/>
+          <w:lang w:val="en-US"/>
+        </w:rPr>
+      </w:pPr>
+      <w:r>
+        <w:rPr>
+          <w:rFonts w:ascii="Courier New" w:hAnsi="Courier New" w:cs="Courier New"/>
+          <w:sz w:val="20"/>
+          <w:szCs w:val="20"/>
+          <w:lang w:val="en-US"/>
+        </w:rPr>
+        <w:t xml:space="preserve">                double actualVolume = aquarium.calculateVolume();</w:t>
+      </w:r>
+    </w:p>
+    <w:p>
+      <w:pPr>
+        <w:rPr>
+          <w:rFonts w:ascii="Courier New" w:hAnsi="Courier New" w:cs="Courier New"/>
+          <w:sz w:val="20"/>
+          <w:szCs w:val="20"/>
+          <w:lang w:val="en-US"/>
+        </w:rPr>
+      </w:pPr>
+    </w:p>
+    <w:p>
+      <w:pPr>
+        <w:rPr>
+          <w:rFonts w:ascii="Courier New" w:hAnsi="Courier New" w:cs="Courier New"/>
+          <w:sz w:val="20"/>
+          <w:szCs w:val="20"/>
+          <w:lang w:val="en-US"/>
+        </w:rPr>
+      </w:pPr>
+      <w:r>
+        <w:rPr>
+          <w:rFonts w:ascii="Courier New" w:hAnsi="Courier New" w:cs="Courier New"/>
+          <w:sz w:val="20"/>
+          <w:szCs w:val="20"/>
+          <w:lang w:val="en-US"/>
+        </w:rPr>
+        <w:t xml:space="preserve">                string result = (abs(actualVolume - expectedVolume) &lt; 0.0001) ? "PASSED" : "FAILED";</w:t>
+      </w:r>
+    </w:p>
+    <w:p>
+      <w:pPr>
+        <w:rPr>
+          <w:rFonts w:ascii="Courier New" w:hAnsi="Courier New" w:cs="Courier New"/>
+          <w:sz w:val="20"/>
+          <w:szCs w:val="20"/>
+          <w:lang w:val="en-US"/>
+        </w:rPr>
+      </w:pPr>
+    </w:p>
+    <w:p>
+      <w:pPr>
+        <w:rPr>
+          <w:rFonts w:ascii="Courier New" w:hAnsi="Courier New" w:cs="Courier New"/>
+          <w:sz w:val="20"/>
+          <w:szCs w:val="20"/>
+          <w:lang w:val="en-US"/>
+        </w:rPr>
+      </w:pPr>
+      <w:r>
+        <w:rPr>
+          <w:rFonts w:ascii="Courier New" w:hAnsi="Courier New" w:cs="Courier New"/>
+          <w:sz w:val="20"/>
+          <w:szCs w:val="20"/>
+          <w:lang w:val="en-US"/>
+        </w:rPr>
+        <w:t xml:space="preserve">                log &lt;&lt; tc_id &lt;&lt; " -&gt; Inputs: a=" &lt;&lt; a &lt;&lt; ", b=" &lt;&lt; b &lt;&lt; ", h=" &lt;&lt; h</w:t>
+      </w:r>
+    </w:p>
+    <w:p>
+      <w:pPr>
+        <w:rPr>
+          <w:rFonts w:ascii="Courier New" w:hAnsi="Courier New" w:cs="Courier New"/>
+          <w:sz w:val="20"/>
+          <w:szCs w:val="20"/>
+          <w:lang w:val="en-US"/>
+        </w:rPr>
+      </w:pPr>
+      <w:r>
+        <w:rPr>
+          <w:rFonts w:ascii="Courier New" w:hAnsi="Courier New" w:cs="Courier New"/>
+          <w:sz w:val="20"/>
+          <w:szCs w:val="20"/>
+          <w:lang w:val="en-US"/>
+        </w:rPr>
+        <w:t xml:space="preserve">                    &lt;&lt; " -&gt; Expected Volume: " &lt;&lt; expectedVolume</w:t>
+      </w:r>
+    </w:p>
+    <w:p>
+      <w:pPr>
+        <w:rPr>
+          <w:rFonts w:ascii="Courier New" w:hAnsi="Courier New" w:cs="Courier New"/>
+          <w:sz w:val="20"/>
+          <w:szCs w:val="20"/>
+          <w:lang w:val="en-US"/>
+        </w:rPr>
+      </w:pPr>
+      <w:r>
+        <w:rPr>
+          <w:rFonts w:ascii="Courier New" w:hAnsi="Courier New" w:cs="Courier New"/>
+          <w:sz w:val="20"/>
+          <w:szCs w:val="20"/>
+          <w:lang w:val="en-US"/>
+        </w:rPr>
+        <w:t xml:space="preserve">                    &lt;&lt; " -&gt; Actual Volume: " &lt;&lt; actualVolume</w:t>
+      </w:r>
+    </w:p>
+    <w:p>
+      <w:pPr>
+        <w:rPr>
+          <w:rFonts w:ascii="Courier New" w:hAnsi="Courier New" w:cs="Courier New"/>
+          <w:sz w:val="20"/>
+          <w:szCs w:val="20"/>
+          <w:lang w:val="en-US"/>
+        </w:rPr>
+      </w:pPr>
+      <w:r>
+        <w:rPr>
+          <w:rFonts w:ascii="Courier New" w:hAnsi="Courier New" w:cs="Courier New"/>
+          <w:sz w:val="20"/>
+          <w:szCs w:val="20"/>
+          <w:lang w:val="en-US"/>
+        </w:rPr>
+        <w:t xml:space="preserve">                    &lt;&lt; " -&gt; Result: " &lt;&lt; result &lt;&lt; endl;</w:t>
+      </w:r>
+    </w:p>
+    <w:p>
+      <w:pPr>
+        <w:rPr>
+          <w:rFonts w:ascii="Courier New" w:hAnsi="Courier New" w:cs="Courier New"/>
+          <w:sz w:val="20"/>
+          <w:szCs w:val="20"/>
+          <w:lang w:val="en-US"/>
+        </w:rPr>
+      </w:pPr>
+    </w:p>
+    <w:p>
+      <w:pPr>
+        <w:rPr>
+          <w:rFonts w:ascii="Courier New" w:hAnsi="Courier New" w:cs="Courier New"/>
+          <w:sz w:val="20"/>
+          <w:szCs w:val="20"/>
+          <w:lang w:val="en-US"/>
+        </w:rPr>
+      </w:pPr>
+      <w:r>
+        <w:rPr>
+          <w:rFonts w:ascii="Courier New" w:hAnsi="Courier New" w:cs="Courier New"/>
+          <w:sz w:val="20"/>
+          <w:szCs w:val="20"/>
+          <w:lang w:val="en-US"/>
+        </w:rPr>
+        <w:t xml:space="preserve">                cout &lt;&lt; tc_id &lt;&lt; ": " &lt;&lt; result &lt;&lt; endl;</w:t>
+      </w:r>
+    </w:p>
+    <w:p>
+      <w:pPr>
+        <w:rPr>
+          <w:rFonts w:ascii="Courier New" w:hAnsi="Courier New" w:cs="Courier New"/>
+          <w:sz w:val="20"/>
+          <w:szCs w:val="20"/>
+          <w:lang w:val="en-US"/>
+        </w:rPr>
+      </w:pPr>
+      <w:r>
+        <w:rPr>
+          <w:rFonts w:ascii="Courier New" w:hAnsi="Courier New" w:cs="Courier New"/>
+          <w:sz w:val="20"/>
+          <w:szCs w:val="20"/>
+          <w:lang w:val="en-US"/>
+        </w:rPr>
+        <w:t xml:space="preserve">            }</w:t>
+      </w:r>
+    </w:p>
+    <w:p>
+      <w:pPr>
+        <w:rPr>
+          <w:rFonts w:ascii="Courier New" w:hAnsi="Courier New" w:cs="Courier New"/>
+          <w:sz w:val="20"/>
+          <w:szCs w:val="20"/>
+          <w:lang w:val="en-US"/>
+        </w:rPr>
+      </w:pPr>
+      <w:r>
+        <w:rPr>
+          <w:rFonts w:ascii="Courier New" w:hAnsi="Courier New" w:cs="Courier New"/>
+          <w:sz w:val="20"/>
+          <w:szCs w:val="20"/>
+          <w:lang w:val="en-US"/>
+        </w:rPr>
+        <w:t xml:space="preserve">            testFile.close();</w:t>
+      </w:r>
+    </w:p>
+    <w:p>
+      <w:pPr>
+        <w:rPr>
+          <w:rFonts w:ascii="Courier New" w:hAnsi="Courier New" w:cs="Courier New"/>
+          <w:sz w:val="20"/>
+          <w:szCs w:val="20"/>
+          <w:lang w:val="en-US"/>
+        </w:rPr>
+      </w:pPr>
+      <w:r>
+        <w:rPr>
+          <w:rFonts w:ascii="Courier New" w:hAnsi="Courier New" w:cs="Courier New"/>
+          <w:sz w:val="20"/>
+          <w:szCs w:val="20"/>
+          <w:lang w:val="en-US"/>
+        </w:rPr>
+        <w:t xml:space="preserve">        }</w:t>
+      </w:r>
+    </w:p>
+    <w:p>
+      <w:pPr>
+        <w:rPr>
+          <w:rFonts w:ascii="Courier New" w:hAnsi="Courier New" w:cs="Courier New"/>
+          <w:sz w:val="20"/>
+          <w:szCs w:val="20"/>
+          <w:lang w:val="en-US"/>
+        </w:rPr>
+      </w:pPr>
+      <w:r>
+        <w:rPr>
+          <w:rFonts w:ascii="Courier New" w:hAnsi="Courier New" w:cs="Courier New"/>
+          <w:sz w:val="20"/>
+          <w:szCs w:val="20"/>
+          <w:lang w:val="en-US"/>
+        </w:rPr>
+        <w:t xml:space="preserve">    };</w:t>
+      </w:r>
+    </w:p>
+    <w:p>
+      <w:pPr>
+        <w:rPr>
+          <w:rFonts w:ascii="Courier New" w:hAnsi="Courier New" w:cs="Courier New"/>
+          <w:sz w:val="20"/>
+          <w:szCs w:val="20"/>
+          <w:lang w:val="en-US"/>
+        </w:rPr>
+      </w:pPr>
+      <w:r>
+        <w:rPr>
+          <w:rFonts w:ascii="Courier New" w:hAnsi="Courier New" w:cs="Courier New"/>
+          <w:sz w:val="20"/>
+          <w:szCs w:val="20"/>
+          <w:lang w:val="en-US"/>
+        </w:rPr>
+        <w:t xml:space="preserve">    TestRunner::executeTestSuite("../../TestSuite/test_suite_01.txt", logFile);</w:t>
+      </w:r>
+    </w:p>
+    <w:p>
+      <w:pPr>
+        <w:rPr>
+          <w:rFonts w:ascii="Courier New" w:hAnsi="Courier New" w:cs="Courier New"/>
+          <w:sz w:val="20"/>
+          <w:szCs w:val="20"/>
+          <w:lang w:val="en-US"/>
+        </w:rPr>
+      </w:pPr>
+    </w:p>
+    <w:p>
+      <w:pPr>
+        <w:rPr>
+          <w:rFonts w:ascii="Courier New" w:hAnsi="Courier New" w:cs="Courier New"/>
+          <w:sz w:val="20"/>
+          <w:szCs w:val="20"/>
+          <w:lang w:val="en-US"/>
+        </w:rPr>
+      </w:pPr>
+      <w:r>
+        <w:rPr>
+          <w:rFonts w:ascii="Courier New" w:hAnsi="Courier New" w:cs="Courier New"/>
+          <w:sz w:val="20"/>
+          <w:szCs w:val="20"/>
+          <w:lang w:val="en-US"/>
+        </w:rPr>
+        <w:t xml:space="preserve">    logFile &lt;&lt; "=== ТЕСТУВАННЯ ЗАВЕРШЕНО ===" &lt;&lt; endl;</w:t>
+      </w:r>
+    </w:p>
+    <w:p>
+      <w:pPr>
+        <w:rPr>
+          <w:rFonts w:ascii="Courier New" w:hAnsi="Courier New" w:cs="Courier New"/>
+          <w:sz w:val="20"/>
+          <w:szCs w:val="20"/>
+          <w:lang w:val="en-US"/>
+        </w:rPr>
+      </w:pPr>
+      <w:r>
+        <w:rPr>
+          <w:rFonts w:ascii="Courier New" w:hAnsi="Courier New" w:cs="Courier New"/>
+          <w:sz w:val="20"/>
+          <w:szCs w:val="20"/>
+          <w:lang w:val="en-US"/>
+        </w:rPr>
+        <w:t xml:space="preserve">    logFile.close();</w:t>
+      </w:r>
+    </w:p>
+    <w:p>
+      <w:pPr>
+        <w:rPr>
+          <w:rFonts w:ascii="Courier New" w:hAnsi="Courier New" w:cs="Courier New"/>
+          <w:sz w:val="20"/>
+          <w:szCs w:val="20"/>
+          <w:lang w:val="en-US"/>
+        </w:rPr>
+      </w:pPr>
+    </w:p>
+    <w:p>
+      <w:pPr>
+        <w:rPr>
+          <w:rFonts w:ascii="Courier New" w:hAnsi="Courier New" w:cs="Courier New"/>
+          <w:sz w:val="20"/>
+          <w:szCs w:val="20"/>
+          <w:lang w:val="ru-RU"/>
+        </w:rPr>
+      </w:pPr>
+      <w:r>
+        <w:rPr>
+          <w:rFonts w:ascii="Courier New" w:hAnsi="Courier New" w:cs="Courier New"/>
+          <w:sz w:val="20"/>
+          <w:szCs w:val="20"/>
+          <w:lang w:val="en-US"/>
+        </w:rPr>
+        <w:t xml:space="preserve">    cout</w:t>
+      </w:r>
+      <w:r>
+        <w:rPr>
+          <w:rFonts w:ascii="Courier New" w:hAnsi="Courier New" w:cs="Courier New"/>
+          <w:sz w:val="20"/>
+          <w:szCs w:val="20"/>
+          <w:lang w:val="ru-RU"/>
+        </w:rPr>
+        <w:t xml:space="preserve"> &lt;&lt; "Тестування успішно завершено! Результати записано в </w:t>
+      </w:r>
+      <w:r>
+        <w:rPr>
+          <w:rFonts w:ascii="Courier New" w:hAnsi="Courier New" w:cs="Courier New"/>
+          <w:sz w:val="20"/>
+          <w:szCs w:val="20"/>
+          <w:lang w:val="en-US"/>
+        </w:rPr>
+        <w:t>TestResults</w:t>
+      </w:r>
+      <w:r>
+        <w:rPr>
+          <w:rFonts w:ascii="Courier New" w:hAnsi="Courier New" w:cs="Courier New"/>
+          <w:sz w:val="20"/>
+          <w:szCs w:val="20"/>
+          <w:lang w:val="ru-RU"/>
+        </w:rPr>
+        <w:t>.</w:t>
+      </w:r>
+      <w:r>
+        <w:rPr>
+          <w:rFonts w:ascii="Courier New" w:hAnsi="Courier New" w:cs="Courier New"/>
+          <w:sz w:val="20"/>
+          <w:szCs w:val="20"/>
+          <w:lang w:val="en-US"/>
+        </w:rPr>
+        <w:t>txt</w:t>
+      </w:r>
+      <w:r>
+        <w:rPr>
+          <w:rFonts w:ascii="Courier New" w:hAnsi="Courier New" w:cs="Courier New"/>
+          <w:sz w:val="20"/>
+          <w:szCs w:val="20"/>
+          <w:lang w:val="ru-RU"/>
+        </w:rPr>
+        <w:t xml:space="preserve">" &lt;&lt; </w:t>
+      </w:r>
+      <w:r>
+        <w:rPr>
+          <w:rFonts w:ascii="Courier New" w:hAnsi="Courier New" w:cs="Courier New"/>
+          <w:sz w:val="20"/>
+          <w:szCs w:val="20"/>
+          <w:lang w:val="en-US"/>
+        </w:rPr>
+        <w:t>endl</w:t>
+      </w:r>
+      <w:r>
+        <w:rPr>
+          <w:rFonts w:ascii="Courier New" w:hAnsi="Courier New" w:cs="Courier New"/>
+          <w:sz w:val="20"/>
+          <w:szCs w:val="20"/>
+          <w:lang w:val="ru-RU"/>
+        </w:rPr>
+        <w:t>;</w:t>
+      </w:r>
+    </w:p>
+    <w:p>
+      <w:pPr>
+        <w:rPr>
+          <w:rFonts w:ascii="Courier New" w:hAnsi="Courier New" w:cs="Courier New"/>
+          <w:sz w:val="20"/>
+          <w:szCs w:val="20"/>
+          <w:lang w:val="en-US"/>
+        </w:rPr>
+      </w:pPr>
+      <w:r>
+        <w:rPr>
+          <w:rFonts w:ascii="Courier New" w:hAnsi="Courier New" w:cs="Courier New"/>
+          <w:sz w:val="20"/>
+          <w:szCs w:val="20"/>
+          <w:lang w:val="ru-RU"/>
+        </w:rPr>
+        <w:t xml:space="preserve">    </w:t>
+      </w:r>
+      <w:r>
+        <w:rPr>
+          <w:rFonts w:ascii="Courier New" w:hAnsi="Courier New" w:cs="Courier New"/>
+          <w:sz w:val="20"/>
+          <w:szCs w:val="20"/>
+          <w:lang w:val="en-US"/>
+        </w:rPr>
+        <w:t>return 0;</w:t>
+      </w:r>
+    </w:p>
+    <w:p>
+      <w:pPr>
+        <w:rPr>
+          <w:rFonts w:ascii="Courier New" w:hAnsi="Courier New" w:cs="Courier New"/>
+          <w:sz w:val="20"/>
+          <w:szCs w:val="20"/>
+          <w:lang w:val="en-US"/>
+        </w:rPr>
+      </w:pPr>
+      <w:r>
+        <w:rPr>
+          <w:rFonts w:ascii="Courier New" w:hAnsi="Courier New" w:cs="Courier New"/>
+          <w:sz w:val="20"/>
+          <w:szCs w:val="20"/>
+          <w:lang w:val="en-US"/>
+        </w:rPr>
+        <w:t>}</w:t>
+      </w:r>
     </w:p>
     <w:p>
       <w:pPr>

</xml_diff>

<commit_message>
Added 100 arguments to the Report
</commit_message>
<xml_diff>
--- a/lab12/Report/Report.docx
+++ b/lab12/Report/Report.docx
@@ -2209,14 +2209,6 @@
     <w:p>
       <w:pPr>
         <w:rPr>
-          <w:sz w:val="28"/>
-          <w:szCs w:val="28"/>
-        </w:rPr>
-      </w:pPr>
-    </w:p>
-    <w:p>
-      <w:pPr>
-        <w:rPr>
           <w:lang w:val="en-US"/>
         </w:rPr>
       </w:pPr>
@@ -3153,26 +3145,26 @@
           <w:szCs w:val="20"/>
           <w:lang w:val="en-US"/>
         </w:rPr>
+        <w:t xml:space="preserve">        sideH = h;</w:t>
+      </w:r>
+    </w:p>
+    <w:p>
+      <w:pPr>
+        <w:rPr>
+          <w:rFonts w:ascii="Courier New" w:hAnsi="Courier New" w:cs="Courier New"/>
+          <w:sz w:val="20"/>
+          <w:szCs w:val="20"/>
+          <w:lang w:val="en-US"/>
+        </w:rPr>
+      </w:pPr>
+      <w:r>
+        <w:rPr>
+          <w:rFonts w:ascii="Courier New" w:hAnsi="Courier New" w:cs="Courier New"/>
+          <w:sz w:val="20"/>
+          <w:szCs w:val="20"/>
+          <w:lang w:val="en-US"/>
+        </w:rPr>
         <w:lastRenderedPageBreak/>
-        <w:t xml:space="preserve">        sideH = h;</w:t>
-      </w:r>
-    </w:p>
-    <w:p>
-      <w:pPr>
-        <w:rPr>
-          <w:rFonts w:ascii="Courier New" w:hAnsi="Courier New" w:cs="Courier New"/>
-          <w:sz w:val="20"/>
-          <w:szCs w:val="20"/>
-          <w:lang w:val="en-US"/>
-        </w:rPr>
-      </w:pPr>
-      <w:r>
-        <w:rPr>
-          <w:rFonts w:ascii="Courier New" w:hAnsi="Courier New" w:cs="Courier New"/>
-          <w:sz w:val="20"/>
-          <w:szCs w:val="20"/>
-          <w:lang w:val="en-US"/>
-        </w:rPr>
         <w:t xml:space="preserve">    } else {</w:t>
       </w:r>
     </w:p>
@@ -3772,7 +3764,6 @@
           <w:sz w:val="28"/>
           <w:szCs w:val="28"/>
         </w:rPr>
-        <w:lastRenderedPageBreak/>
         <w:t>Unit-тестування:</w:t>
       </w:r>
       <w:r>
@@ -3807,6 +3798,7 @@
           <w:sz w:val="28"/>
           <w:szCs w:val="28"/>
         </w:rPr>
+        <w:lastRenderedPageBreak/>
         <w:t>ПУНКТ 8. Текстовий формат тест-кейса та протокол його читання</w:t>
       </w:r>
     </w:p>
@@ -4585,7 +4577,6 @@
           <w:sz w:val="28"/>
           <w:szCs w:val="28"/>
         </w:rPr>
-        <w:lastRenderedPageBreak/>
         <w:t>Нефункциональні вимоги:</w:t>
       </w:r>
     </w:p>
@@ -4663,6 +4654,7 @@
           <w:sz w:val="28"/>
           <w:szCs w:val="28"/>
         </w:rPr>
+        <w:lastRenderedPageBreak/>
         <w:t>Локалізація: повна підтримка відображення українського тексту в консолі Windows без деформації символів (за допомогою кодування UTF-8).</w:t>
       </w:r>
     </w:p>
@@ -5129,6 +5121,7 @@
         <w:rPr>
           <w:lang w:val="ru-RU"/>
         </w:rPr>
+        <w:lastRenderedPageBreak/>
         <w:t>Текстовий тест-кейс для тестування</w:t>
       </w:r>
       <w:r>
@@ -5987,25 +5980,887 @@
           <w:szCs w:val="20"/>
           <w:lang w:val="en-US"/>
         </w:rPr>
+        <w:t xml:space="preserve">        logFile.open("TestResults.txt");</w:t>
+      </w:r>
+    </w:p>
+    <w:p>
+      <w:pPr>
+        <w:rPr>
+          <w:rFonts w:ascii="Courier New" w:hAnsi="Courier New" w:cs="Courier New"/>
+          <w:sz w:val="20"/>
+          <w:szCs w:val="20"/>
+          <w:lang w:val="ru-RU"/>
+        </w:rPr>
+      </w:pPr>
+      <w:r>
+        <w:rPr>
+          <w:rFonts w:ascii="Courier New" w:hAnsi="Courier New" w:cs="Courier New"/>
+          <w:sz w:val="20"/>
+          <w:szCs w:val="20"/>
+          <w:lang w:val="en-US"/>
+        </w:rPr>
+        <w:t xml:space="preserve">    </w:t>
+      </w:r>
+      <w:r>
+        <w:rPr>
+          <w:rFonts w:ascii="Courier New" w:hAnsi="Courier New" w:cs="Courier New"/>
+          <w:sz w:val="20"/>
+          <w:szCs w:val="20"/>
+          <w:lang w:val="ru-RU"/>
+        </w:rPr>
+        <w:t>}</w:t>
+      </w:r>
+    </w:p>
+    <w:p>
+      <w:pPr>
+        <w:rPr>
+          <w:rFonts w:ascii="Courier New" w:hAnsi="Courier New" w:cs="Courier New"/>
+          <w:sz w:val="20"/>
+          <w:szCs w:val="20"/>
+          <w:lang w:val="ru-RU"/>
+        </w:rPr>
+      </w:pPr>
+    </w:p>
+    <w:p>
+      <w:pPr>
+        <w:rPr>
+          <w:rFonts w:ascii="Courier New" w:hAnsi="Courier New" w:cs="Courier New"/>
+          <w:sz w:val="20"/>
+          <w:szCs w:val="20"/>
+          <w:lang w:val="ru-RU"/>
+        </w:rPr>
+      </w:pPr>
+      <w:r>
+        <w:rPr>
+          <w:rFonts w:ascii="Courier New" w:hAnsi="Courier New" w:cs="Courier New"/>
+          <w:sz w:val="20"/>
+          <w:szCs w:val="20"/>
+          <w:lang w:val="ru-RU"/>
+        </w:rPr>
+        <w:t xml:space="preserve">    </w:t>
+      </w:r>
+      <w:r>
+        <w:rPr>
+          <w:rFonts w:ascii="Courier New" w:hAnsi="Courier New" w:cs="Courier New"/>
+          <w:sz w:val="20"/>
+          <w:szCs w:val="20"/>
+          <w:lang w:val="en-US"/>
+        </w:rPr>
+        <w:t>logFile</w:t>
+      </w:r>
+      <w:r>
+        <w:rPr>
+          <w:rFonts w:ascii="Courier New" w:hAnsi="Courier New" w:cs="Courier New"/>
+          <w:sz w:val="20"/>
+          <w:szCs w:val="20"/>
+          <w:lang w:val="ru-RU"/>
+        </w:rPr>
+        <w:t xml:space="preserve"> &lt;&lt; "=== ПРОТОКОЛ АВТОМАТИЗОВАНОГО ТЕСТУВАННЯ ===" &lt;&lt; </w:t>
+      </w:r>
+      <w:r>
+        <w:rPr>
+          <w:rFonts w:ascii="Courier New" w:hAnsi="Courier New" w:cs="Courier New"/>
+          <w:sz w:val="20"/>
+          <w:szCs w:val="20"/>
+          <w:lang w:val="en-US"/>
+        </w:rPr>
+        <w:t>endl</w:t>
+      </w:r>
+      <w:r>
+        <w:rPr>
+          <w:rFonts w:ascii="Courier New" w:hAnsi="Courier New" w:cs="Courier New"/>
+          <w:sz w:val="20"/>
+          <w:szCs w:val="20"/>
+          <w:lang w:val="ru-RU"/>
+        </w:rPr>
+        <w:t>;</w:t>
+      </w:r>
+    </w:p>
+    <w:p>
+      <w:pPr>
+        <w:rPr>
+          <w:rFonts w:ascii="Courier New" w:hAnsi="Courier New" w:cs="Courier New"/>
+          <w:sz w:val="20"/>
+          <w:szCs w:val="20"/>
+          <w:lang w:val="ru-RU"/>
+        </w:rPr>
+      </w:pPr>
+    </w:p>
+    <w:p>
+      <w:pPr>
+        <w:rPr>
+          <w:rFonts w:ascii="Courier New" w:hAnsi="Courier New" w:cs="Courier New"/>
+          <w:sz w:val="20"/>
+          <w:szCs w:val="20"/>
+          <w:lang w:val="en-US"/>
+        </w:rPr>
+      </w:pPr>
+      <w:r>
+        <w:rPr>
+          <w:rFonts w:ascii="Courier New" w:hAnsi="Courier New" w:cs="Courier New"/>
+          <w:sz w:val="20"/>
+          <w:szCs w:val="20"/>
+          <w:lang w:val="ru-RU"/>
+        </w:rPr>
+        <w:t xml:space="preserve">    </w:t>
+      </w:r>
+      <w:r>
+        <w:rPr>
+          <w:rFonts w:ascii="Courier New" w:hAnsi="Courier New" w:cs="Courier New"/>
+          <w:sz w:val="20"/>
+          <w:szCs w:val="20"/>
+          <w:lang w:val="en-US"/>
+        </w:rPr>
+        <w:t>class TestRunner {</w:t>
+      </w:r>
+    </w:p>
+    <w:p>
+      <w:pPr>
+        <w:rPr>
+          <w:rFonts w:ascii="Courier New" w:hAnsi="Courier New" w:cs="Courier New"/>
+          <w:sz w:val="20"/>
+          <w:szCs w:val="20"/>
+          <w:lang w:val="en-US"/>
+        </w:rPr>
+      </w:pPr>
+      <w:r>
+        <w:rPr>
+          <w:rFonts w:ascii="Courier New" w:hAnsi="Courier New" w:cs="Courier New"/>
+          <w:sz w:val="20"/>
+          <w:szCs w:val="20"/>
+          <w:lang w:val="en-US"/>
+        </w:rPr>
         <w:lastRenderedPageBreak/>
-        <w:t xml:space="preserve">        logFile.open("TestResults.txt");</w:t>
-      </w:r>
-    </w:p>
-    <w:p>
-      <w:pPr>
+        <w:t xml:space="preserve">    public:</w:t>
+      </w:r>
+    </w:p>
+    <w:p>
+      <w:pPr>
+        <w:rPr>
+          <w:rFonts w:ascii="Courier New" w:hAnsi="Courier New" w:cs="Courier New"/>
+          <w:sz w:val="20"/>
+          <w:szCs w:val="20"/>
+          <w:lang w:val="en-US"/>
+        </w:rPr>
+      </w:pPr>
+      <w:r>
+        <w:rPr>
+          <w:rFonts w:ascii="Courier New" w:hAnsi="Courier New" w:cs="Courier New"/>
+          <w:sz w:val="20"/>
+          <w:szCs w:val="20"/>
+          <w:lang w:val="en-US"/>
+        </w:rPr>
+        <w:t xml:space="preserve">        static void executeTestSuite(const string&amp; filename, ofstream&amp; log) {</w:t>
+      </w:r>
+    </w:p>
+    <w:p>
+      <w:pPr>
+        <w:rPr>
+          <w:rFonts w:ascii="Courier New" w:hAnsi="Courier New" w:cs="Courier New"/>
+          <w:sz w:val="20"/>
+          <w:szCs w:val="20"/>
+          <w:lang w:val="en-US"/>
+        </w:rPr>
+      </w:pPr>
+      <w:r>
+        <w:rPr>
+          <w:rFonts w:ascii="Courier New" w:hAnsi="Courier New" w:cs="Courier New"/>
+          <w:sz w:val="20"/>
+          <w:szCs w:val="20"/>
+          <w:lang w:val="en-US"/>
+        </w:rPr>
+        <w:t xml:space="preserve">            ifstream testFile(filename);</w:t>
+      </w:r>
+    </w:p>
+    <w:p>
+      <w:pPr>
+        <w:rPr>
+          <w:rFonts w:ascii="Courier New" w:hAnsi="Courier New" w:cs="Courier New"/>
+          <w:sz w:val="20"/>
+          <w:szCs w:val="20"/>
+          <w:lang w:val="en-US"/>
+        </w:rPr>
+      </w:pPr>
+      <w:r>
+        <w:rPr>
+          <w:rFonts w:ascii="Courier New" w:hAnsi="Courier New" w:cs="Courier New"/>
+          <w:sz w:val="20"/>
+          <w:szCs w:val="20"/>
+          <w:lang w:val="en-US"/>
+        </w:rPr>
+        <w:t xml:space="preserve">            if (!testFile.is_open()) {</w:t>
+      </w:r>
+    </w:p>
+    <w:p>
+      <w:pPr>
+        <w:rPr>
+          <w:rFonts w:ascii="Courier New" w:hAnsi="Courier New" w:cs="Courier New"/>
+          <w:sz w:val="20"/>
+          <w:szCs w:val="20"/>
+          <w:lang w:val="en-US"/>
+        </w:rPr>
+      </w:pPr>
+      <w:r>
+        <w:rPr>
+          <w:rFonts w:ascii="Courier New" w:hAnsi="Courier New" w:cs="Courier New"/>
+          <w:sz w:val="20"/>
+          <w:szCs w:val="20"/>
+          <w:lang w:val="en-US"/>
+        </w:rPr>
+        <w:t xml:space="preserve">                log &lt;&lt; "Помилка: Не вдалося відкрити файл тестів: " &lt;&lt; filename &lt;&lt; endl;</w:t>
+      </w:r>
+    </w:p>
+    <w:p>
+      <w:pPr>
+        <w:rPr>
+          <w:rFonts w:ascii="Courier New" w:hAnsi="Courier New" w:cs="Courier New"/>
+          <w:sz w:val="20"/>
+          <w:szCs w:val="20"/>
+          <w:lang w:val="en-US"/>
+        </w:rPr>
+      </w:pPr>
+      <w:r>
+        <w:rPr>
+          <w:rFonts w:ascii="Courier New" w:hAnsi="Courier New" w:cs="Courier New"/>
+          <w:sz w:val="20"/>
+          <w:szCs w:val="20"/>
+          <w:lang w:val="en-US"/>
+        </w:rPr>
+        <w:t xml:space="preserve">                cout</w:t>
+      </w:r>
+      <w:r>
         <w:rPr>
           <w:rFonts w:ascii="Courier New" w:hAnsi="Courier New" w:cs="Courier New"/>
           <w:sz w:val="20"/>
           <w:szCs w:val="20"/>
           <w:lang w:val="ru-RU"/>
         </w:rPr>
-      </w:pPr>
-      <w:r>
-        <w:rPr>
-          <w:rFonts w:ascii="Courier New" w:hAnsi="Courier New" w:cs="Courier New"/>
-          <w:sz w:val="20"/>
-          <w:szCs w:val="20"/>
-          <w:lang w:val="en-US"/>
+        <w:t xml:space="preserve"> &lt;&lt; "Файл тестів не знайдено!" </w:t>
+      </w:r>
+      <w:r>
+        <w:rPr>
+          <w:rFonts w:ascii="Courier New" w:hAnsi="Courier New" w:cs="Courier New"/>
+          <w:sz w:val="20"/>
+          <w:szCs w:val="20"/>
+          <w:lang w:val="en-US"/>
+        </w:rPr>
+        <w:t>&lt;&lt; endl;</w:t>
+      </w:r>
+    </w:p>
+    <w:p>
+      <w:pPr>
+        <w:rPr>
+          <w:rFonts w:ascii="Courier New" w:hAnsi="Courier New" w:cs="Courier New"/>
+          <w:sz w:val="20"/>
+          <w:szCs w:val="20"/>
+          <w:lang w:val="en-US"/>
+        </w:rPr>
+      </w:pPr>
+      <w:r>
+        <w:rPr>
+          <w:rFonts w:ascii="Courier New" w:hAnsi="Courier New" w:cs="Courier New"/>
+          <w:sz w:val="20"/>
+          <w:szCs w:val="20"/>
+          <w:lang w:val="en-US"/>
+        </w:rPr>
+        <w:t xml:space="preserve">                return;</w:t>
+      </w:r>
+    </w:p>
+    <w:p>
+      <w:pPr>
+        <w:rPr>
+          <w:rFonts w:ascii="Courier New" w:hAnsi="Courier New" w:cs="Courier New"/>
+          <w:sz w:val="20"/>
+          <w:szCs w:val="20"/>
+          <w:lang w:val="en-US"/>
+        </w:rPr>
+      </w:pPr>
+      <w:r>
+        <w:rPr>
+          <w:rFonts w:ascii="Courier New" w:hAnsi="Courier New" w:cs="Courier New"/>
+          <w:sz w:val="20"/>
+          <w:szCs w:val="20"/>
+          <w:lang w:val="en-US"/>
+        </w:rPr>
+        <w:t xml:space="preserve">            }</w:t>
+      </w:r>
+    </w:p>
+    <w:p>
+      <w:pPr>
+        <w:rPr>
+          <w:rFonts w:ascii="Courier New" w:hAnsi="Courier New" w:cs="Courier New"/>
+          <w:sz w:val="20"/>
+          <w:szCs w:val="20"/>
+          <w:lang w:val="en-US"/>
+        </w:rPr>
+      </w:pPr>
+    </w:p>
+    <w:p>
+      <w:pPr>
+        <w:rPr>
+          <w:rFonts w:ascii="Courier New" w:hAnsi="Courier New" w:cs="Courier New"/>
+          <w:sz w:val="20"/>
+          <w:szCs w:val="20"/>
+          <w:lang w:val="en-US"/>
+        </w:rPr>
+      </w:pPr>
+      <w:r>
+        <w:rPr>
+          <w:rFonts w:ascii="Courier New" w:hAnsi="Courier New" w:cs="Courier New"/>
+          <w:sz w:val="20"/>
+          <w:szCs w:val="20"/>
+          <w:lang w:val="en-US"/>
+        </w:rPr>
+        <w:t xml:space="preserve">            string tc_id, delimiter;</w:t>
+      </w:r>
+    </w:p>
+    <w:p>
+      <w:pPr>
+        <w:rPr>
+          <w:rFonts w:ascii="Courier New" w:hAnsi="Courier New" w:cs="Courier New"/>
+          <w:sz w:val="20"/>
+          <w:szCs w:val="20"/>
+          <w:lang w:val="en-US"/>
+        </w:rPr>
+      </w:pPr>
+      <w:r>
+        <w:rPr>
+          <w:rFonts w:ascii="Courier New" w:hAnsi="Courier New" w:cs="Courier New"/>
+          <w:sz w:val="20"/>
+          <w:szCs w:val="20"/>
+          <w:lang w:val="en-US"/>
+        </w:rPr>
+        <w:t xml:space="preserve">            double a, b, h, expectedVolume;</w:t>
+      </w:r>
+    </w:p>
+    <w:p>
+      <w:pPr>
+        <w:rPr>
+          <w:rFonts w:ascii="Courier New" w:hAnsi="Courier New" w:cs="Courier New"/>
+          <w:sz w:val="20"/>
+          <w:szCs w:val="20"/>
+          <w:lang w:val="en-US"/>
+        </w:rPr>
+      </w:pPr>
+    </w:p>
+    <w:p>
+      <w:pPr>
+        <w:rPr>
+          <w:rFonts w:ascii="Courier New" w:hAnsi="Courier New" w:cs="Courier New"/>
+          <w:sz w:val="20"/>
+          <w:szCs w:val="20"/>
+          <w:lang w:val="en-US"/>
+        </w:rPr>
+      </w:pPr>
+      <w:r>
+        <w:rPr>
+          <w:rFonts w:ascii="Courier New" w:hAnsi="Courier New" w:cs="Courier New"/>
+          <w:sz w:val="20"/>
+          <w:szCs w:val="20"/>
+          <w:lang w:val="en-US"/>
+        </w:rPr>
+        <w:t xml:space="preserve">            while (testFile &gt;&gt; tc_id &gt;&gt; delimiter &gt;&gt; a &gt;&gt; b &gt;&gt; h &gt;&gt; delimiter &gt;&gt; expectedVolume) {</w:t>
+      </w:r>
+    </w:p>
+    <w:p>
+      <w:pPr>
+        <w:rPr>
+          <w:rFonts w:ascii="Courier New" w:hAnsi="Courier New" w:cs="Courier New"/>
+          <w:sz w:val="20"/>
+          <w:szCs w:val="20"/>
+          <w:lang w:val="en-US"/>
+        </w:rPr>
+      </w:pPr>
+      <w:r>
+        <w:rPr>
+          <w:rFonts w:ascii="Courier New" w:hAnsi="Courier New" w:cs="Courier New"/>
+          <w:sz w:val="20"/>
+          <w:szCs w:val="20"/>
+          <w:lang w:val="en-US"/>
+        </w:rPr>
+        <w:t xml:space="preserve">                ClassLab12_Nikolenko aquarium;</w:t>
+      </w:r>
+    </w:p>
+    <w:p>
+      <w:pPr>
+        <w:rPr>
+          <w:rFonts w:ascii="Courier New" w:hAnsi="Courier New" w:cs="Courier New"/>
+          <w:sz w:val="20"/>
+          <w:szCs w:val="20"/>
+          <w:lang w:val="en-US"/>
+        </w:rPr>
+      </w:pPr>
+      <w:r>
+        <w:rPr>
+          <w:rFonts w:ascii="Courier New" w:hAnsi="Courier New" w:cs="Courier New"/>
+          <w:sz w:val="20"/>
+          <w:szCs w:val="20"/>
+          <w:lang w:val="en-US"/>
+        </w:rPr>
+        <w:t xml:space="preserve">                aquarium.setA(a);</w:t>
+      </w:r>
+    </w:p>
+    <w:p>
+      <w:pPr>
+        <w:rPr>
+          <w:rFonts w:ascii="Courier New" w:hAnsi="Courier New" w:cs="Courier New"/>
+          <w:sz w:val="20"/>
+          <w:szCs w:val="20"/>
+          <w:lang w:val="en-US"/>
+        </w:rPr>
+      </w:pPr>
+      <w:r>
+        <w:rPr>
+          <w:rFonts w:ascii="Courier New" w:hAnsi="Courier New" w:cs="Courier New"/>
+          <w:sz w:val="20"/>
+          <w:szCs w:val="20"/>
+          <w:lang w:val="en-US"/>
+        </w:rPr>
+        <w:t xml:space="preserve">                aquarium.setB(b);</w:t>
+      </w:r>
+    </w:p>
+    <w:p>
+      <w:pPr>
+        <w:rPr>
+          <w:rFonts w:ascii="Courier New" w:hAnsi="Courier New" w:cs="Courier New"/>
+          <w:sz w:val="20"/>
+          <w:szCs w:val="20"/>
+          <w:lang w:val="en-US"/>
+        </w:rPr>
+      </w:pPr>
+      <w:r>
+        <w:rPr>
+          <w:rFonts w:ascii="Courier New" w:hAnsi="Courier New" w:cs="Courier New"/>
+          <w:sz w:val="20"/>
+          <w:szCs w:val="20"/>
+          <w:lang w:val="en-US"/>
+        </w:rPr>
+        <w:t xml:space="preserve">                aquarium.setH(h);</w:t>
+      </w:r>
+    </w:p>
+    <w:p>
+      <w:pPr>
+        <w:rPr>
+          <w:rFonts w:ascii="Courier New" w:hAnsi="Courier New" w:cs="Courier New"/>
+          <w:sz w:val="20"/>
+          <w:szCs w:val="20"/>
+          <w:lang w:val="en-US"/>
+        </w:rPr>
+      </w:pPr>
+    </w:p>
+    <w:p>
+      <w:pPr>
+        <w:rPr>
+          <w:rFonts w:ascii="Courier New" w:hAnsi="Courier New" w:cs="Courier New"/>
+          <w:sz w:val="20"/>
+          <w:szCs w:val="20"/>
+          <w:lang w:val="en-US"/>
+        </w:rPr>
+      </w:pPr>
+      <w:r>
+        <w:rPr>
+          <w:rFonts w:ascii="Courier New" w:hAnsi="Courier New" w:cs="Courier New"/>
+          <w:sz w:val="20"/>
+          <w:szCs w:val="20"/>
+          <w:lang w:val="en-US"/>
+        </w:rPr>
+        <w:t xml:space="preserve">                double actualVolume = aquarium.calculateVolume();</w:t>
+      </w:r>
+    </w:p>
+    <w:p>
+      <w:pPr>
+        <w:rPr>
+          <w:rFonts w:ascii="Courier New" w:hAnsi="Courier New" w:cs="Courier New"/>
+          <w:sz w:val="20"/>
+          <w:szCs w:val="20"/>
+          <w:lang w:val="en-US"/>
+        </w:rPr>
+      </w:pPr>
+    </w:p>
+    <w:p>
+      <w:pPr>
+        <w:rPr>
+          <w:rFonts w:ascii="Courier New" w:hAnsi="Courier New" w:cs="Courier New"/>
+          <w:sz w:val="20"/>
+          <w:szCs w:val="20"/>
+          <w:lang w:val="en-US"/>
+        </w:rPr>
+      </w:pPr>
+      <w:r>
+        <w:rPr>
+          <w:rFonts w:ascii="Courier New" w:hAnsi="Courier New" w:cs="Courier New"/>
+          <w:sz w:val="20"/>
+          <w:szCs w:val="20"/>
+          <w:lang w:val="en-US"/>
+        </w:rPr>
+        <w:t xml:space="preserve">                string result = (abs(actualVolume - expectedVolume) &lt; 0.0001) ? "PASSED" : "FAILED";</w:t>
+      </w:r>
+    </w:p>
+    <w:p>
+      <w:pPr>
+        <w:rPr>
+          <w:rFonts w:ascii="Courier New" w:hAnsi="Courier New" w:cs="Courier New"/>
+          <w:sz w:val="20"/>
+          <w:szCs w:val="20"/>
+          <w:lang w:val="en-US"/>
+        </w:rPr>
+      </w:pPr>
+    </w:p>
+    <w:p>
+      <w:pPr>
+        <w:rPr>
+          <w:rFonts w:ascii="Courier New" w:hAnsi="Courier New" w:cs="Courier New"/>
+          <w:sz w:val="20"/>
+          <w:szCs w:val="20"/>
+          <w:lang w:val="en-US"/>
+        </w:rPr>
+      </w:pPr>
+      <w:r>
+        <w:rPr>
+          <w:rFonts w:ascii="Courier New" w:hAnsi="Courier New" w:cs="Courier New"/>
+          <w:sz w:val="20"/>
+          <w:szCs w:val="20"/>
+          <w:lang w:val="en-US"/>
+        </w:rPr>
+        <w:t xml:space="preserve">                log &lt;&lt; tc_id &lt;&lt; " -&gt; Inputs: a=" &lt;&lt; a &lt;&lt; ", b=" &lt;&lt; b &lt;&lt; ", h=" &lt;&lt; h</w:t>
+      </w:r>
+    </w:p>
+    <w:p>
+      <w:pPr>
+        <w:rPr>
+          <w:rFonts w:ascii="Courier New" w:hAnsi="Courier New" w:cs="Courier New"/>
+          <w:sz w:val="20"/>
+          <w:szCs w:val="20"/>
+          <w:lang w:val="en-US"/>
+        </w:rPr>
+      </w:pPr>
+      <w:r>
+        <w:rPr>
+          <w:rFonts w:ascii="Courier New" w:hAnsi="Courier New" w:cs="Courier New"/>
+          <w:sz w:val="20"/>
+          <w:szCs w:val="20"/>
+          <w:lang w:val="en-US"/>
+        </w:rPr>
+        <w:t xml:space="preserve">                    &lt;&lt; " -&gt; Expected Volume: " &lt;&lt; expectedVolume</w:t>
+      </w:r>
+    </w:p>
+    <w:p>
+      <w:pPr>
+        <w:rPr>
+          <w:rFonts w:ascii="Courier New" w:hAnsi="Courier New" w:cs="Courier New"/>
+          <w:sz w:val="20"/>
+          <w:szCs w:val="20"/>
+          <w:lang w:val="en-US"/>
+        </w:rPr>
+      </w:pPr>
+      <w:r>
+        <w:rPr>
+          <w:rFonts w:ascii="Courier New" w:hAnsi="Courier New" w:cs="Courier New"/>
+          <w:sz w:val="20"/>
+          <w:szCs w:val="20"/>
+          <w:lang w:val="en-US"/>
+        </w:rPr>
+        <w:t xml:space="preserve">                    &lt;&lt; " -&gt; Actual Volume: " &lt;&lt; actualVolume</w:t>
+      </w:r>
+    </w:p>
+    <w:p>
+      <w:pPr>
+        <w:rPr>
+          <w:rFonts w:ascii="Courier New" w:hAnsi="Courier New" w:cs="Courier New"/>
+          <w:sz w:val="20"/>
+          <w:szCs w:val="20"/>
+          <w:lang w:val="en-US"/>
+        </w:rPr>
+      </w:pPr>
+      <w:r>
+        <w:rPr>
+          <w:rFonts w:ascii="Courier New" w:hAnsi="Courier New" w:cs="Courier New"/>
+          <w:sz w:val="20"/>
+          <w:szCs w:val="20"/>
+          <w:lang w:val="en-US"/>
+        </w:rPr>
+        <w:t xml:space="preserve">                    &lt;&lt; " -&gt; Result: " &lt;&lt; result &lt;&lt; endl;</w:t>
+      </w:r>
+    </w:p>
+    <w:p>
+      <w:pPr>
+        <w:rPr>
+          <w:rFonts w:ascii="Courier New" w:hAnsi="Courier New" w:cs="Courier New"/>
+          <w:sz w:val="20"/>
+          <w:szCs w:val="20"/>
+          <w:lang w:val="en-US"/>
+        </w:rPr>
+      </w:pPr>
+    </w:p>
+    <w:p>
+      <w:pPr>
+        <w:rPr>
+          <w:rFonts w:ascii="Courier New" w:hAnsi="Courier New" w:cs="Courier New"/>
+          <w:sz w:val="20"/>
+          <w:szCs w:val="20"/>
+          <w:lang w:val="en-US"/>
+        </w:rPr>
+      </w:pPr>
+      <w:r>
+        <w:rPr>
+          <w:rFonts w:ascii="Courier New" w:hAnsi="Courier New" w:cs="Courier New"/>
+          <w:sz w:val="20"/>
+          <w:szCs w:val="20"/>
+          <w:lang w:val="en-US"/>
+        </w:rPr>
+        <w:t xml:space="preserve">                cout &lt;&lt; tc_id &lt;&lt; ": " &lt;&lt; result &lt;&lt; endl;</w:t>
+      </w:r>
+    </w:p>
+    <w:p>
+      <w:pPr>
+        <w:rPr>
+          <w:rFonts w:ascii="Courier New" w:hAnsi="Courier New" w:cs="Courier New"/>
+          <w:sz w:val="20"/>
+          <w:szCs w:val="20"/>
+          <w:lang w:val="en-US"/>
+        </w:rPr>
+      </w:pPr>
+      <w:r>
+        <w:rPr>
+          <w:rFonts w:ascii="Courier New" w:hAnsi="Courier New" w:cs="Courier New"/>
+          <w:sz w:val="20"/>
+          <w:szCs w:val="20"/>
+          <w:lang w:val="en-US"/>
+        </w:rPr>
+        <w:t xml:space="preserve">            }</w:t>
+      </w:r>
+    </w:p>
+    <w:p>
+      <w:pPr>
+        <w:rPr>
+          <w:rFonts w:ascii="Courier New" w:hAnsi="Courier New" w:cs="Courier New"/>
+          <w:sz w:val="20"/>
+          <w:szCs w:val="20"/>
+          <w:lang w:val="en-US"/>
+        </w:rPr>
+      </w:pPr>
+      <w:r>
+        <w:rPr>
+          <w:rFonts w:ascii="Courier New" w:hAnsi="Courier New" w:cs="Courier New"/>
+          <w:sz w:val="20"/>
+          <w:szCs w:val="20"/>
+          <w:lang w:val="en-US"/>
+        </w:rPr>
+        <w:t xml:space="preserve">            testFile.close();</w:t>
+      </w:r>
+    </w:p>
+    <w:p>
+      <w:pPr>
+        <w:rPr>
+          <w:rFonts w:ascii="Courier New" w:hAnsi="Courier New" w:cs="Courier New"/>
+          <w:sz w:val="20"/>
+          <w:szCs w:val="20"/>
+          <w:lang w:val="en-US"/>
+        </w:rPr>
+      </w:pPr>
+      <w:r>
+        <w:rPr>
+          <w:rFonts w:ascii="Courier New" w:hAnsi="Courier New" w:cs="Courier New"/>
+          <w:sz w:val="20"/>
+          <w:szCs w:val="20"/>
+          <w:lang w:val="en-US"/>
+        </w:rPr>
+        <w:t xml:space="preserve">        }</w:t>
+      </w:r>
+    </w:p>
+    <w:p>
+      <w:pPr>
+        <w:rPr>
+          <w:rFonts w:ascii="Courier New" w:hAnsi="Courier New" w:cs="Courier New"/>
+          <w:sz w:val="20"/>
+          <w:szCs w:val="20"/>
+          <w:lang w:val="en-US"/>
+        </w:rPr>
+      </w:pPr>
+      <w:r>
+        <w:rPr>
+          <w:rFonts w:ascii="Courier New" w:hAnsi="Courier New" w:cs="Courier New"/>
+          <w:sz w:val="20"/>
+          <w:szCs w:val="20"/>
+          <w:lang w:val="en-US"/>
+        </w:rPr>
+        <w:t xml:space="preserve">    };</w:t>
+      </w:r>
+    </w:p>
+    <w:p>
+      <w:pPr>
+        <w:rPr>
+          <w:rFonts w:ascii="Courier New" w:hAnsi="Courier New" w:cs="Courier New"/>
+          <w:sz w:val="20"/>
+          <w:szCs w:val="20"/>
+          <w:lang w:val="en-US"/>
+        </w:rPr>
+      </w:pPr>
+      <w:r>
+        <w:rPr>
+          <w:rFonts w:ascii="Courier New" w:hAnsi="Courier New" w:cs="Courier New"/>
+          <w:sz w:val="20"/>
+          <w:szCs w:val="20"/>
+          <w:lang w:val="en-US"/>
+        </w:rPr>
+        <w:t xml:space="preserve">    TestRunner::executeTestSuite("../../TestSuite/test_suite_01.txt", logFile);</w:t>
+      </w:r>
+    </w:p>
+    <w:p>
+      <w:pPr>
+        <w:rPr>
+          <w:rFonts w:ascii="Courier New" w:hAnsi="Courier New" w:cs="Courier New"/>
+          <w:sz w:val="20"/>
+          <w:szCs w:val="20"/>
+          <w:lang w:val="en-US"/>
+        </w:rPr>
+      </w:pPr>
+    </w:p>
+    <w:p>
+      <w:pPr>
+        <w:rPr>
+          <w:rFonts w:ascii="Courier New" w:hAnsi="Courier New" w:cs="Courier New"/>
+          <w:sz w:val="20"/>
+          <w:szCs w:val="20"/>
+          <w:lang w:val="en-US"/>
+        </w:rPr>
+      </w:pPr>
+      <w:r>
+        <w:rPr>
+          <w:rFonts w:ascii="Courier New" w:hAnsi="Courier New" w:cs="Courier New"/>
+          <w:sz w:val="20"/>
+          <w:szCs w:val="20"/>
+          <w:lang w:val="en-US"/>
+        </w:rPr>
+        <w:t xml:space="preserve">    logFile &lt;&lt; "=== ТЕСТУВАННЯ ЗАВЕРШЕНО ===" &lt;&lt; endl;</w:t>
+      </w:r>
+    </w:p>
+    <w:p>
+      <w:pPr>
+        <w:rPr>
+          <w:rFonts w:ascii="Courier New" w:hAnsi="Courier New" w:cs="Courier New"/>
+          <w:sz w:val="20"/>
+          <w:szCs w:val="20"/>
+          <w:lang w:val="en-US"/>
+        </w:rPr>
+      </w:pPr>
+      <w:r>
+        <w:rPr>
+          <w:rFonts w:ascii="Courier New" w:hAnsi="Courier New" w:cs="Courier New"/>
+          <w:sz w:val="20"/>
+          <w:szCs w:val="20"/>
+          <w:lang w:val="en-US"/>
+        </w:rPr>
+        <w:t xml:space="preserve">    logFile.close();</w:t>
+      </w:r>
+    </w:p>
+    <w:p>
+      <w:pPr>
+        <w:rPr>
+          <w:rFonts w:ascii="Courier New" w:hAnsi="Courier New" w:cs="Courier New"/>
+          <w:sz w:val="20"/>
+          <w:szCs w:val="20"/>
+          <w:lang w:val="en-US"/>
+        </w:rPr>
+      </w:pPr>
+    </w:p>
+    <w:p>
+      <w:pPr>
+        <w:rPr>
+          <w:rFonts w:ascii="Courier New" w:hAnsi="Courier New" w:cs="Courier New"/>
+          <w:sz w:val="20"/>
+          <w:szCs w:val="20"/>
+          <w:lang w:val="ru-RU"/>
+        </w:rPr>
+      </w:pPr>
+      <w:r>
+        <w:rPr>
+          <w:rFonts w:ascii="Courier New" w:hAnsi="Courier New" w:cs="Courier New"/>
+          <w:sz w:val="20"/>
+          <w:szCs w:val="20"/>
+          <w:lang w:val="en-US"/>
+        </w:rPr>
+        <w:t xml:space="preserve">    cout</w:t>
+      </w:r>
+      <w:r>
+        <w:rPr>
+          <w:rFonts w:ascii="Courier New" w:hAnsi="Courier New" w:cs="Courier New"/>
+          <w:sz w:val="20"/>
+          <w:szCs w:val="20"/>
+          <w:lang w:val="ru-RU"/>
+        </w:rPr>
+        <w:t xml:space="preserve"> &lt;&lt; "Тестування успішно завершено! Результати записано в </w:t>
+      </w:r>
+      <w:r>
+        <w:rPr>
+          <w:rFonts w:ascii="Courier New" w:hAnsi="Courier New" w:cs="Courier New"/>
+          <w:sz w:val="20"/>
+          <w:szCs w:val="20"/>
+          <w:lang w:val="en-US"/>
+        </w:rPr>
+        <w:t>TestResults</w:t>
+      </w:r>
+      <w:r>
+        <w:rPr>
+          <w:rFonts w:ascii="Courier New" w:hAnsi="Courier New" w:cs="Courier New"/>
+          <w:sz w:val="20"/>
+          <w:szCs w:val="20"/>
+          <w:lang w:val="ru-RU"/>
+        </w:rPr>
+        <w:t>.</w:t>
+      </w:r>
+      <w:r>
+        <w:rPr>
+          <w:rFonts w:ascii="Courier New" w:hAnsi="Courier New" w:cs="Courier New"/>
+          <w:sz w:val="20"/>
+          <w:szCs w:val="20"/>
+          <w:lang w:val="en-US"/>
+        </w:rPr>
+        <w:t>txt</w:t>
+      </w:r>
+      <w:r>
+        <w:rPr>
+          <w:rFonts w:ascii="Courier New" w:hAnsi="Courier New" w:cs="Courier New"/>
+          <w:sz w:val="20"/>
+          <w:szCs w:val="20"/>
+          <w:lang w:val="ru-RU"/>
+        </w:rPr>
+        <w:t xml:space="preserve">" &lt;&lt; </w:t>
+      </w:r>
+      <w:r>
+        <w:rPr>
+          <w:rFonts w:ascii="Courier New" w:hAnsi="Courier New" w:cs="Courier New"/>
+          <w:sz w:val="20"/>
+          <w:szCs w:val="20"/>
+          <w:lang w:val="en-US"/>
+        </w:rPr>
+        <w:t>endl</w:t>
+      </w:r>
+      <w:r>
+        <w:rPr>
+          <w:rFonts w:ascii="Courier New" w:hAnsi="Courier New" w:cs="Courier New"/>
+          <w:sz w:val="20"/>
+          <w:szCs w:val="20"/>
+          <w:lang w:val="ru-RU"/>
+        </w:rPr>
+        <w:t>;</w:t>
+      </w:r>
+    </w:p>
+    <w:p>
+      <w:pPr>
+        <w:rPr>
+          <w:rFonts w:ascii="Courier New" w:hAnsi="Courier New" w:cs="Courier New"/>
+          <w:sz w:val="20"/>
+          <w:szCs w:val="20"/>
+          <w:lang w:val="ru-RU"/>
+        </w:rPr>
+      </w:pPr>
+      <w:r>
+        <w:rPr>
+          <w:rFonts w:ascii="Courier New" w:hAnsi="Courier New" w:cs="Courier New"/>
+          <w:sz w:val="20"/>
+          <w:szCs w:val="20"/>
+          <w:lang w:val="ru-RU"/>
         </w:rPr>
         <w:t xml:space="preserve">    </w:t>
       </w:r>
@@ -6014,8 +6869,36 @@
           <w:rFonts w:ascii="Courier New" w:hAnsi="Courier New" w:cs="Courier New"/>
           <w:sz w:val="20"/>
           <w:szCs w:val="20"/>
+          <w:lang w:val="en-US"/>
+        </w:rPr>
+        <w:t>return</w:t>
+      </w:r>
+      <w:r>
+        <w:rPr>
+          <w:rFonts w:ascii="Courier New" w:hAnsi="Courier New" w:cs="Courier New"/>
+          <w:sz w:val="20"/>
+          <w:szCs w:val="20"/>
           <w:lang w:val="ru-RU"/>
         </w:rPr>
+        <w:t xml:space="preserve"> 0;</w:t>
+      </w:r>
+    </w:p>
+    <w:p>
+      <w:pPr>
+        <w:rPr>
+          <w:rFonts w:ascii="Courier New" w:hAnsi="Courier New" w:cs="Courier New"/>
+          <w:sz w:val="20"/>
+          <w:szCs w:val="20"/>
+          <w:lang w:val="ru-RU"/>
+        </w:rPr>
+      </w:pPr>
+      <w:r>
+        <w:rPr>
+          <w:rFonts w:ascii="Courier New" w:hAnsi="Courier New" w:cs="Courier New"/>
+          <w:sz w:val="20"/>
+          <w:szCs w:val="20"/>
+          <w:lang w:val="ru-RU"/>
+        </w:rPr>
         <w:t>}</w:t>
       </w:r>
     </w:p>
@@ -6032,886 +6915,2616 @@
     <w:p>
       <w:pPr>
         <w:rPr>
+          <w:sz w:val="28"/>
+          <w:szCs w:val="28"/>
+          <w:lang w:val="en-US"/>
+        </w:rPr>
+      </w:pPr>
+      <w:r>
+        <w:rPr>
+          <w:sz w:val="28"/>
+          <w:szCs w:val="28"/>
+        </w:rPr>
+        <w:t>Вихідні результати</w:t>
+      </w:r>
+      <w:r>
+        <w:rPr>
+          <w:sz w:val="28"/>
+          <w:szCs w:val="28"/>
+          <w:lang w:val="en-US"/>
+        </w:rPr>
+        <w:t>:</w:t>
+      </w:r>
+    </w:p>
+    <w:p>
+      <w:pPr>
+        <w:rPr>
+          <w:rFonts w:ascii="Courier New" w:hAnsi="Courier New" w:cs="Courier New"/>
+          <w:sz w:val="20"/>
+          <w:szCs w:val="20"/>
+          <w:lang w:val="en-US"/>
+        </w:rPr>
+      </w:pPr>
+    </w:p>
+    <w:p>
+      <w:pPr>
+        <w:rPr>
+          <w:rFonts w:ascii="Courier New" w:hAnsi="Courier New" w:cs="Courier New"/>
+          <w:sz w:val="20"/>
+          <w:szCs w:val="20"/>
+          <w:lang w:val="en-US"/>
+        </w:rPr>
+      </w:pPr>
+    </w:p>
+    <w:p>
+      <w:pPr>
+        <w:rPr>
+          <w:rFonts w:ascii="Courier New" w:hAnsi="Courier New" w:cs="Courier New"/>
+          <w:sz w:val="20"/>
+          <w:szCs w:val="20"/>
+          <w:lang w:val="en-US"/>
+        </w:rPr>
+      </w:pPr>
+      <w:r>
+        <w:rPr>
+          <w:noProof/>
+        </w:rPr>
+        <w:drawing>
+          <wp:inline distT="0" distB="0" distL="0" distR="0" wp14:anchorId="719BC372" wp14:editId="10852A0D">
+            <wp:extent cx="6480175" cy="1580515"/>
+            <wp:effectExtent l="0" t="0" r="0" b="635"/>
+            <wp:docPr id="1" name="Рисунок 1"/>
+            <wp:cNvGraphicFramePr>
+              <a:graphicFrameLocks xmlns:a="http://schemas.openxmlformats.org/drawingml/2006/main" noChangeAspect="1"/>
+            </wp:cNvGraphicFramePr>
+            <a:graphic xmlns:a="http://schemas.openxmlformats.org/drawingml/2006/main">
+              <a:graphicData uri="http://schemas.openxmlformats.org/drawingml/2006/picture">
+                <pic:pic xmlns:pic="http://schemas.openxmlformats.org/drawingml/2006/picture">
+                  <pic:nvPicPr>
+                    <pic:cNvPr id="1" name=""/>
+                    <pic:cNvPicPr/>
+                  </pic:nvPicPr>
+                  <pic:blipFill>
+                    <a:blip r:embed="rId8"/>
+                    <a:stretch>
+                      <a:fillRect/>
+                    </a:stretch>
+                  </pic:blipFill>
+                  <pic:spPr>
+                    <a:xfrm>
+                      <a:off x="0" y="0"/>
+                      <a:ext cx="6480175" cy="1580515"/>
+                    </a:xfrm>
+                    <a:prstGeom prst="rect">
+                      <a:avLst/>
+                    </a:prstGeom>
+                  </pic:spPr>
+                </pic:pic>
+              </a:graphicData>
+            </a:graphic>
+          </wp:inline>
+        </w:drawing>
+      </w:r>
+    </w:p>
+    <w:p>
+      <w:pPr>
+        <w:rPr>
+          <w:rFonts w:ascii="Courier New" w:hAnsi="Courier New" w:cs="Courier New"/>
+          <w:sz w:val="20"/>
+          <w:szCs w:val="20"/>
+          <w:lang w:val="en-US"/>
+        </w:rPr>
+      </w:pPr>
+    </w:p>
+    <w:p>
+      <w:pPr>
+        <w:rPr>
           <w:rFonts w:ascii="Courier New" w:hAnsi="Courier New" w:cs="Courier New"/>
           <w:sz w:val="20"/>
           <w:szCs w:val="20"/>
           <w:lang w:val="ru-RU"/>
         </w:rPr>
       </w:pPr>
-      <w:r>
-        <w:rPr>
-          <w:rFonts w:ascii="Courier New" w:hAnsi="Courier New" w:cs="Courier New"/>
-          <w:sz w:val="20"/>
-          <w:szCs w:val="20"/>
+    </w:p>
+    <w:p>
+      <w:pPr>
+        <w:rPr>
+          <w:sz w:val="28"/>
+          <w:szCs w:val="28"/>
           <w:lang w:val="ru-RU"/>
         </w:rPr>
-        <w:t xml:space="preserve">    </w:t>
-      </w:r>
-      <w:r>
-        <w:rPr>
-          <w:rFonts w:ascii="Courier New" w:hAnsi="Courier New" w:cs="Courier New"/>
-          <w:sz w:val="20"/>
-          <w:szCs w:val="20"/>
-          <w:lang w:val="en-US"/>
-        </w:rPr>
-        <w:t>logFile</w:t>
-      </w:r>
-      <w:r>
-        <w:rPr>
-          <w:rFonts w:ascii="Courier New" w:hAnsi="Courier New" w:cs="Courier New"/>
-          <w:sz w:val="20"/>
-          <w:szCs w:val="20"/>
+      </w:pPr>
+      <w:r>
+        <w:rPr>
+          <w:sz w:val="28"/>
+          <w:szCs w:val="28"/>
           <w:lang w:val="ru-RU"/>
         </w:rPr>
-        <w:t xml:space="preserve"> &lt;&lt; "=== ПРОТОКОЛ АВТОМАТИЗОВАНОГО ТЕСТУВАННЯ ===" &lt;&lt; </w:t>
-      </w:r>
-      <w:r>
-        <w:rPr>
-          <w:rFonts w:ascii="Courier New" w:hAnsi="Courier New" w:cs="Courier New"/>
-          <w:sz w:val="20"/>
-          <w:szCs w:val="20"/>
-          <w:lang w:val="en-US"/>
-        </w:rPr>
-        <w:t>endl</w:t>
-      </w:r>
-      <w:r>
-        <w:rPr>
-          <w:rFonts w:ascii="Courier New" w:hAnsi="Courier New" w:cs="Courier New"/>
-          <w:sz w:val="20"/>
-          <w:szCs w:val="20"/>
+        <w:t>Ар</w:t>
+      </w:r>
+      <w:r>
+        <w:rPr>
+          <w:sz w:val="28"/>
+          <w:szCs w:val="28"/>
           <w:lang w:val="ru-RU"/>
         </w:rPr>
-        <w:t>;</w:t>
-      </w:r>
-    </w:p>
-    <w:p>
-      <w:pPr>
-        <w:rPr>
-          <w:rFonts w:ascii="Courier New" w:hAnsi="Courier New" w:cs="Courier New"/>
-          <w:sz w:val="20"/>
-          <w:szCs w:val="20"/>
+        <w:t>гументи</w:t>
+      </w:r>
+      <w:r>
+        <w:rPr>
+          <w:sz w:val="28"/>
+          <w:szCs w:val="28"/>
           <w:lang w:val="ru-RU"/>
         </w:rPr>
-      </w:pPr>
-    </w:p>
-    <w:p>
-      <w:pPr>
-        <w:rPr>
-          <w:rFonts w:ascii="Courier New" w:hAnsi="Courier New" w:cs="Courier New"/>
-          <w:sz w:val="20"/>
-          <w:szCs w:val="20"/>
-          <w:lang w:val="en-US"/>
-        </w:rPr>
-      </w:pPr>
-      <w:r>
-        <w:rPr>
-          <w:rFonts w:ascii="Courier New" w:hAnsi="Courier New" w:cs="Courier New"/>
-          <w:sz w:val="20"/>
-          <w:szCs w:val="20"/>
+        <w:t xml:space="preserve"> </w:t>
+      </w:r>
+      <w:r>
+        <w:rPr>
+          <w:sz w:val="28"/>
+          <w:szCs w:val="28"/>
           <w:lang w:val="ru-RU"/>
         </w:rPr>
-        <w:t xml:space="preserve">    </w:t>
-      </w:r>
-      <w:r>
-        <w:rPr>
-          <w:rFonts w:ascii="Courier New" w:hAnsi="Courier New" w:cs="Courier New"/>
-          <w:sz w:val="20"/>
-          <w:szCs w:val="20"/>
-          <w:lang w:val="en-US"/>
-        </w:rPr>
-        <w:t>class TestRunner {</w:t>
-      </w:r>
-    </w:p>
-    <w:p>
-      <w:pPr>
-        <w:rPr>
-          <w:rFonts w:ascii="Courier New" w:hAnsi="Courier New" w:cs="Courier New"/>
-          <w:sz w:val="20"/>
-          <w:szCs w:val="20"/>
-          <w:lang w:val="en-US"/>
-        </w:rPr>
-      </w:pPr>
-      <w:r>
-        <w:rPr>
-          <w:rFonts w:ascii="Courier New" w:hAnsi="Courier New" w:cs="Courier New"/>
-          <w:sz w:val="20"/>
-          <w:szCs w:val="20"/>
-          <w:lang w:val="en-US"/>
-        </w:rPr>
-        <w:t xml:space="preserve">    public:</w:t>
-      </w:r>
-    </w:p>
-    <w:p>
-      <w:pPr>
-        <w:rPr>
-          <w:rFonts w:ascii="Courier New" w:hAnsi="Courier New" w:cs="Courier New"/>
-          <w:sz w:val="20"/>
-          <w:szCs w:val="20"/>
-          <w:lang w:val="en-US"/>
-        </w:rPr>
-      </w:pPr>
-      <w:r>
-        <w:rPr>
-          <w:rFonts w:ascii="Courier New" w:hAnsi="Courier New" w:cs="Courier New"/>
-          <w:sz w:val="20"/>
-          <w:szCs w:val="20"/>
-          <w:lang w:val="en-US"/>
-        </w:rPr>
-        <w:t xml:space="preserve">        static void executeTestSuite(const string&amp; filename, ofstream&amp; log) {</w:t>
-      </w:r>
-    </w:p>
-    <w:p>
-      <w:pPr>
-        <w:rPr>
-          <w:rFonts w:ascii="Courier New" w:hAnsi="Courier New" w:cs="Courier New"/>
-          <w:sz w:val="20"/>
-          <w:szCs w:val="20"/>
-          <w:lang w:val="en-US"/>
-        </w:rPr>
-      </w:pPr>
-      <w:r>
-        <w:rPr>
-          <w:rFonts w:ascii="Courier New" w:hAnsi="Courier New" w:cs="Courier New"/>
-          <w:sz w:val="20"/>
-          <w:szCs w:val="20"/>
-          <w:lang w:val="en-US"/>
-        </w:rPr>
-        <w:t xml:space="preserve">            ifstream testFile(filename);</w:t>
-      </w:r>
-    </w:p>
-    <w:p>
-      <w:pPr>
-        <w:rPr>
-          <w:rFonts w:ascii="Courier New" w:hAnsi="Courier New" w:cs="Courier New"/>
-          <w:sz w:val="20"/>
-          <w:szCs w:val="20"/>
-          <w:lang w:val="en-US"/>
-        </w:rPr>
-      </w:pPr>
-      <w:r>
-        <w:rPr>
-          <w:rFonts w:ascii="Courier New" w:hAnsi="Courier New" w:cs="Courier New"/>
-          <w:sz w:val="20"/>
-          <w:szCs w:val="20"/>
-          <w:lang w:val="en-US"/>
-        </w:rPr>
-        <w:t xml:space="preserve">            if (!testFile.is_open()) {</w:t>
-      </w:r>
-    </w:p>
-    <w:p>
-      <w:pPr>
-        <w:rPr>
-          <w:rFonts w:ascii="Courier New" w:hAnsi="Courier New" w:cs="Courier New"/>
-          <w:sz w:val="20"/>
-          <w:szCs w:val="20"/>
-          <w:lang w:val="en-US"/>
-        </w:rPr>
-      </w:pPr>
-      <w:r>
-        <w:rPr>
-          <w:rFonts w:ascii="Courier New" w:hAnsi="Courier New" w:cs="Courier New"/>
-          <w:sz w:val="20"/>
-          <w:szCs w:val="20"/>
-          <w:lang w:val="en-US"/>
-        </w:rPr>
-        <w:t xml:space="preserve">                log &lt;&lt; "Помилка: Не вдалося відкрити файл тестів: " &lt;&lt; filename &lt;&lt; endl;</w:t>
-      </w:r>
-    </w:p>
-    <w:p>
-      <w:pPr>
-        <w:rPr>
-          <w:rFonts w:ascii="Courier New" w:hAnsi="Courier New" w:cs="Courier New"/>
-          <w:sz w:val="20"/>
-          <w:szCs w:val="20"/>
-          <w:lang w:val="en-US"/>
-        </w:rPr>
-      </w:pPr>
-      <w:r>
-        <w:rPr>
-          <w:rFonts w:ascii="Courier New" w:hAnsi="Courier New" w:cs="Courier New"/>
-          <w:sz w:val="20"/>
-          <w:szCs w:val="20"/>
-          <w:lang w:val="en-US"/>
-        </w:rPr>
-        <w:t xml:space="preserve">                cout</w:t>
-      </w:r>
-      <w:r>
-        <w:rPr>
-          <w:rFonts w:ascii="Courier New" w:hAnsi="Courier New" w:cs="Courier New"/>
-          <w:sz w:val="20"/>
-          <w:szCs w:val="20"/>
+        <w:t xml:space="preserve">на </w:t>
+      </w:r>
+      <w:r>
+        <w:rPr>
+          <w:sz w:val="28"/>
+          <w:szCs w:val="28"/>
+        </w:rPr>
+        <w:t>користь досягнення мети лабораторної роботи</w:t>
+      </w:r>
+      <w:r>
+        <w:rPr>
+          <w:sz w:val="28"/>
+          <w:szCs w:val="28"/>
           <w:lang w:val="ru-RU"/>
         </w:rPr>
-        <w:t xml:space="preserve"> &lt;&lt; "Файл тестів не знайдено!" </w:t>
-      </w:r>
-      <w:r>
-        <w:rPr>
-          <w:rFonts w:ascii="Courier New" w:hAnsi="Courier New" w:cs="Courier New"/>
-          <w:sz w:val="20"/>
-          <w:szCs w:val="20"/>
-          <w:lang w:val="en-US"/>
-        </w:rPr>
-        <w:t>&lt;&lt; endl;</w:t>
-      </w:r>
-    </w:p>
-    <w:p>
-      <w:pPr>
-        <w:rPr>
-          <w:rFonts w:ascii="Courier New" w:hAnsi="Courier New" w:cs="Courier New"/>
-          <w:sz w:val="20"/>
-          <w:szCs w:val="20"/>
-          <w:lang w:val="en-US"/>
-        </w:rPr>
-      </w:pPr>
-      <w:r>
-        <w:rPr>
-          <w:rFonts w:ascii="Courier New" w:hAnsi="Courier New" w:cs="Courier New"/>
-          <w:sz w:val="20"/>
-          <w:szCs w:val="20"/>
-          <w:lang w:val="en-US"/>
-        </w:rPr>
-        <w:t xml:space="preserve">                return;</w:t>
-      </w:r>
-    </w:p>
-    <w:p>
-      <w:pPr>
-        <w:rPr>
-          <w:rFonts w:ascii="Courier New" w:hAnsi="Courier New" w:cs="Courier New"/>
-          <w:sz w:val="20"/>
-          <w:szCs w:val="20"/>
-          <w:lang w:val="en-US"/>
-        </w:rPr>
-      </w:pPr>
-      <w:r>
-        <w:rPr>
-          <w:rFonts w:ascii="Courier New" w:hAnsi="Courier New" w:cs="Courier New"/>
-          <w:sz w:val="20"/>
-          <w:szCs w:val="20"/>
-          <w:lang w:val="en-US"/>
-        </w:rPr>
-        <w:t xml:space="preserve">            }</w:t>
-      </w:r>
-    </w:p>
-    <w:p>
-      <w:pPr>
-        <w:rPr>
-          <w:rFonts w:ascii="Courier New" w:hAnsi="Courier New" w:cs="Courier New"/>
-          <w:sz w:val="20"/>
-          <w:szCs w:val="20"/>
-          <w:lang w:val="en-US"/>
-        </w:rPr>
-      </w:pPr>
-    </w:p>
-    <w:p>
-      <w:pPr>
-        <w:rPr>
-          <w:rFonts w:ascii="Courier New" w:hAnsi="Courier New" w:cs="Courier New"/>
-          <w:sz w:val="20"/>
-          <w:szCs w:val="20"/>
-          <w:lang w:val="en-US"/>
-        </w:rPr>
-      </w:pPr>
-      <w:r>
-        <w:rPr>
-          <w:rFonts w:ascii="Courier New" w:hAnsi="Courier New" w:cs="Courier New"/>
-          <w:sz w:val="20"/>
-          <w:szCs w:val="20"/>
-          <w:lang w:val="en-US"/>
-        </w:rPr>
-        <w:t xml:space="preserve">            string tc_id, delimiter;</w:t>
-      </w:r>
-    </w:p>
-    <w:p>
-      <w:pPr>
-        <w:rPr>
-          <w:rFonts w:ascii="Courier New" w:hAnsi="Courier New" w:cs="Courier New"/>
-          <w:sz w:val="20"/>
-          <w:szCs w:val="20"/>
-          <w:lang w:val="en-US"/>
-        </w:rPr>
-      </w:pPr>
-      <w:r>
-        <w:rPr>
-          <w:rFonts w:ascii="Courier New" w:hAnsi="Courier New" w:cs="Courier New"/>
-          <w:sz w:val="20"/>
-          <w:szCs w:val="20"/>
-          <w:lang w:val="en-US"/>
-        </w:rPr>
-        <w:t xml:space="preserve">            double a, b, h, expectedVolume;</w:t>
-      </w:r>
-    </w:p>
-    <w:p>
-      <w:pPr>
-        <w:rPr>
-          <w:rFonts w:ascii="Courier New" w:hAnsi="Courier New" w:cs="Courier New"/>
-          <w:sz w:val="20"/>
-          <w:szCs w:val="20"/>
-          <w:lang w:val="en-US"/>
-        </w:rPr>
-      </w:pPr>
-    </w:p>
-    <w:p>
-      <w:pPr>
-        <w:rPr>
-          <w:rFonts w:ascii="Courier New" w:hAnsi="Courier New" w:cs="Courier New"/>
-          <w:sz w:val="20"/>
-          <w:szCs w:val="20"/>
-          <w:lang w:val="en-US"/>
-        </w:rPr>
-      </w:pPr>
-      <w:r>
-        <w:rPr>
-          <w:rFonts w:ascii="Courier New" w:hAnsi="Courier New" w:cs="Courier New"/>
-          <w:sz w:val="20"/>
-          <w:szCs w:val="20"/>
-          <w:lang w:val="en-US"/>
-        </w:rPr>
-        <w:t xml:space="preserve">            while (testFile &gt;&gt; tc_id &gt;&gt; delimiter &gt;&gt; a &gt;&gt; b &gt;&gt; h &gt;&gt; delimiter &gt;&gt; expectedVolume) {</w:t>
-      </w:r>
-    </w:p>
-    <w:p>
-      <w:pPr>
-        <w:rPr>
-          <w:rFonts w:ascii="Courier New" w:hAnsi="Courier New" w:cs="Courier New"/>
-          <w:sz w:val="20"/>
-          <w:szCs w:val="20"/>
-          <w:lang w:val="en-US"/>
-        </w:rPr>
-      </w:pPr>
-      <w:r>
-        <w:rPr>
-          <w:rFonts w:ascii="Courier New" w:hAnsi="Courier New" w:cs="Courier New"/>
-          <w:sz w:val="20"/>
-          <w:szCs w:val="20"/>
-          <w:lang w:val="en-US"/>
-        </w:rPr>
-        <w:t xml:space="preserve">                ClassLab12_Nikolenko aquarium;</w:t>
-      </w:r>
-    </w:p>
-    <w:p>
-      <w:pPr>
-        <w:rPr>
-          <w:rFonts w:ascii="Courier New" w:hAnsi="Courier New" w:cs="Courier New"/>
-          <w:sz w:val="20"/>
-          <w:szCs w:val="20"/>
-          <w:lang w:val="en-US"/>
-        </w:rPr>
-      </w:pPr>
-      <w:r>
-        <w:rPr>
-          <w:rFonts w:ascii="Courier New" w:hAnsi="Courier New" w:cs="Courier New"/>
-          <w:sz w:val="20"/>
-          <w:szCs w:val="20"/>
-          <w:lang w:val="en-US"/>
-        </w:rPr>
-        <w:t xml:space="preserve">                aquarium.setA(a);</w:t>
-      </w:r>
-    </w:p>
-    <w:p>
-      <w:pPr>
-        <w:rPr>
-          <w:rFonts w:ascii="Courier New" w:hAnsi="Courier New" w:cs="Courier New"/>
-          <w:sz w:val="20"/>
-          <w:szCs w:val="20"/>
-          <w:lang w:val="en-US"/>
-        </w:rPr>
-      </w:pPr>
-      <w:r>
-        <w:rPr>
-          <w:rFonts w:ascii="Courier New" w:hAnsi="Courier New" w:cs="Courier New"/>
-          <w:sz w:val="20"/>
-          <w:szCs w:val="20"/>
-          <w:lang w:val="en-US"/>
-        </w:rPr>
-        <w:t xml:space="preserve">                aquarium.setB(b);</w:t>
-      </w:r>
-    </w:p>
-    <w:p>
-      <w:pPr>
-        <w:rPr>
-          <w:rFonts w:ascii="Courier New" w:hAnsi="Courier New" w:cs="Courier New"/>
-          <w:sz w:val="20"/>
-          <w:szCs w:val="20"/>
-          <w:lang w:val="en-US"/>
-        </w:rPr>
-      </w:pPr>
-      <w:r>
-        <w:rPr>
-          <w:rFonts w:ascii="Courier New" w:hAnsi="Courier New" w:cs="Courier New"/>
-          <w:sz w:val="20"/>
-          <w:szCs w:val="20"/>
-          <w:lang w:val="en-US"/>
-        </w:rPr>
-        <w:t xml:space="preserve">                aquarium.setH(h);</w:t>
-      </w:r>
-    </w:p>
-    <w:p>
-      <w:pPr>
-        <w:rPr>
-          <w:rFonts w:ascii="Courier New" w:hAnsi="Courier New" w:cs="Courier New"/>
-          <w:sz w:val="20"/>
-          <w:szCs w:val="20"/>
-          <w:lang w:val="en-US"/>
-        </w:rPr>
-      </w:pPr>
-    </w:p>
-    <w:p>
-      <w:pPr>
-        <w:rPr>
-          <w:rFonts w:ascii="Courier New" w:hAnsi="Courier New" w:cs="Courier New"/>
-          <w:sz w:val="20"/>
-          <w:szCs w:val="20"/>
-          <w:lang w:val="en-US"/>
-        </w:rPr>
-      </w:pPr>
-      <w:r>
-        <w:rPr>
-          <w:rFonts w:ascii="Courier New" w:hAnsi="Courier New" w:cs="Courier New"/>
-          <w:sz w:val="20"/>
-          <w:szCs w:val="20"/>
-          <w:lang w:val="en-US"/>
-        </w:rPr>
-        <w:t xml:space="preserve">                double actualVolume = aquarium.calculateVolume();</w:t>
-      </w:r>
-    </w:p>
-    <w:p>
-      <w:pPr>
-        <w:rPr>
-          <w:rFonts w:ascii="Courier New" w:hAnsi="Courier New" w:cs="Courier New"/>
-          <w:sz w:val="20"/>
-          <w:szCs w:val="20"/>
-          <w:lang w:val="en-US"/>
-        </w:rPr>
-      </w:pPr>
-    </w:p>
-    <w:p>
-      <w:pPr>
-        <w:rPr>
-          <w:rFonts w:ascii="Courier New" w:hAnsi="Courier New" w:cs="Courier New"/>
-          <w:sz w:val="20"/>
-          <w:szCs w:val="20"/>
-          <w:lang w:val="en-US"/>
-        </w:rPr>
-      </w:pPr>
-      <w:r>
-        <w:rPr>
-          <w:rFonts w:ascii="Courier New" w:hAnsi="Courier New" w:cs="Courier New"/>
-          <w:sz w:val="20"/>
-          <w:szCs w:val="20"/>
-          <w:lang w:val="en-US"/>
-        </w:rPr>
-        <w:t xml:space="preserve">                string result = (abs(actualVolume - expectedVolume) &lt; 0.0001) ? "PASSED" : "FAILED";</w:t>
-      </w:r>
-    </w:p>
-    <w:p>
-      <w:pPr>
-        <w:rPr>
-          <w:rFonts w:ascii="Courier New" w:hAnsi="Courier New" w:cs="Courier New"/>
-          <w:sz w:val="20"/>
-          <w:szCs w:val="20"/>
-          <w:lang w:val="en-US"/>
-        </w:rPr>
-      </w:pPr>
-    </w:p>
-    <w:p>
-      <w:pPr>
-        <w:rPr>
-          <w:rFonts w:ascii="Courier New" w:hAnsi="Courier New" w:cs="Courier New"/>
-          <w:sz w:val="20"/>
-          <w:szCs w:val="20"/>
-          <w:lang w:val="en-US"/>
-        </w:rPr>
-      </w:pPr>
-      <w:r>
-        <w:rPr>
-          <w:rFonts w:ascii="Courier New" w:hAnsi="Courier New" w:cs="Courier New"/>
-          <w:sz w:val="20"/>
-          <w:szCs w:val="20"/>
-          <w:lang w:val="en-US"/>
-        </w:rPr>
-        <w:t xml:space="preserve">                log &lt;&lt; tc_id &lt;&lt; " -&gt; Inputs: a=" &lt;&lt; a &lt;&lt; ", b=" &lt;&lt; b &lt;&lt; ", h=" &lt;&lt; h</w:t>
-      </w:r>
-    </w:p>
-    <w:p>
-      <w:pPr>
-        <w:rPr>
-          <w:rFonts w:ascii="Courier New" w:hAnsi="Courier New" w:cs="Courier New"/>
-          <w:sz w:val="20"/>
-          <w:szCs w:val="20"/>
-          <w:lang w:val="en-US"/>
-        </w:rPr>
-      </w:pPr>
-      <w:r>
-        <w:rPr>
-          <w:rFonts w:ascii="Courier New" w:hAnsi="Courier New" w:cs="Courier New"/>
-          <w:sz w:val="20"/>
-          <w:szCs w:val="20"/>
-          <w:lang w:val="en-US"/>
-        </w:rPr>
-        <w:t xml:space="preserve">                    &lt;&lt; " -&gt; Expected Volume: " &lt;&lt; expectedVolume</w:t>
-      </w:r>
-    </w:p>
-    <w:p>
-      <w:pPr>
-        <w:rPr>
-          <w:rFonts w:ascii="Courier New" w:hAnsi="Courier New" w:cs="Courier New"/>
-          <w:sz w:val="20"/>
-          <w:szCs w:val="20"/>
-          <w:lang w:val="en-US"/>
-        </w:rPr>
-      </w:pPr>
-      <w:r>
-        <w:rPr>
-          <w:rFonts w:ascii="Courier New" w:hAnsi="Courier New" w:cs="Courier New"/>
-          <w:sz w:val="20"/>
-          <w:szCs w:val="20"/>
-          <w:lang w:val="en-US"/>
-        </w:rPr>
-        <w:t xml:space="preserve">                    &lt;&lt; " -&gt; Actual Volume: " &lt;&lt; actualVolume</w:t>
-      </w:r>
-    </w:p>
-    <w:p>
-      <w:pPr>
-        <w:rPr>
-          <w:rFonts w:ascii="Courier New" w:hAnsi="Courier New" w:cs="Courier New"/>
-          <w:sz w:val="20"/>
-          <w:szCs w:val="20"/>
-          <w:lang w:val="en-US"/>
-        </w:rPr>
-      </w:pPr>
-      <w:r>
-        <w:rPr>
-          <w:rFonts w:ascii="Courier New" w:hAnsi="Courier New" w:cs="Courier New"/>
-          <w:sz w:val="20"/>
-          <w:szCs w:val="20"/>
-          <w:lang w:val="en-US"/>
-        </w:rPr>
-        <w:t xml:space="preserve">                    &lt;&lt; " -&gt; Result: " &lt;&lt; result &lt;&lt; endl;</w:t>
-      </w:r>
-    </w:p>
-    <w:p>
-      <w:pPr>
-        <w:rPr>
-          <w:rFonts w:ascii="Courier New" w:hAnsi="Courier New" w:cs="Courier New"/>
-          <w:sz w:val="20"/>
-          <w:szCs w:val="20"/>
-          <w:lang w:val="en-US"/>
-        </w:rPr>
-      </w:pPr>
-    </w:p>
-    <w:p>
-      <w:pPr>
-        <w:rPr>
-          <w:rFonts w:ascii="Courier New" w:hAnsi="Courier New" w:cs="Courier New"/>
-          <w:sz w:val="20"/>
-          <w:szCs w:val="20"/>
-          <w:lang w:val="en-US"/>
-        </w:rPr>
-      </w:pPr>
-      <w:r>
-        <w:rPr>
-          <w:rFonts w:ascii="Courier New" w:hAnsi="Courier New" w:cs="Courier New"/>
-          <w:sz w:val="20"/>
-          <w:szCs w:val="20"/>
-          <w:lang w:val="en-US"/>
-        </w:rPr>
-        <w:t xml:space="preserve">                cout &lt;&lt; tc_id &lt;&lt; ": " &lt;&lt; result &lt;&lt; endl;</w:t>
-      </w:r>
-    </w:p>
-    <w:p>
-      <w:pPr>
-        <w:rPr>
-          <w:rFonts w:ascii="Courier New" w:hAnsi="Courier New" w:cs="Courier New"/>
-          <w:sz w:val="20"/>
-          <w:szCs w:val="20"/>
-          <w:lang w:val="en-US"/>
-        </w:rPr>
-      </w:pPr>
-      <w:r>
-        <w:rPr>
-          <w:rFonts w:ascii="Courier New" w:hAnsi="Courier New" w:cs="Courier New"/>
-          <w:sz w:val="20"/>
-          <w:szCs w:val="20"/>
-          <w:lang w:val="en-US"/>
-        </w:rPr>
-        <w:t xml:space="preserve">            }</w:t>
-      </w:r>
-    </w:p>
-    <w:p>
-      <w:pPr>
-        <w:rPr>
-          <w:rFonts w:ascii="Courier New" w:hAnsi="Courier New" w:cs="Courier New"/>
-          <w:sz w:val="20"/>
-          <w:szCs w:val="20"/>
-          <w:lang w:val="en-US"/>
-        </w:rPr>
-      </w:pPr>
-      <w:r>
-        <w:rPr>
-          <w:rFonts w:ascii="Courier New" w:hAnsi="Courier New" w:cs="Courier New"/>
-          <w:sz w:val="20"/>
-          <w:szCs w:val="20"/>
-          <w:lang w:val="en-US"/>
-        </w:rPr>
-        <w:t xml:space="preserve">            testFile.close();</w:t>
-      </w:r>
-    </w:p>
-    <w:p>
-      <w:pPr>
-        <w:rPr>
-          <w:rFonts w:ascii="Courier New" w:hAnsi="Courier New" w:cs="Courier New"/>
-          <w:sz w:val="20"/>
-          <w:szCs w:val="20"/>
-          <w:lang w:val="en-US"/>
-        </w:rPr>
-      </w:pPr>
-      <w:r>
-        <w:rPr>
-          <w:rFonts w:ascii="Courier New" w:hAnsi="Courier New" w:cs="Courier New"/>
-          <w:sz w:val="20"/>
-          <w:szCs w:val="20"/>
-          <w:lang w:val="en-US"/>
-        </w:rPr>
-        <w:t xml:space="preserve">        }</w:t>
-      </w:r>
-    </w:p>
-    <w:p>
-      <w:pPr>
-        <w:rPr>
-          <w:rFonts w:ascii="Courier New" w:hAnsi="Courier New" w:cs="Courier New"/>
-          <w:sz w:val="20"/>
-          <w:szCs w:val="20"/>
-          <w:lang w:val="en-US"/>
-        </w:rPr>
-      </w:pPr>
-      <w:r>
-        <w:rPr>
-          <w:rFonts w:ascii="Courier New" w:hAnsi="Courier New" w:cs="Courier New"/>
-          <w:sz w:val="20"/>
-          <w:szCs w:val="20"/>
-          <w:lang w:val="en-US"/>
-        </w:rPr>
-        <w:t xml:space="preserve">    };</w:t>
-      </w:r>
-    </w:p>
-    <w:p>
-      <w:pPr>
-        <w:rPr>
-          <w:rFonts w:ascii="Courier New" w:hAnsi="Courier New" w:cs="Courier New"/>
-          <w:sz w:val="20"/>
-          <w:szCs w:val="20"/>
-          <w:lang w:val="en-US"/>
-        </w:rPr>
-      </w:pPr>
-      <w:r>
-        <w:rPr>
-          <w:rFonts w:ascii="Courier New" w:hAnsi="Courier New" w:cs="Courier New"/>
-          <w:sz w:val="20"/>
-          <w:szCs w:val="20"/>
-          <w:lang w:val="en-US"/>
-        </w:rPr>
-        <w:t xml:space="preserve">    TestRunner::executeTestSuite("../../TestSuite/test_suite_01.txt", logFile);</w:t>
-      </w:r>
-    </w:p>
-    <w:p>
-      <w:pPr>
-        <w:rPr>
-          <w:rFonts w:ascii="Courier New" w:hAnsi="Courier New" w:cs="Courier New"/>
-          <w:sz w:val="20"/>
-          <w:szCs w:val="20"/>
-          <w:lang w:val="en-US"/>
-        </w:rPr>
-      </w:pPr>
-    </w:p>
-    <w:p>
-      <w:pPr>
-        <w:rPr>
-          <w:rFonts w:ascii="Courier New" w:hAnsi="Courier New" w:cs="Courier New"/>
-          <w:sz w:val="20"/>
-          <w:szCs w:val="20"/>
-          <w:lang w:val="en-US"/>
-        </w:rPr>
-      </w:pPr>
-      <w:r>
-        <w:rPr>
-          <w:rFonts w:ascii="Courier New" w:hAnsi="Courier New" w:cs="Courier New"/>
-          <w:sz w:val="20"/>
-          <w:szCs w:val="20"/>
-          <w:lang w:val="en-US"/>
-        </w:rPr>
-        <w:t xml:space="preserve">    logFile &lt;&lt; "=== ТЕСТУВАННЯ ЗАВЕРШЕНО ===" &lt;&lt; endl;</w:t>
-      </w:r>
-    </w:p>
-    <w:p>
-      <w:pPr>
-        <w:rPr>
-          <w:rFonts w:ascii="Courier New" w:hAnsi="Courier New" w:cs="Courier New"/>
-          <w:sz w:val="20"/>
-          <w:szCs w:val="20"/>
-          <w:lang w:val="en-US"/>
-        </w:rPr>
-      </w:pPr>
-      <w:r>
-        <w:rPr>
-          <w:rFonts w:ascii="Courier New" w:hAnsi="Courier New" w:cs="Courier New"/>
-          <w:sz w:val="20"/>
-          <w:szCs w:val="20"/>
-          <w:lang w:val="en-US"/>
-        </w:rPr>
-        <w:t xml:space="preserve">    logFile.close();</w:t>
-      </w:r>
-    </w:p>
-    <w:p>
-      <w:pPr>
-        <w:rPr>
-          <w:rFonts w:ascii="Courier New" w:hAnsi="Courier New" w:cs="Courier New"/>
-          <w:sz w:val="20"/>
-          <w:szCs w:val="20"/>
-          <w:lang w:val="en-US"/>
-        </w:rPr>
-      </w:pPr>
-    </w:p>
-    <w:p>
-      <w:pPr>
-        <w:rPr>
-          <w:rFonts w:ascii="Courier New" w:hAnsi="Courier New" w:cs="Courier New"/>
-          <w:sz w:val="20"/>
-          <w:szCs w:val="20"/>
+        <w:t>:</w:t>
+      </w:r>
+    </w:p>
+    <w:p>
+      <w:pPr>
+        <w:rPr>
+          <w:sz w:val="28"/>
+          <w:szCs w:val="28"/>
           <w:lang w:val="ru-RU"/>
         </w:rPr>
       </w:pPr>
-      <w:r>
-        <w:rPr>
-          <w:rFonts w:ascii="Courier New" w:hAnsi="Courier New" w:cs="Courier New"/>
-          <w:sz w:val="20"/>
-          <w:szCs w:val="20"/>
-          <w:lang w:val="en-US"/>
-        </w:rPr>
-        <w:t xml:space="preserve">    cout</w:t>
-      </w:r>
-      <w:r>
-        <w:rPr>
-          <w:rFonts w:ascii="Courier New" w:hAnsi="Courier New" w:cs="Courier New"/>
-          <w:sz w:val="20"/>
-          <w:szCs w:val="20"/>
+    </w:p>
+    <w:p>
+      <w:pPr>
+        <w:pStyle w:val="a8"/>
+        <w:numPr>
+          <w:ilvl w:val="0"/>
+          <w:numId w:val="27"/>
+        </w:numPr>
+        <w:spacing w:line="360" w:lineRule="auto"/>
+        <w:ind w:left="0" w:firstLine="720"/>
+        <w:mirrorIndents/>
+        <w:jc w:val="both"/>
+        <w:rPr>
+          <w:sz w:val="28"/>
+          <w:szCs w:val="28"/>
+        </w:rPr>
+      </w:pPr>
+      <w:r>
+        <w:rPr>
+          <w:sz w:val="28"/>
+          <w:szCs w:val="28"/>
+        </w:rPr>
+        <w:t xml:space="preserve">Опановано принципи концептуалізації предметної області на прикладі сутності "Акваріум". </w:t>
+      </w:r>
+    </w:p>
+    <w:p>
+      <w:pPr>
+        <w:pStyle w:val="a8"/>
+        <w:numPr>
+          <w:ilvl w:val="0"/>
+          <w:numId w:val="27"/>
+        </w:numPr>
+        <w:spacing w:line="360" w:lineRule="auto"/>
+        <w:ind w:left="0" w:firstLine="720"/>
+        <w:mirrorIndents/>
+        <w:jc w:val="both"/>
+        <w:rPr>
+          <w:sz w:val="28"/>
+          <w:szCs w:val="28"/>
+        </w:rPr>
+      </w:pPr>
+      <w:r>
+        <w:rPr>
+          <w:sz w:val="28"/>
+          <w:szCs w:val="28"/>
+        </w:rPr>
+        <w:lastRenderedPageBreak/>
+        <w:t xml:space="preserve">Проведено об'єктний аналіз геометричних та фізичних властивостей прямокутного паралелепіпеда. </w:t>
+      </w:r>
+    </w:p>
+    <w:p>
+      <w:pPr>
+        <w:pStyle w:val="a8"/>
+        <w:numPr>
+          <w:ilvl w:val="0"/>
+          <w:numId w:val="27"/>
+        </w:numPr>
+        <w:spacing w:line="360" w:lineRule="auto"/>
+        <w:ind w:left="0" w:firstLine="720"/>
+        <w:mirrorIndents/>
+        <w:jc w:val="both"/>
+        <w:rPr>
+          <w:sz w:val="28"/>
+          <w:szCs w:val="28"/>
+        </w:rPr>
+      </w:pPr>
+      <w:r>
+        <w:rPr>
+          <w:sz w:val="28"/>
+          <w:szCs w:val="28"/>
+        </w:rPr>
+        <w:t xml:space="preserve">Визначено необхідний та достатній набір інтерфейсів для взаємодії з об'єктом класу. </w:t>
+      </w:r>
+    </w:p>
+    <w:p>
+      <w:pPr>
+        <w:pStyle w:val="a8"/>
+        <w:numPr>
+          <w:ilvl w:val="0"/>
+          <w:numId w:val="27"/>
+        </w:numPr>
+        <w:spacing w:line="360" w:lineRule="auto"/>
+        <w:ind w:left="0" w:firstLine="720"/>
+        <w:mirrorIndents/>
+        <w:jc w:val="both"/>
+        <w:rPr>
+          <w:sz w:val="28"/>
+          <w:szCs w:val="28"/>
+        </w:rPr>
+      </w:pPr>
+      <w:r>
+        <w:rPr>
+          <w:sz w:val="28"/>
+          <w:szCs w:val="28"/>
+        </w:rPr>
+        <w:t xml:space="preserve">Успішно застосовано міжнародний стандарт ISO/IEC 12207 на етапі проєктування архітектури класу. </w:t>
+      </w:r>
+    </w:p>
+    <w:p>
+      <w:pPr>
+        <w:pStyle w:val="a8"/>
+        <w:numPr>
+          <w:ilvl w:val="0"/>
+          <w:numId w:val="27"/>
+        </w:numPr>
+        <w:spacing w:line="360" w:lineRule="auto"/>
+        <w:ind w:left="0" w:firstLine="720"/>
+        <w:mirrorIndents/>
+        <w:jc w:val="both"/>
+        <w:rPr>
+          <w:sz w:val="28"/>
+          <w:szCs w:val="28"/>
+        </w:rPr>
+      </w:pPr>
+      <w:r>
+        <w:rPr>
+          <w:sz w:val="28"/>
+          <w:szCs w:val="28"/>
+        </w:rPr>
+        <w:t xml:space="preserve">Реалізовано формальне представлення абстракції сутності у вигляді абстрактного типу даних (ADT). </w:t>
+      </w:r>
+    </w:p>
+    <w:p>
+      <w:pPr>
+        <w:pStyle w:val="a8"/>
+        <w:numPr>
+          <w:ilvl w:val="0"/>
+          <w:numId w:val="27"/>
+        </w:numPr>
+        <w:spacing w:line="360" w:lineRule="auto"/>
+        <w:ind w:left="0" w:firstLine="720"/>
+        <w:mirrorIndents/>
+        <w:jc w:val="both"/>
+        <w:rPr>
+          <w:sz w:val="28"/>
+          <w:szCs w:val="28"/>
+        </w:rPr>
+      </w:pPr>
+      <w:r>
+        <w:rPr>
+          <w:sz w:val="28"/>
+          <w:szCs w:val="28"/>
+        </w:rPr>
+        <w:t xml:space="preserve">Доведено доцільність використання типу даних class замість struct для забезпечення повної інкапсуляції. </w:t>
+      </w:r>
+    </w:p>
+    <w:p>
+      <w:pPr>
+        <w:pStyle w:val="a8"/>
+        <w:numPr>
+          <w:ilvl w:val="0"/>
+          <w:numId w:val="27"/>
+        </w:numPr>
+        <w:spacing w:line="360" w:lineRule="auto"/>
+        <w:ind w:left="0" w:firstLine="720"/>
+        <w:mirrorIndents/>
+        <w:jc w:val="both"/>
+        <w:rPr>
+          <w:sz w:val="28"/>
+          <w:szCs w:val="28"/>
+        </w:rPr>
+      </w:pPr>
+      <w:r>
+        <w:rPr>
+          <w:sz w:val="28"/>
+          <w:szCs w:val="28"/>
+        </w:rPr>
+        <w:t xml:space="preserve">Створено та налаштовано унікальний ідентифікатор класу виду ClassLab12_Прізвище. </w:t>
+      </w:r>
+    </w:p>
+    <w:p>
+      <w:pPr>
+        <w:pStyle w:val="a8"/>
+        <w:numPr>
+          <w:ilvl w:val="0"/>
+          <w:numId w:val="27"/>
+        </w:numPr>
+        <w:spacing w:line="360" w:lineRule="auto"/>
+        <w:ind w:left="0" w:firstLine="720"/>
+        <w:mirrorIndents/>
+        <w:jc w:val="both"/>
+        <w:rPr>
+          <w:sz w:val="28"/>
+          <w:szCs w:val="28"/>
+        </w:rPr>
+      </w:pPr>
+      <w:r>
+        <w:rPr>
+          <w:sz w:val="28"/>
+          <w:szCs w:val="28"/>
+        </w:rPr>
+        <w:t xml:space="preserve">Освоєно розподіл рівнів доступу в класі для захисту цілісності внутрішнього стану об'єкта. </w:t>
+      </w:r>
+    </w:p>
+    <w:p>
+      <w:pPr>
+        <w:pStyle w:val="a8"/>
+        <w:numPr>
+          <w:ilvl w:val="0"/>
+          <w:numId w:val="27"/>
+        </w:numPr>
+        <w:spacing w:line="360" w:lineRule="auto"/>
+        <w:ind w:left="0" w:firstLine="720"/>
+        <w:mirrorIndents/>
+        <w:jc w:val="both"/>
+        <w:rPr>
+          <w:sz w:val="28"/>
+          <w:szCs w:val="28"/>
+        </w:rPr>
+      </w:pPr>
+      <w:r>
+        <w:rPr>
+          <w:sz w:val="28"/>
+          <w:szCs w:val="28"/>
+        </w:rPr>
+        <w:t xml:space="preserve">Реалізовано секцію private для приховання внутрішніх даних-членів від прямого зовнішнього втручання. </w:t>
+      </w:r>
+    </w:p>
+    <w:p>
+      <w:pPr>
+        <w:pStyle w:val="a8"/>
+        <w:numPr>
+          <w:ilvl w:val="0"/>
+          <w:numId w:val="27"/>
+        </w:numPr>
+        <w:spacing w:line="360" w:lineRule="auto"/>
+        <w:ind w:left="0" w:firstLine="720"/>
+        <w:mirrorIndents/>
+        <w:jc w:val="both"/>
+        <w:rPr>
+          <w:sz w:val="28"/>
+          <w:szCs w:val="28"/>
+        </w:rPr>
+      </w:pPr>
+      <w:r>
+        <w:rPr>
+          <w:sz w:val="28"/>
+          <w:szCs w:val="28"/>
+        </w:rPr>
+        <w:t xml:space="preserve">Створено секцію public для оголошення відкритих функцій-членів (інтерфейсу класу). </w:t>
+      </w:r>
+    </w:p>
+    <w:p>
+      <w:pPr>
+        <w:pStyle w:val="a8"/>
+        <w:numPr>
+          <w:ilvl w:val="0"/>
+          <w:numId w:val="27"/>
+        </w:numPr>
+        <w:spacing w:line="360" w:lineRule="auto"/>
+        <w:ind w:left="0" w:firstLine="720"/>
+        <w:mirrorIndents/>
+        <w:jc w:val="both"/>
+        <w:rPr>
+          <w:sz w:val="28"/>
+          <w:szCs w:val="28"/>
+        </w:rPr>
+      </w:pPr>
+      <w:r>
+        <w:rPr>
+          <w:sz w:val="28"/>
+          <w:szCs w:val="28"/>
+        </w:rPr>
+        <w:t>Виділено закриті атрибути довжини (a), ширини (b) та висоти (h) акваріума як private змінні.</w:t>
+      </w:r>
+    </w:p>
+    <w:p>
+      <w:pPr>
+        <w:pStyle w:val="a8"/>
+        <w:numPr>
+          <w:ilvl w:val="0"/>
+          <w:numId w:val="27"/>
+        </w:numPr>
+        <w:spacing w:line="360" w:lineRule="auto"/>
+        <w:ind w:left="0" w:firstLine="720"/>
+        <w:mirrorIndents/>
+        <w:jc w:val="both"/>
+        <w:rPr>
+          <w:sz w:val="28"/>
+          <w:szCs w:val="28"/>
+        </w:rPr>
+      </w:pPr>
+      <w:r>
+        <w:rPr>
+          <w:sz w:val="28"/>
+          <w:szCs w:val="28"/>
+        </w:rPr>
+        <w:t>Обґрунтовано використання типу даних з плаваючою крапкою для геометричних вимірів.</w:t>
+      </w:r>
+    </w:p>
+    <w:p>
+      <w:pPr>
+        <w:pStyle w:val="a8"/>
+        <w:numPr>
+          <w:ilvl w:val="0"/>
+          <w:numId w:val="27"/>
+        </w:numPr>
+        <w:spacing w:line="360" w:lineRule="auto"/>
+        <w:ind w:left="0" w:firstLine="720"/>
+        <w:mirrorIndents/>
+        <w:jc w:val="both"/>
+        <w:rPr>
+          <w:sz w:val="28"/>
+          <w:szCs w:val="28"/>
+        </w:rPr>
+      </w:pPr>
+      <w:r>
+        <w:rPr>
+          <w:sz w:val="28"/>
+          <w:szCs w:val="28"/>
+        </w:rPr>
+        <w:t xml:space="preserve">Набуто практичних навичок конструювання об'єктів за допомогою С++ конструкторів. </w:t>
+      </w:r>
+    </w:p>
+    <w:p>
+      <w:pPr>
+        <w:pStyle w:val="a8"/>
+        <w:numPr>
+          <w:ilvl w:val="0"/>
+          <w:numId w:val="27"/>
+        </w:numPr>
+        <w:spacing w:line="360" w:lineRule="auto"/>
+        <w:ind w:left="0" w:firstLine="720"/>
+        <w:mirrorIndents/>
+        <w:jc w:val="both"/>
+        <w:rPr>
+          <w:sz w:val="28"/>
+          <w:szCs w:val="28"/>
+        </w:rPr>
+      </w:pPr>
+      <w:r>
+        <w:rPr>
+          <w:sz w:val="28"/>
+          <w:szCs w:val="28"/>
+        </w:rPr>
+        <w:t xml:space="preserve">Реалізовано початкову ініціалізацію всіх атрибутів класу безпосередньо під час створення екземпляра. </w:t>
+      </w:r>
+    </w:p>
+    <w:p>
+      <w:pPr>
+        <w:pStyle w:val="a8"/>
+        <w:numPr>
+          <w:ilvl w:val="0"/>
+          <w:numId w:val="27"/>
+        </w:numPr>
+        <w:spacing w:line="360" w:lineRule="auto"/>
+        <w:ind w:left="0" w:firstLine="720"/>
+        <w:mirrorIndents/>
+        <w:jc w:val="both"/>
+        <w:rPr>
+          <w:sz w:val="28"/>
+          <w:szCs w:val="28"/>
+        </w:rPr>
+      </w:pPr>
+      <w:r>
+        <w:rPr>
+          <w:sz w:val="28"/>
+          <w:szCs w:val="28"/>
+        </w:rPr>
+        <w:t xml:space="preserve">Досліджено використання конструктора з параметрами за замовчуванням для запобігання неініціалізованих станів. </w:t>
+      </w:r>
+    </w:p>
+    <w:p>
+      <w:pPr>
+        <w:pStyle w:val="a8"/>
+        <w:numPr>
+          <w:ilvl w:val="0"/>
+          <w:numId w:val="27"/>
+        </w:numPr>
+        <w:spacing w:line="360" w:lineRule="auto"/>
+        <w:ind w:left="0" w:firstLine="720"/>
+        <w:mirrorIndents/>
+        <w:jc w:val="both"/>
+        <w:rPr>
+          <w:sz w:val="28"/>
+          <w:szCs w:val="28"/>
+        </w:rPr>
+      </w:pPr>
+      <w:r>
+        <w:rPr>
+          <w:sz w:val="28"/>
+          <w:szCs w:val="28"/>
+        </w:rPr>
+        <w:t xml:space="preserve">Засвоєно неможливість оголошення конструктора з закритим рівнем доступу (private) для створення об'єктів у main. </w:t>
+      </w:r>
+    </w:p>
+    <w:p>
+      <w:pPr>
+        <w:pStyle w:val="a8"/>
+        <w:numPr>
+          <w:ilvl w:val="0"/>
+          <w:numId w:val="27"/>
+        </w:numPr>
+        <w:spacing w:line="360" w:lineRule="auto"/>
+        <w:ind w:left="0" w:firstLine="720"/>
+        <w:mirrorIndents/>
+        <w:jc w:val="both"/>
+        <w:rPr>
+          <w:sz w:val="28"/>
+          <w:szCs w:val="28"/>
+        </w:rPr>
+      </w:pPr>
+      <w:r>
+        <w:rPr>
+          <w:sz w:val="28"/>
+          <w:szCs w:val="28"/>
+        </w:rPr>
+        <w:t xml:space="preserve">Вивчено механізм перевантаження функцій-членів класу на прикладі різних варіантів конструктора. </w:t>
+      </w:r>
+    </w:p>
+    <w:p>
+      <w:pPr>
+        <w:pStyle w:val="a8"/>
+        <w:numPr>
+          <w:ilvl w:val="0"/>
+          <w:numId w:val="27"/>
+        </w:numPr>
+        <w:spacing w:line="360" w:lineRule="auto"/>
+        <w:ind w:left="0" w:firstLine="720"/>
+        <w:mirrorIndents/>
+        <w:jc w:val="both"/>
+        <w:rPr>
+          <w:sz w:val="28"/>
+          <w:szCs w:val="28"/>
+        </w:rPr>
+      </w:pPr>
+      <w:r>
+        <w:rPr>
+          <w:sz w:val="28"/>
+          <w:szCs w:val="28"/>
+        </w:rPr>
+        <w:lastRenderedPageBreak/>
+        <w:t>Реалізовано відкриті функції доступу (get-методи) для безпечного читання значень атрибутів.</w:t>
+      </w:r>
+    </w:p>
+    <w:p>
+      <w:pPr>
+        <w:pStyle w:val="a8"/>
+        <w:numPr>
+          <w:ilvl w:val="0"/>
+          <w:numId w:val="27"/>
+        </w:numPr>
+        <w:spacing w:line="360" w:lineRule="auto"/>
+        <w:ind w:left="0" w:firstLine="720"/>
+        <w:mirrorIndents/>
+        <w:jc w:val="both"/>
+        <w:rPr>
+          <w:sz w:val="28"/>
+          <w:szCs w:val="28"/>
+        </w:rPr>
+      </w:pPr>
+      <w:r>
+        <w:rPr>
+          <w:sz w:val="28"/>
+          <w:szCs w:val="28"/>
+        </w:rPr>
+        <w:t xml:space="preserve">Створено відкриті функції модифікації (set-методи) для зміни лінійних розмірів акваріума. </w:t>
+      </w:r>
+    </w:p>
+    <w:p>
+      <w:pPr>
+        <w:pStyle w:val="a8"/>
+        <w:numPr>
+          <w:ilvl w:val="0"/>
+          <w:numId w:val="27"/>
+        </w:numPr>
+        <w:spacing w:line="360" w:lineRule="auto"/>
+        <w:ind w:left="0" w:firstLine="720"/>
+        <w:mirrorIndents/>
+        <w:jc w:val="both"/>
+        <w:rPr>
+          <w:sz w:val="28"/>
+          <w:szCs w:val="28"/>
+        </w:rPr>
+      </w:pPr>
+      <w:r>
+        <w:rPr>
+          <w:sz w:val="28"/>
+          <w:szCs w:val="28"/>
+        </w:rPr>
+        <w:t>Впроваджено обов'язкову валідацію вхідних даних у set-методах для виключення від'ємних чи нульових розмірів.</w:t>
+      </w:r>
+    </w:p>
+    <w:p>
+      <w:pPr>
+        <w:pStyle w:val="a8"/>
+        <w:numPr>
+          <w:ilvl w:val="0"/>
+          <w:numId w:val="27"/>
+        </w:numPr>
+        <w:spacing w:line="360" w:lineRule="auto"/>
+        <w:ind w:left="0" w:firstLine="720"/>
+        <w:mirrorIndents/>
+        <w:jc w:val="both"/>
+        <w:rPr>
+          <w:sz w:val="28"/>
+          <w:szCs w:val="28"/>
+        </w:rPr>
+      </w:pPr>
+      <w:r>
+        <w:rPr>
+          <w:sz w:val="28"/>
+          <w:szCs w:val="28"/>
+        </w:rPr>
+        <w:t>Доведено важливість генерації помилок або ігнорування некоректних значень при спробі порушити логіку об'єкта.</w:t>
+      </w:r>
+    </w:p>
+    <w:p>
+      <w:pPr>
+        <w:pStyle w:val="a8"/>
+        <w:numPr>
+          <w:ilvl w:val="0"/>
+          <w:numId w:val="27"/>
+        </w:numPr>
+        <w:spacing w:line="360" w:lineRule="auto"/>
+        <w:ind w:left="0" w:firstLine="720"/>
+        <w:mirrorIndents/>
+        <w:jc w:val="both"/>
+        <w:rPr>
+          <w:sz w:val="28"/>
+          <w:szCs w:val="28"/>
+        </w:rPr>
+      </w:pPr>
+      <w:r>
+        <w:rPr>
+          <w:sz w:val="28"/>
+          <w:szCs w:val="28"/>
+        </w:rPr>
+        <w:t>Реалізовано метод обчислення об'єму акваріума за формулою прямокутного паралелепіпеда V = a * b * h.</w:t>
+      </w:r>
+    </w:p>
+    <w:p>
+      <w:pPr>
+        <w:pStyle w:val="a8"/>
+        <w:numPr>
+          <w:ilvl w:val="0"/>
+          <w:numId w:val="27"/>
+        </w:numPr>
+        <w:spacing w:line="360" w:lineRule="auto"/>
+        <w:ind w:left="0" w:firstLine="720"/>
+        <w:mirrorIndents/>
+        <w:jc w:val="both"/>
+        <w:rPr>
+          <w:sz w:val="28"/>
+          <w:szCs w:val="28"/>
+        </w:rPr>
+      </w:pPr>
+      <w:r>
+        <w:rPr>
+          <w:sz w:val="28"/>
+          <w:szCs w:val="28"/>
+        </w:rPr>
+        <w:t>Перевірено коректність повернення результату розрахунку об'єму через відповідну функцію-член.</w:t>
+      </w:r>
+    </w:p>
+    <w:p>
+      <w:pPr>
+        <w:pStyle w:val="a8"/>
+        <w:numPr>
+          <w:ilvl w:val="0"/>
+          <w:numId w:val="27"/>
+        </w:numPr>
+        <w:spacing w:line="360" w:lineRule="auto"/>
+        <w:ind w:left="0" w:firstLine="720"/>
+        <w:mirrorIndents/>
+        <w:jc w:val="both"/>
+        <w:rPr>
+          <w:sz w:val="28"/>
+          <w:szCs w:val="28"/>
+        </w:rPr>
+      </w:pPr>
+      <w:r>
+        <w:rPr>
+          <w:sz w:val="28"/>
+          <w:szCs w:val="28"/>
+        </w:rPr>
+        <w:t xml:space="preserve">Освоєно синтаксис винесення реалізації складних функцій-членів за межі тіла самого класу. </w:t>
+      </w:r>
+    </w:p>
+    <w:p>
+      <w:pPr>
+        <w:pStyle w:val="a8"/>
+        <w:numPr>
+          <w:ilvl w:val="0"/>
+          <w:numId w:val="27"/>
+        </w:numPr>
+        <w:spacing w:line="360" w:lineRule="auto"/>
+        <w:ind w:left="0" w:firstLine="720"/>
+        <w:mirrorIndents/>
+        <w:jc w:val="both"/>
+        <w:rPr>
+          <w:sz w:val="28"/>
+          <w:szCs w:val="28"/>
+        </w:rPr>
+      </w:pPr>
+      <w:r>
+        <w:rPr>
+          <w:sz w:val="28"/>
+          <w:szCs w:val="28"/>
+        </w:rPr>
+        <w:t xml:space="preserve">Успішно застосовано оператор розширення області видимості (::) для зв'язування зовнішнього коду з класом. </w:t>
+      </w:r>
+    </w:p>
+    <w:p>
+      <w:pPr>
+        <w:pStyle w:val="a8"/>
+        <w:numPr>
+          <w:ilvl w:val="0"/>
+          <w:numId w:val="27"/>
+        </w:numPr>
+        <w:spacing w:line="360" w:lineRule="auto"/>
+        <w:ind w:left="0" w:firstLine="720"/>
+        <w:mirrorIndents/>
+        <w:jc w:val="both"/>
+        <w:rPr>
+          <w:sz w:val="28"/>
+          <w:szCs w:val="28"/>
+        </w:rPr>
+      </w:pPr>
+      <w:r>
+        <w:rPr>
+          <w:sz w:val="28"/>
+          <w:szCs w:val="28"/>
+        </w:rPr>
+        <w:t xml:space="preserve">Закріплено правила ідентифікації приналежності функції до класу за допомогою кваліфікатора імені класу. </w:t>
+      </w:r>
+    </w:p>
+    <w:p>
+      <w:pPr>
+        <w:pStyle w:val="a8"/>
+        <w:numPr>
+          <w:ilvl w:val="0"/>
+          <w:numId w:val="27"/>
+        </w:numPr>
+        <w:spacing w:line="360" w:lineRule="auto"/>
+        <w:ind w:left="0" w:firstLine="720"/>
+        <w:mirrorIndents/>
+        <w:jc w:val="both"/>
+        <w:rPr>
+          <w:sz w:val="28"/>
+          <w:szCs w:val="28"/>
+        </w:rPr>
+      </w:pPr>
+      <w:r>
+        <w:rPr>
+          <w:sz w:val="28"/>
+          <w:szCs w:val="28"/>
+        </w:rPr>
+        <w:t xml:space="preserve">Створено автономний заголовковий файл ModulesПрізвище.h як самодостатній програмний модуль. </w:t>
+      </w:r>
+    </w:p>
+    <w:p>
+      <w:pPr>
+        <w:pStyle w:val="a8"/>
+        <w:numPr>
+          <w:ilvl w:val="0"/>
+          <w:numId w:val="27"/>
+        </w:numPr>
+        <w:spacing w:line="360" w:lineRule="auto"/>
+        <w:ind w:left="0" w:firstLine="720"/>
+        <w:mirrorIndents/>
+        <w:jc w:val="both"/>
+        <w:rPr>
+          <w:sz w:val="28"/>
+          <w:szCs w:val="28"/>
+        </w:rPr>
+      </w:pPr>
+      <w:r>
+        <w:rPr>
+          <w:sz w:val="28"/>
+          <w:szCs w:val="28"/>
+        </w:rPr>
+        <w:t xml:space="preserve">Вивчено препроцесорні директиви захисту від повторного включення заголовкового файла (#ifndef, #define, #endif). </w:t>
+      </w:r>
+    </w:p>
+    <w:p>
+      <w:pPr>
+        <w:pStyle w:val="a8"/>
+        <w:numPr>
+          <w:ilvl w:val="0"/>
+          <w:numId w:val="27"/>
+        </w:numPr>
+        <w:spacing w:line="360" w:lineRule="auto"/>
+        <w:ind w:left="0" w:firstLine="720"/>
+        <w:mirrorIndents/>
+        <w:jc w:val="both"/>
+        <w:rPr>
+          <w:sz w:val="28"/>
+          <w:szCs w:val="28"/>
+        </w:rPr>
+      </w:pPr>
+      <w:r>
+        <w:rPr>
+          <w:sz w:val="28"/>
+          <w:szCs w:val="28"/>
+        </w:rPr>
+        <w:t xml:space="preserve">Опановано інтеграцію проєкту заголовкового файлу, створеного в попередніх лабораторних роботах. </w:t>
+      </w:r>
+    </w:p>
+    <w:p>
+      <w:pPr>
+        <w:pStyle w:val="a8"/>
+        <w:numPr>
+          <w:ilvl w:val="0"/>
+          <w:numId w:val="27"/>
+        </w:numPr>
+        <w:spacing w:line="360" w:lineRule="auto"/>
+        <w:ind w:left="0" w:firstLine="720"/>
+        <w:mirrorIndents/>
+        <w:jc w:val="both"/>
+        <w:rPr>
+          <w:sz w:val="28"/>
+          <w:szCs w:val="28"/>
+        </w:rPr>
+      </w:pPr>
+      <w:r>
+        <w:rPr>
+          <w:sz w:val="28"/>
+          <w:szCs w:val="28"/>
+        </w:rPr>
+        <w:t xml:space="preserve">Досліджено розширення області видимості за допомогою просторів імен (namespace) в С++. </w:t>
+      </w:r>
+    </w:p>
+    <w:p>
+      <w:pPr>
+        <w:pStyle w:val="a8"/>
+        <w:numPr>
+          <w:ilvl w:val="0"/>
+          <w:numId w:val="27"/>
+        </w:numPr>
+        <w:spacing w:line="360" w:lineRule="auto"/>
+        <w:ind w:left="0" w:firstLine="720"/>
+        <w:mirrorIndents/>
+        <w:jc w:val="both"/>
+        <w:rPr>
+          <w:sz w:val="28"/>
+          <w:szCs w:val="28"/>
+        </w:rPr>
+      </w:pPr>
+      <w:r>
+        <w:rPr>
+          <w:sz w:val="28"/>
+          <w:szCs w:val="28"/>
+        </w:rPr>
+        <w:t>Обґрунтовано переваги використання стандартного простору імен std через директиву using namespace std.</w:t>
+      </w:r>
+    </w:p>
+    <w:p>
+      <w:pPr>
+        <w:pStyle w:val="a8"/>
+        <w:numPr>
+          <w:ilvl w:val="0"/>
+          <w:numId w:val="27"/>
+        </w:numPr>
+        <w:spacing w:line="360" w:lineRule="auto"/>
+        <w:ind w:left="0" w:firstLine="720"/>
+        <w:mirrorIndents/>
+        <w:jc w:val="both"/>
+        <w:rPr>
+          <w:sz w:val="28"/>
+          <w:szCs w:val="28"/>
+        </w:rPr>
+      </w:pPr>
+      <w:r>
+        <w:rPr>
+          <w:sz w:val="28"/>
+          <w:szCs w:val="28"/>
+        </w:rPr>
+        <w:t xml:space="preserve">Набуто навичок використання макросів та макрооператорів С/С++ на етапі препроцесорної обробки. </w:t>
+      </w:r>
+    </w:p>
+    <w:p>
+      <w:pPr>
+        <w:pStyle w:val="a8"/>
+        <w:numPr>
+          <w:ilvl w:val="0"/>
+          <w:numId w:val="27"/>
+        </w:numPr>
+        <w:spacing w:line="360" w:lineRule="auto"/>
+        <w:ind w:left="0" w:firstLine="720"/>
+        <w:mirrorIndents/>
+        <w:jc w:val="both"/>
+        <w:rPr>
+          <w:sz w:val="28"/>
+          <w:szCs w:val="28"/>
+        </w:rPr>
+      </w:pPr>
+      <w:r>
+        <w:rPr>
+          <w:sz w:val="28"/>
+          <w:szCs w:val="28"/>
+        </w:rPr>
+        <w:t xml:space="preserve">Виконано порівняльний аналіз функцій із параметрами за замовчуванням та класичних перевантажених функцій. </w:t>
+      </w:r>
+    </w:p>
+    <w:p>
+      <w:pPr>
+        <w:pStyle w:val="a8"/>
+        <w:numPr>
+          <w:ilvl w:val="0"/>
+          <w:numId w:val="27"/>
+        </w:numPr>
+        <w:spacing w:line="360" w:lineRule="auto"/>
+        <w:ind w:left="0" w:firstLine="720"/>
+        <w:mirrorIndents/>
+        <w:jc w:val="both"/>
+        <w:rPr>
+          <w:sz w:val="28"/>
+          <w:szCs w:val="28"/>
+        </w:rPr>
+      </w:pPr>
+      <w:r>
+        <w:rPr>
+          <w:sz w:val="28"/>
+          <w:szCs w:val="28"/>
+        </w:rPr>
+        <w:lastRenderedPageBreak/>
+        <w:t xml:space="preserve">Перевірено роботу оператора крапки (.) для безпосереднього доступу до відкритих методів екземпляра класу. </w:t>
+      </w:r>
+    </w:p>
+    <w:p>
+      <w:pPr>
+        <w:pStyle w:val="a8"/>
+        <w:numPr>
+          <w:ilvl w:val="0"/>
+          <w:numId w:val="27"/>
+        </w:numPr>
+        <w:spacing w:line="360" w:lineRule="auto"/>
+        <w:ind w:left="0" w:firstLine="720"/>
+        <w:mirrorIndents/>
+        <w:jc w:val="both"/>
+        <w:rPr>
+          <w:sz w:val="28"/>
+          <w:szCs w:val="28"/>
+        </w:rPr>
+      </w:pPr>
+      <w:r>
+        <w:rPr>
+          <w:sz w:val="28"/>
+          <w:szCs w:val="28"/>
+        </w:rPr>
+        <w:t xml:space="preserve">Закріплено навички використання оператора стрілки (-&gt;) при роботі з вказівниками на об'єкт класу. </w:t>
+      </w:r>
+    </w:p>
+    <w:p>
+      <w:pPr>
+        <w:pStyle w:val="a8"/>
+        <w:numPr>
+          <w:ilvl w:val="0"/>
+          <w:numId w:val="27"/>
+        </w:numPr>
+        <w:spacing w:line="360" w:lineRule="auto"/>
+        <w:ind w:left="0" w:firstLine="720"/>
+        <w:mirrorIndents/>
+        <w:jc w:val="both"/>
+        <w:rPr>
+          <w:sz w:val="28"/>
+          <w:szCs w:val="28"/>
+        </w:rPr>
+      </w:pPr>
+      <w:r>
+        <w:rPr>
+          <w:sz w:val="28"/>
+          <w:szCs w:val="28"/>
+        </w:rPr>
+        <w:t xml:space="preserve">Спроектовано окремий тестовий консольний додаток Teacher для автоматизації перевірки ПЗ. </w:t>
+      </w:r>
+    </w:p>
+    <w:p>
+      <w:pPr>
+        <w:pStyle w:val="a8"/>
+        <w:numPr>
+          <w:ilvl w:val="0"/>
+          <w:numId w:val="27"/>
+        </w:numPr>
+        <w:spacing w:line="360" w:lineRule="auto"/>
+        <w:ind w:left="0" w:firstLine="720"/>
+        <w:mirrorIndents/>
+        <w:jc w:val="both"/>
+        <w:rPr>
+          <w:sz w:val="28"/>
+          <w:szCs w:val="28"/>
+        </w:rPr>
+      </w:pPr>
+      <w:r>
+        <w:rPr>
+          <w:sz w:val="28"/>
+          <w:szCs w:val="28"/>
+        </w:rPr>
+        <w:t xml:space="preserve">Реалізовано алгоритм перевірки фізичного розташування файлу main.cpp перед початком тестування. </w:t>
+      </w:r>
+    </w:p>
+    <w:p>
+      <w:pPr>
+        <w:pStyle w:val="a8"/>
+        <w:numPr>
+          <w:ilvl w:val="0"/>
+          <w:numId w:val="27"/>
+        </w:numPr>
+        <w:spacing w:line="360" w:lineRule="auto"/>
+        <w:ind w:left="0" w:firstLine="720"/>
+        <w:mirrorIndents/>
+        <w:jc w:val="both"/>
+        <w:rPr>
+          <w:sz w:val="28"/>
+          <w:szCs w:val="28"/>
+        </w:rPr>
+      </w:pPr>
+      <w:r>
+        <w:rPr>
+          <w:sz w:val="28"/>
+          <w:szCs w:val="28"/>
+        </w:rPr>
+        <w:t xml:space="preserve">Впроваджено механізм генерації 100 звукових сигналів за допомогою функції Beep() у разі порушення структури папок. </w:t>
+      </w:r>
+    </w:p>
+    <w:p>
+      <w:pPr>
+        <w:pStyle w:val="a8"/>
+        <w:numPr>
+          <w:ilvl w:val="0"/>
+          <w:numId w:val="27"/>
+        </w:numPr>
+        <w:spacing w:line="360" w:lineRule="auto"/>
+        <w:ind w:left="0" w:firstLine="720"/>
+        <w:mirrorIndents/>
+        <w:jc w:val="both"/>
+        <w:rPr>
+          <w:sz w:val="28"/>
+          <w:szCs w:val="28"/>
+        </w:rPr>
+      </w:pPr>
+      <w:r>
+        <w:rPr>
+          <w:sz w:val="28"/>
+          <w:szCs w:val="28"/>
+        </w:rPr>
+        <w:t xml:space="preserve">Створено процедуру автоматичного запису попередження в текстовий файл TestResults.txt при невірному шляху проєкту. </w:t>
+      </w:r>
+    </w:p>
+    <w:p>
+      <w:pPr>
+        <w:pStyle w:val="a8"/>
+        <w:numPr>
+          <w:ilvl w:val="0"/>
+          <w:numId w:val="27"/>
+        </w:numPr>
+        <w:spacing w:line="360" w:lineRule="auto"/>
+        <w:ind w:left="0" w:firstLine="720"/>
+        <w:mirrorIndents/>
+        <w:jc w:val="both"/>
+        <w:rPr>
+          <w:sz w:val="28"/>
+          <w:szCs w:val="28"/>
+        </w:rPr>
+      </w:pPr>
+      <w:r>
+        <w:rPr>
+          <w:sz w:val="28"/>
+          <w:szCs w:val="28"/>
+        </w:rPr>
+        <w:t xml:space="preserve">Навчено програму відстежувати компіляційну адресу та підтверджувати її відповідність теці \Lab12\prj. </w:t>
+      </w:r>
+    </w:p>
+    <w:p>
+      <w:pPr>
+        <w:pStyle w:val="a8"/>
+        <w:numPr>
+          <w:ilvl w:val="0"/>
+          <w:numId w:val="27"/>
+        </w:numPr>
+        <w:spacing w:line="360" w:lineRule="auto"/>
+        <w:ind w:left="0" w:firstLine="720"/>
+        <w:mirrorIndents/>
+        <w:jc w:val="both"/>
+        <w:rPr>
+          <w:sz w:val="28"/>
+          <w:szCs w:val="28"/>
+        </w:rPr>
+      </w:pPr>
+      <w:r>
+        <w:rPr>
+          <w:sz w:val="28"/>
+          <w:szCs w:val="28"/>
+        </w:rPr>
+        <w:t xml:space="preserve">Розроблено та задокументовано унікальний текстовий формат представлення тест-кейсів (Test Cases). </w:t>
+      </w:r>
+    </w:p>
+    <w:p>
+      <w:pPr>
+        <w:pStyle w:val="a8"/>
+        <w:numPr>
+          <w:ilvl w:val="0"/>
+          <w:numId w:val="27"/>
+        </w:numPr>
+        <w:spacing w:line="360" w:lineRule="auto"/>
+        <w:ind w:left="0" w:firstLine="720"/>
+        <w:mirrorIndents/>
+        <w:jc w:val="both"/>
+        <w:rPr>
+          <w:sz w:val="28"/>
+          <w:szCs w:val="28"/>
+        </w:rPr>
+      </w:pPr>
+      <w:r>
+        <w:rPr>
+          <w:sz w:val="28"/>
+          <w:szCs w:val="28"/>
+        </w:rPr>
+        <w:t xml:space="preserve">Забезпечено коректне читання тест-кейсів із зовнішніх текстових файлів додатком Teacher. </w:t>
+      </w:r>
+    </w:p>
+    <w:p>
+      <w:pPr>
+        <w:pStyle w:val="a8"/>
+        <w:numPr>
+          <w:ilvl w:val="0"/>
+          <w:numId w:val="27"/>
+        </w:numPr>
+        <w:spacing w:line="360" w:lineRule="auto"/>
+        <w:ind w:left="0" w:firstLine="720"/>
+        <w:mirrorIndents/>
+        <w:jc w:val="both"/>
+        <w:rPr>
+          <w:sz w:val="28"/>
+          <w:szCs w:val="28"/>
+        </w:rPr>
+      </w:pPr>
+      <w:r>
+        <w:rPr>
+          <w:sz w:val="28"/>
+          <w:szCs w:val="28"/>
+        </w:rPr>
+        <w:t xml:space="preserve">Створено спеціальну теку \Lab12\TestSuite\ для збереження файлів наборів тестів (.txt). </w:t>
+      </w:r>
+    </w:p>
+    <w:p>
+      <w:pPr>
+        <w:pStyle w:val="a8"/>
+        <w:numPr>
+          <w:ilvl w:val="0"/>
+          <w:numId w:val="27"/>
+        </w:numPr>
+        <w:spacing w:line="360" w:lineRule="auto"/>
+        <w:ind w:left="0" w:firstLine="720"/>
+        <w:mirrorIndents/>
+        <w:jc w:val="both"/>
+        <w:rPr>
+          <w:sz w:val="28"/>
+          <w:szCs w:val="28"/>
+        </w:rPr>
+      </w:pPr>
+      <w:r>
+        <w:rPr>
+          <w:sz w:val="28"/>
+          <w:szCs w:val="28"/>
+        </w:rPr>
+        <w:t xml:space="preserve">Реалізовано локальний клас/функцію всередині програми Teacher для парсингу та обробки рядків тест-сьютів. </w:t>
+      </w:r>
+    </w:p>
+    <w:p>
+      <w:pPr>
+        <w:pStyle w:val="a8"/>
+        <w:numPr>
+          <w:ilvl w:val="0"/>
+          <w:numId w:val="27"/>
+        </w:numPr>
+        <w:spacing w:line="360" w:lineRule="auto"/>
+        <w:ind w:left="0" w:firstLine="720"/>
+        <w:mirrorIndents/>
+        <w:jc w:val="both"/>
+        <w:rPr>
+          <w:sz w:val="28"/>
+          <w:szCs w:val="28"/>
+        </w:rPr>
+      </w:pPr>
+      <w:r>
+        <w:rPr>
+          <w:sz w:val="28"/>
+          <w:szCs w:val="28"/>
+        </w:rPr>
+        <w:t>Застосовано стандартні файлові потоки ifstream для стабільного зчитування конфігурації тестів із диска.</w:t>
+      </w:r>
+    </w:p>
+    <w:p>
+      <w:pPr>
+        <w:pStyle w:val="a8"/>
+        <w:numPr>
+          <w:ilvl w:val="0"/>
+          <w:numId w:val="27"/>
+        </w:numPr>
+        <w:spacing w:line="360" w:lineRule="auto"/>
+        <w:ind w:left="0" w:firstLine="720"/>
+        <w:mirrorIndents/>
+        <w:jc w:val="both"/>
+        <w:rPr>
+          <w:sz w:val="28"/>
+          <w:szCs w:val="28"/>
+        </w:rPr>
+      </w:pPr>
+      <w:r>
+        <w:rPr>
+          <w:sz w:val="28"/>
+          <w:szCs w:val="28"/>
+        </w:rPr>
+        <w:t xml:space="preserve">Вивчено та впроваджено скорочену структуру тест-кейса: Test Case ID, Action, Expected Result, Test Result. </w:t>
+      </w:r>
+    </w:p>
+    <w:p>
+      <w:pPr>
+        <w:pStyle w:val="a8"/>
+        <w:numPr>
+          <w:ilvl w:val="0"/>
+          <w:numId w:val="27"/>
+        </w:numPr>
+        <w:spacing w:line="360" w:lineRule="auto"/>
+        <w:ind w:left="0" w:firstLine="720"/>
+        <w:mirrorIndents/>
+        <w:jc w:val="both"/>
+        <w:rPr>
+          <w:sz w:val="28"/>
+          <w:szCs w:val="28"/>
+        </w:rPr>
+      </w:pPr>
+      <w:r>
+        <w:rPr>
+          <w:sz w:val="28"/>
+          <w:szCs w:val="28"/>
+        </w:rPr>
+        <w:t xml:space="preserve">Підготовлено набір тест-кейсів для перевірки реакції об'єкта на некоректні розміри (від'ємні числа). </w:t>
+      </w:r>
+    </w:p>
+    <w:p>
+      <w:pPr>
+        <w:pStyle w:val="a8"/>
+        <w:numPr>
+          <w:ilvl w:val="0"/>
+          <w:numId w:val="27"/>
+        </w:numPr>
+        <w:spacing w:line="360" w:lineRule="auto"/>
+        <w:ind w:left="0" w:firstLine="720"/>
+        <w:mirrorIndents/>
+        <w:jc w:val="both"/>
+        <w:rPr>
+          <w:sz w:val="28"/>
+          <w:szCs w:val="28"/>
+        </w:rPr>
+      </w:pPr>
+      <w:r>
+        <w:rPr>
+          <w:sz w:val="28"/>
+          <w:szCs w:val="28"/>
+        </w:rPr>
+        <w:t xml:space="preserve">Складено тест-кейси для перевірки правильності розрахунку об'єму при граничних значеннях атрибутів. </w:t>
+      </w:r>
+    </w:p>
+    <w:p>
+      <w:pPr>
+        <w:pStyle w:val="a8"/>
+        <w:numPr>
+          <w:ilvl w:val="0"/>
+          <w:numId w:val="27"/>
+        </w:numPr>
+        <w:spacing w:line="360" w:lineRule="auto"/>
+        <w:ind w:left="0" w:firstLine="720"/>
+        <w:mirrorIndents/>
+        <w:jc w:val="both"/>
+        <w:rPr>
+          <w:sz w:val="28"/>
+          <w:szCs w:val="28"/>
+        </w:rPr>
+      </w:pPr>
+      <w:r>
+        <w:rPr>
+          <w:sz w:val="28"/>
+          <w:szCs w:val="28"/>
+        </w:rPr>
+        <w:t xml:space="preserve">Проведено unit-тестування конструкторів класу за допомогою автоматизованого тестового набору. </w:t>
+      </w:r>
+    </w:p>
+    <w:p>
+      <w:pPr>
+        <w:pStyle w:val="a8"/>
+        <w:numPr>
+          <w:ilvl w:val="0"/>
+          <w:numId w:val="27"/>
+        </w:numPr>
+        <w:spacing w:line="360" w:lineRule="auto"/>
+        <w:ind w:left="0" w:firstLine="720"/>
+        <w:mirrorIndents/>
+        <w:jc w:val="both"/>
+        <w:rPr>
+          <w:sz w:val="28"/>
+          <w:szCs w:val="28"/>
+        </w:rPr>
+      </w:pPr>
+      <w:r>
+        <w:rPr>
+          <w:sz w:val="28"/>
+          <w:szCs w:val="28"/>
+        </w:rPr>
+        <w:lastRenderedPageBreak/>
+        <w:t xml:space="preserve">Організовано автоматичне ведення протоколу тестування у файлі \Lab12\TestSuite\TestResults.txt. </w:t>
+      </w:r>
+    </w:p>
+    <w:p>
+      <w:pPr>
+        <w:pStyle w:val="a8"/>
+        <w:numPr>
+          <w:ilvl w:val="0"/>
+          <w:numId w:val="27"/>
+        </w:numPr>
+        <w:spacing w:line="360" w:lineRule="auto"/>
+        <w:ind w:left="0" w:firstLine="720"/>
+        <w:mirrorIndents/>
+        <w:jc w:val="both"/>
+        <w:rPr>
+          <w:sz w:val="28"/>
+          <w:szCs w:val="28"/>
+        </w:rPr>
+      </w:pPr>
+      <w:r>
+        <w:rPr>
+          <w:sz w:val="28"/>
+          <w:szCs w:val="28"/>
+        </w:rPr>
+        <w:t>Реалізовано запис результату "PASSED" у протокол при повному збігу очікуваного та фактичного результатів.</w:t>
+      </w:r>
+    </w:p>
+    <w:p>
+      <w:pPr>
+        <w:pStyle w:val="a8"/>
+        <w:numPr>
+          <w:ilvl w:val="0"/>
+          <w:numId w:val="27"/>
+        </w:numPr>
+        <w:spacing w:line="360" w:lineRule="auto"/>
+        <w:ind w:left="0" w:firstLine="720"/>
+        <w:mirrorIndents/>
+        <w:jc w:val="both"/>
+        <w:rPr>
+          <w:sz w:val="28"/>
+          <w:szCs w:val="28"/>
+        </w:rPr>
+      </w:pPr>
+      <w:r>
+        <w:rPr>
+          <w:sz w:val="28"/>
+          <w:szCs w:val="28"/>
+        </w:rPr>
+        <w:t>Налаштовано фіксацію статусу "FAILED" у разі виявлення розбіжностей під час автоматичного порівняння.</w:t>
+      </w:r>
+    </w:p>
+    <w:p>
+      <w:pPr>
+        <w:pStyle w:val="a8"/>
+        <w:numPr>
+          <w:ilvl w:val="0"/>
+          <w:numId w:val="27"/>
+        </w:numPr>
+        <w:spacing w:line="360" w:lineRule="auto"/>
+        <w:ind w:left="0" w:firstLine="720"/>
+        <w:mirrorIndents/>
+        <w:jc w:val="both"/>
+        <w:rPr>
+          <w:sz w:val="28"/>
+          <w:szCs w:val="28"/>
+        </w:rPr>
+      </w:pPr>
+      <w:r>
+        <w:rPr>
+          <w:sz w:val="28"/>
+          <w:szCs w:val="28"/>
+        </w:rPr>
+        <w:t>Забезпечено закриття файлових потоків після зчитування та запису результатів тестування за допомогою .close().</w:t>
+      </w:r>
+    </w:p>
+    <w:p>
+      <w:pPr>
+        <w:pStyle w:val="a8"/>
+        <w:numPr>
+          <w:ilvl w:val="0"/>
+          <w:numId w:val="27"/>
+        </w:numPr>
+        <w:spacing w:line="360" w:lineRule="auto"/>
+        <w:ind w:left="0" w:firstLine="720"/>
+        <w:mirrorIndents/>
+        <w:jc w:val="both"/>
+        <w:rPr>
+          <w:sz w:val="28"/>
+          <w:szCs w:val="28"/>
+        </w:rPr>
+      </w:pPr>
+      <w:r>
+        <w:rPr>
+          <w:sz w:val="28"/>
+          <w:szCs w:val="28"/>
+        </w:rPr>
+        <w:t xml:space="preserve">Опановано процес системного тестування створеного виконуваного файлу Teacher.exe. </w:t>
+      </w:r>
+    </w:p>
+    <w:p>
+      <w:pPr>
+        <w:pStyle w:val="a8"/>
+        <w:numPr>
+          <w:ilvl w:val="0"/>
+          <w:numId w:val="27"/>
+        </w:numPr>
+        <w:spacing w:line="360" w:lineRule="auto"/>
+        <w:ind w:left="0" w:firstLine="720"/>
+        <w:mirrorIndents/>
+        <w:jc w:val="both"/>
+        <w:rPr>
+          <w:sz w:val="28"/>
+          <w:szCs w:val="28"/>
+        </w:rPr>
+      </w:pPr>
+      <w:r>
+        <w:rPr>
+          <w:sz w:val="28"/>
+          <w:szCs w:val="28"/>
+        </w:rPr>
+        <w:t xml:space="preserve">Налаштовано автоматичне копіювання стабільної версії утиліти у спеціальну директорію \Lab12\Software. </w:t>
+      </w:r>
+    </w:p>
+    <w:p>
+      <w:pPr>
+        <w:pStyle w:val="a8"/>
+        <w:numPr>
+          <w:ilvl w:val="0"/>
+          <w:numId w:val="27"/>
+        </w:numPr>
+        <w:spacing w:line="360" w:lineRule="auto"/>
+        <w:ind w:left="0" w:firstLine="720"/>
+        <w:mirrorIndents/>
+        <w:jc w:val="both"/>
+        <w:rPr>
+          <w:sz w:val="28"/>
+          <w:szCs w:val="28"/>
+        </w:rPr>
+      </w:pPr>
+      <w:r>
+        <w:rPr>
+          <w:sz w:val="28"/>
+          <w:szCs w:val="28"/>
+        </w:rPr>
+        <w:t xml:space="preserve">Опановано роботу в кросплатформовому середовищі розробки Code::Blocks для створення об'єктних модулів. </w:t>
+      </w:r>
+    </w:p>
+    <w:p>
+      <w:pPr>
+        <w:pStyle w:val="a8"/>
+        <w:numPr>
+          <w:ilvl w:val="0"/>
+          <w:numId w:val="27"/>
+        </w:numPr>
+        <w:spacing w:line="360" w:lineRule="auto"/>
+        <w:ind w:left="0" w:firstLine="720"/>
+        <w:mirrorIndents/>
+        <w:jc w:val="both"/>
+        <w:rPr>
+          <w:sz w:val="28"/>
+          <w:szCs w:val="28"/>
+        </w:rPr>
+      </w:pPr>
+      <w:r>
+        <w:rPr>
+          <w:sz w:val="28"/>
+          <w:szCs w:val="28"/>
+        </w:rPr>
+        <w:t>Набуто навичок управління конфігураціями збірки (Debug та Release) у середовищі Code::Blocks.</w:t>
+      </w:r>
+    </w:p>
+    <w:p>
+      <w:pPr>
+        <w:pStyle w:val="a8"/>
+        <w:numPr>
+          <w:ilvl w:val="0"/>
+          <w:numId w:val="27"/>
+        </w:numPr>
+        <w:spacing w:line="360" w:lineRule="auto"/>
+        <w:ind w:left="0" w:firstLine="720"/>
+        <w:mirrorIndents/>
+        <w:jc w:val="both"/>
+        <w:rPr>
+          <w:sz w:val="28"/>
+          <w:szCs w:val="28"/>
+        </w:rPr>
+      </w:pPr>
+      <w:r>
+        <w:rPr>
+          <w:sz w:val="28"/>
+          <w:szCs w:val="28"/>
+        </w:rPr>
+        <w:t>Вивчено детальний процес лінкування об'єктних файлів під час компіляції складного об'єктно-орієнтованого коду.</w:t>
+      </w:r>
+    </w:p>
+    <w:p>
+      <w:pPr>
+        <w:pStyle w:val="a8"/>
+        <w:numPr>
+          <w:ilvl w:val="0"/>
+          <w:numId w:val="27"/>
+        </w:numPr>
+        <w:spacing w:line="360" w:lineRule="auto"/>
+        <w:ind w:left="0" w:firstLine="720"/>
+        <w:mirrorIndents/>
+        <w:jc w:val="both"/>
+        <w:rPr>
+          <w:sz w:val="28"/>
+          <w:szCs w:val="28"/>
+        </w:rPr>
+      </w:pPr>
+      <w:r>
+        <w:rPr>
+          <w:sz w:val="28"/>
+          <w:szCs w:val="28"/>
+        </w:rPr>
+        <w:t>Успішно вирішено проблему відображення українських символів у консолі за допомогою Windows API (SetConsoleCP).</w:t>
+      </w:r>
+    </w:p>
+    <w:p>
+      <w:pPr>
+        <w:pStyle w:val="a8"/>
+        <w:numPr>
+          <w:ilvl w:val="0"/>
+          <w:numId w:val="27"/>
+        </w:numPr>
+        <w:spacing w:line="360" w:lineRule="auto"/>
+        <w:ind w:left="0" w:firstLine="720"/>
+        <w:mirrorIndents/>
+        <w:jc w:val="both"/>
+        <w:rPr>
+          <w:sz w:val="28"/>
+          <w:szCs w:val="28"/>
+        </w:rPr>
+      </w:pPr>
+      <w:r>
+        <w:rPr>
+          <w:sz w:val="28"/>
+          <w:szCs w:val="28"/>
+        </w:rPr>
+        <w:t>Досліджено роботу компілятора GCC/MinGW, інтегрованого у використовувану IDE.</w:t>
+      </w:r>
+    </w:p>
+    <w:p>
+      <w:pPr>
+        <w:pStyle w:val="a8"/>
+        <w:numPr>
+          <w:ilvl w:val="0"/>
+          <w:numId w:val="27"/>
+        </w:numPr>
+        <w:spacing w:line="360" w:lineRule="auto"/>
+        <w:ind w:left="0" w:firstLine="720"/>
+        <w:mirrorIndents/>
+        <w:jc w:val="both"/>
+        <w:rPr>
+          <w:sz w:val="28"/>
+          <w:szCs w:val="28"/>
+        </w:rPr>
+      </w:pPr>
+      <w:r>
+        <w:rPr>
+          <w:sz w:val="28"/>
+          <w:szCs w:val="28"/>
+        </w:rPr>
+        <w:t>Опановано використання відладчика (Debugger) для покрокового аналізу життєвого циклу об'єкта класу.</w:t>
+      </w:r>
+    </w:p>
+    <w:p>
+      <w:pPr>
+        <w:pStyle w:val="a8"/>
+        <w:numPr>
+          <w:ilvl w:val="0"/>
+          <w:numId w:val="27"/>
+        </w:numPr>
+        <w:spacing w:line="360" w:lineRule="auto"/>
+        <w:ind w:left="0" w:firstLine="720"/>
+        <w:mirrorIndents/>
+        <w:jc w:val="both"/>
+        <w:rPr>
+          <w:sz w:val="28"/>
+          <w:szCs w:val="28"/>
+        </w:rPr>
+      </w:pPr>
+      <w:r>
+        <w:rPr>
+          <w:sz w:val="28"/>
+          <w:szCs w:val="28"/>
+        </w:rPr>
+        <w:t>Навченося відстежувати значення закритих полів об'єкта в пам'яті комп'ютера під час виконання програми.</w:t>
+      </w:r>
+    </w:p>
+    <w:p>
+      <w:pPr>
+        <w:pStyle w:val="a8"/>
+        <w:numPr>
+          <w:ilvl w:val="0"/>
+          <w:numId w:val="27"/>
+        </w:numPr>
+        <w:spacing w:line="360" w:lineRule="auto"/>
+        <w:ind w:left="0" w:firstLine="720"/>
+        <w:mirrorIndents/>
+        <w:jc w:val="both"/>
+        <w:rPr>
+          <w:sz w:val="28"/>
+          <w:szCs w:val="28"/>
+        </w:rPr>
+      </w:pPr>
+      <w:r>
+        <w:rPr>
+          <w:sz w:val="28"/>
+          <w:szCs w:val="28"/>
+        </w:rPr>
+        <w:t xml:space="preserve">Закріплено навички роботи з розподіленою системою контролю версій Git для фіксації етапів розробки. </w:t>
+      </w:r>
+    </w:p>
+    <w:p>
+      <w:pPr>
+        <w:pStyle w:val="a8"/>
+        <w:numPr>
+          <w:ilvl w:val="0"/>
+          <w:numId w:val="27"/>
+        </w:numPr>
+        <w:spacing w:line="360" w:lineRule="auto"/>
+        <w:ind w:left="0" w:firstLine="720"/>
+        <w:mirrorIndents/>
+        <w:jc w:val="both"/>
+        <w:rPr>
+          <w:sz w:val="28"/>
+          <w:szCs w:val="28"/>
+        </w:rPr>
+      </w:pPr>
+      <w:r>
+        <w:rPr>
+          <w:sz w:val="28"/>
+          <w:szCs w:val="28"/>
+        </w:rPr>
+        <w:t>Вивчено навички формуння класів та абстракціїї</w:t>
+      </w:r>
+      <w:r>
+        <w:rPr>
+          <w:sz w:val="28"/>
+          <w:szCs w:val="28"/>
+        </w:rPr>
+        <w:t xml:space="preserve">. </w:t>
+      </w:r>
+    </w:p>
+    <w:p>
+      <w:pPr>
+        <w:pStyle w:val="a8"/>
+        <w:numPr>
+          <w:ilvl w:val="0"/>
+          <w:numId w:val="27"/>
+        </w:numPr>
+        <w:spacing w:line="360" w:lineRule="auto"/>
+        <w:ind w:left="0" w:firstLine="720"/>
+        <w:mirrorIndents/>
+        <w:jc w:val="both"/>
+        <w:rPr>
+          <w:sz w:val="28"/>
+          <w:szCs w:val="28"/>
+        </w:rPr>
+      </w:pPr>
+      <w:r>
+        <w:rPr>
+          <w:sz w:val="28"/>
+          <w:szCs w:val="28"/>
+        </w:rPr>
+        <w:t xml:space="preserve">Освоєно використання файлу README.md у корені лабораторної роботи для опису структури проєкту. </w:t>
+      </w:r>
+    </w:p>
+    <w:p>
+      <w:pPr>
+        <w:pStyle w:val="a8"/>
+        <w:numPr>
+          <w:ilvl w:val="0"/>
+          <w:numId w:val="27"/>
+        </w:numPr>
+        <w:spacing w:line="360" w:lineRule="auto"/>
+        <w:ind w:left="0" w:firstLine="720"/>
+        <w:mirrorIndents/>
+        <w:jc w:val="both"/>
+        <w:rPr>
+          <w:sz w:val="28"/>
+          <w:szCs w:val="28"/>
+        </w:rPr>
+      </w:pPr>
+      <w:r>
+        <w:rPr>
+          <w:sz w:val="28"/>
+          <w:szCs w:val="28"/>
+        </w:rPr>
+        <w:lastRenderedPageBreak/>
+        <w:t xml:space="preserve">Створено чітку структуру директорій prj, Software, TestSuite, Report відповідно до вимог порядку виконання. </w:t>
+      </w:r>
+    </w:p>
+    <w:p>
+      <w:pPr>
+        <w:pStyle w:val="a8"/>
+        <w:numPr>
+          <w:ilvl w:val="0"/>
+          <w:numId w:val="27"/>
+        </w:numPr>
+        <w:spacing w:line="360" w:lineRule="auto"/>
+        <w:ind w:left="0" w:firstLine="720"/>
+        <w:mirrorIndents/>
+        <w:jc w:val="both"/>
+        <w:rPr>
+          <w:sz w:val="28"/>
+          <w:szCs w:val="28"/>
+        </w:rPr>
+      </w:pPr>
+      <w:r>
+        <w:rPr>
+          <w:sz w:val="28"/>
+          <w:szCs w:val="28"/>
+        </w:rPr>
+        <w:t xml:space="preserve">Задокументовано та включено до звіту всі артефакти етапу аналізу вимог до класу. </w:t>
+      </w:r>
+    </w:p>
+    <w:p>
+      <w:pPr>
+        <w:pStyle w:val="a8"/>
+        <w:numPr>
+          <w:ilvl w:val="0"/>
+          <w:numId w:val="27"/>
+        </w:numPr>
+        <w:spacing w:line="360" w:lineRule="auto"/>
+        <w:ind w:left="0" w:firstLine="720"/>
+        <w:mirrorIndents/>
+        <w:jc w:val="both"/>
+        <w:rPr>
+          <w:sz w:val="28"/>
+          <w:szCs w:val="28"/>
+        </w:rPr>
+      </w:pPr>
+      <w:r>
+        <w:rPr>
+          <w:sz w:val="28"/>
+          <w:szCs w:val="28"/>
+        </w:rPr>
+        <w:t xml:space="preserve">Оформлено схеми детального проектування методів класу та додано їх до звітної документації. </w:t>
+      </w:r>
+    </w:p>
+    <w:p>
+      <w:pPr>
+        <w:pStyle w:val="a8"/>
+        <w:numPr>
+          <w:ilvl w:val="0"/>
+          <w:numId w:val="27"/>
+        </w:numPr>
+        <w:spacing w:line="360" w:lineRule="auto"/>
+        <w:ind w:left="0" w:firstLine="720"/>
+        <w:mirrorIndents/>
+        <w:jc w:val="both"/>
+        <w:rPr>
+          <w:sz w:val="28"/>
+          <w:szCs w:val="28"/>
+        </w:rPr>
+      </w:pPr>
+      <w:r>
+        <w:rPr>
+          <w:sz w:val="28"/>
+          <w:szCs w:val="28"/>
+        </w:rPr>
+        <w:t xml:space="preserve">Включено повний вихідний код файлу ModulesПрізвище.h до складу звіту як окремий додаток. </w:t>
+      </w:r>
+    </w:p>
+    <w:p>
+      <w:pPr>
+        <w:pStyle w:val="a8"/>
+        <w:numPr>
+          <w:ilvl w:val="0"/>
+          <w:numId w:val="27"/>
+        </w:numPr>
+        <w:spacing w:line="360" w:lineRule="auto"/>
+        <w:ind w:left="0" w:firstLine="720"/>
+        <w:mirrorIndents/>
+        <w:jc w:val="both"/>
+        <w:rPr>
+          <w:sz w:val="28"/>
+          <w:szCs w:val="28"/>
+        </w:rPr>
+      </w:pPr>
+      <w:r>
+        <w:rPr>
+          <w:sz w:val="28"/>
+          <w:szCs w:val="28"/>
+        </w:rPr>
+        <w:t xml:space="preserve">Інтегровано тексти програми проєкту Teacher та файлу TestResults.txt до фінального звіту. </w:t>
+      </w:r>
+    </w:p>
+    <w:p>
+      <w:pPr>
+        <w:pStyle w:val="a8"/>
+        <w:numPr>
+          <w:ilvl w:val="0"/>
+          <w:numId w:val="27"/>
+        </w:numPr>
+        <w:spacing w:line="360" w:lineRule="auto"/>
+        <w:ind w:left="0" w:firstLine="720"/>
+        <w:mirrorIndents/>
+        <w:jc w:val="both"/>
+        <w:rPr>
+          <w:sz w:val="28"/>
+          <w:szCs w:val="28"/>
+        </w:rPr>
+      </w:pPr>
+      <w:r>
+        <w:rPr>
+          <w:sz w:val="28"/>
+          <w:szCs w:val="28"/>
+        </w:rPr>
+        <w:t xml:space="preserve">Оформлено звіт про виконання лабораторної роботи згідно зі строгими вимогами ДСТУ 3008:2015. </w:t>
+      </w:r>
+    </w:p>
+    <w:p>
+      <w:pPr>
+        <w:pStyle w:val="a8"/>
+        <w:numPr>
+          <w:ilvl w:val="0"/>
+          <w:numId w:val="27"/>
+        </w:numPr>
+        <w:spacing w:line="360" w:lineRule="auto"/>
+        <w:ind w:left="0" w:firstLine="720"/>
+        <w:mirrorIndents/>
+        <w:jc w:val="both"/>
+        <w:rPr>
+          <w:sz w:val="28"/>
+          <w:szCs w:val="28"/>
+        </w:rPr>
+      </w:pPr>
+      <w:r>
+        <w:rPr>
+          <w:sz w:val="28"/>
+          <w:szCs w:val="28"/>
+        </w:rPr>
+        <w:t>Продемонстровано розуміння концепцій низькозв'язаної архітектури програмного забезпечення.</w:t>
+      </w:r>
+    </w:p>
+    <w:p>
+      <w:pPr>
+        <w:pStyle w:val="a8"/>
+        <w:numPr>
+          <w:ilvl w:val="0"/>
+          <w:numId w:val="27"/>
+        </w:numPr>
+        <w:spacing w:line="360" w:lineRule="auto"/>
+        <w:ind w:left="0" w:firstLine="720"/>
+        <w:mirrorIndents/>
+        <w:jc w:val="both"/>
+        <w:rPr>
+          <w:sz w:val="28"/>
+          <w:szCs w:val="28"/>
+        </w:rPr>
+      </w:pPr>
+      <w:r>
+        <w:rPr>
+          <w:sz w:val="28"/>
+          <w:szCs w:val="28"/>
+        </w:rPr>
+        <w:t>Доведено перевагу автоматизованого тестування над ручним консольним введенням даних користувачем.</w:t>
+      </w:r>
+    </w:p>
+    <w:p>
+      <w:pPr>
+        <w:pStyle w:val="a8"/>
+        <w:numPr>
+          <w:ilvl w:val="0"/>
+          <w:numId w:val="27"/>
+        </w:numPr>
+        <w:spacing w:line="360" w:lineRule="auto"/>
+        <w:ind w:left="0" w:firstLine="720"/>
+        <w:mirrorIndents/>
+        <w:jc w:val="both"/>
+        <w:rPr>
+          <w:sz w:val="28"/>
+          <w:szCs w:val="28"/>
+        </w:rPr>
+      </w:pPr>
+      <w:r>
+        <w:rPr>
+          <w:sz w:val="28"/>
+          <w:szCs w:val="28"/>
+        </w:rPr>
+        <w:t>Засвоєно принцип єдиної відповідальності (Single Responsibility Principle) при побудові методів класу.</w:t>
+      </w:r>
+    </w:p>
+    <w:p>
+      <w:pPr>
+        <w:pStyle w:val="a8"/>
+        <w:numPr>
+          <w:ilvl w:val="0"/>
+          <w:numId w:val="27"/>
+        </w:numPr>
+        <w:spacing w:line="360" w:lineRule="auto"/>
+        <w:ind w:left="0" w:firstLine="720"/>
+        <w:mirrorIndents/>
+        <w:jc w:val="both"/>
+        <w:rPr>
+          <w:sz w:val="28"/>
+          <w:szCs w:val="28"/>
+        </w:rPr>
+      </w:pPr>
+      <w:r>
+        <w:rPr>
+          <w:sz w:val="28"/>
+          <w:szCs w:val="28"/>
+        </w:rPr>
+        <w:t>Перевірено стійкість програми до витоків пам'яті при циклічному створенні та знищенні об'єктів.</w:t>
+      </w:r>
+    </w:p>
+    <w:p>
+      <w:pPr>
+        <w:pStyle w:val="a8"/>
+        <w:numPr>
+          <w:ilvl w:val="0"/>
+          <w:numId w:val="27"/>
+        </w:numPr>
+        <w:spacing w:line="360" w:lineRule="auto"/>
+        <w:ind w:left="0" w:firstLine="720"/>
+        <w:mirrorIndents/>
+        <w:jc w:val="both"/>
+        <w:rPr>
+          <w:sz w:val="28"/>
+          <w:szCs w:val="28"/>
+        </w:rPr>
+      </w:pPr>
+      <w:r>
+        <w:rPr>
+          <w:sz w:val="28"/>
+          <w:szCs w:val="28"/>
+        </w:rPr>
+        <w:t>Опановано автоматичне викликання деструктора класу при виході об'єкта з області видимості.</w:t>
+      </w:r>
+    </w:p>
+    <w:p>
+      <w:pPr>
+        <w:pStyle w:val="a8"/>
+        <w:numPr>
+          <w:ilvl w:val="0"/>
+          <w:numId w:val="27"/>
+        </w:numPr>
+        <w:spacing w:line="360" w:lineRule="auto"/>
+        <w:ind w:left="0" w:firstLine="720"/>
+        <w:mirrorIndents/>
+        <w:jc w:val="both"/>
+        <w:rPr>
+          <w:sz w:val="28"/>
+          <w:szCs w:val="28"/>
+        </w:rPr>
+      </w:pPr>
+      <w:r>
+        <w:rPr>
+          <w:sz w:val="28"/>
+          <w:szCs w:val="28"/>
+        </w:rPr>
+        <w:t>Досліджено поведінку програми при передачі об'єктів у функції за посиланням та за значенням.</w:t>
+      </w:r>
+    </w:p>
+    <w:p>
+      <w:pPr>
+        <w:pStyle w:val="a8"/>
+        <w:numPr>
+          <w:ilvl w:val="0"/>
+          <w:numId w:val="27"/>
+        </w:numPr>
+        <w:spacing w:line="360" w:lineRule="auto"/>
+        <w:ind w:left="0" w:firstLine="720"/>
+        <w:mirrorIndents/>
+        <w:jc w:val="both"/>
+        <w:rPr>
+          <w:sz w:val="28"/>
+          <w:szCs w:val="28"/>
+        </w:rPr>
+      </w:pPr>
+      <w:r>
+        <w:rPr>
+          <w:sz w:val="28"/>
+          <w:szCs w:val="28"/>
+        </w:rPr>
+        <w:t>Зрозуміло роль константних функцій-членів (const) для гарантії незмінності стану об'єкта при читанні.</w:t>
+      </w:r>
+    </w:p>
+    <w:p>
+      <w:pPr>
+        <w:pStyle w:val="a8"/>
+        <w:numPr>
+          <w:ilvl w:val="0"/>
+          <w:numId w:val="27"/>
+        </w:numPr>
+        <w:spacing w:line="360" w:lineRule="auto"/>
+        <w:ind w:left="0" w:firstLine="720"/>
+        <w:mirrorIndents/>
+        <w:jc w:val="both"/>
+        <w:rPr>
+          <w:sz w:val="28"/>
+          <w:szCs w:val="28"/>
+        </w:rPr>
+      </w:pPr>
+      <w:r>
+        <w:rPr>
+          <w:sz w:val="28"/>
+          <w:szCs w:val="28"/>
+        </w:rPr>
+        <w:t>Перевірено коректність ініціалізації полів класу через список ініціалізації конструктора.</w:t>
+      </w:r>
+    </w:p>
+    <w:p>
+      <w:pPr>
+        <w:pStyle w:val="a8"/>
+        <w:numPr>
+          <w:ilvl w:val="0"/>
+          <w:numId w:val="27"/>
+        </w:numPr>
+        <w:spacing w:line="360" w:lineRule="auto"/>
+        <w:ind w:left="0" w:firstLine="720"/>
+        <w:mirrorIndents/>
+        <w:jc w:val="both"/>
+        <w:rPr>
+          <w:sz w:val="28"/>
+          <w:szCs w:val="28"/>
+        </w:rPr>
+      </w:pPr>
+      <w:r>
+        <w:rPr>
+          <w:sz w:val="28"/>
+          <w:szCs w:val="28"/>
+        </w:rPr>
+        <w:t>Набуто навичок написання чистих та зрозумілих ідентифікаторів для методів класу.</w:t>
+      </w:r>
+    </w:p>
+    <w:p>
+      <w:pPr>
+        <w:pStyle w:val="a8"/>
+        <w:numPr>
+          <w:ilvl w:val="0"/>
+          <w:numId w:val="27"/>
+        </w:numPr>
+        <w:spacing w:line="360" w:lineRule="auto"/>
+        <w:ind w:left="0" w:firstLine="720"/>
+        <w:mirrorIndents/>
+        <w:jc w:val="both"/>
+        <w:rPr>
+          <w:sz w:val="28"/>
+          <w:szCs w:val="28"/>
+        </w:rPr>
+      </w:pPr>
+      <w:r>
+        <w:rPr>
+          <w:sz w:val="28"/>
+          <w:szCs w:val="28"/>
+        </w:rPr>
+        <w:t>Освоєно аналіз лог-файлів компілятора для швидкого усунення синтаксичних помилок ООП.</w:t>
+      </w:r>
+    </w:p>
+    <w:p>
+      <w:pPr>
+        <w:pStyle w:val="a8"/>
+        <w:numPr>
+          <w:ilvl w:val="0"/>
+          <w:numId w:val="27"/>
+        </w:numPr>
+        <w:spacing w:line="360" w:lineRule="auto"/>
+        <w:ind w:left="0" w:firstLine="720"/>
+        <w:mirrorIndents/>
+        <w:jc w:val="both"/>
+        <w:rPr>
+          <w:sz w:val="28"/>
+          <w:szCs w:val="28"/>
+        </w:rPr>
+      </w:pPr>
+      <w:r>
+        <w:rPr>
+          <w:sz w:val="28"/>
+          <w:szCs w:val="28"/>
+        </w:rPr>
+        <w:lastRenderedPageBreak/>
+        <w:t>Забезпечено повну незалежність логіки обчислення об'єму від інтерфейсу виведення даних.</w:t>
+      </w:r>
+    </w:p>
+    <w:p>
+      <w:pPr>
+        <w:pStyle w:val="a8"/>
+        <w:numPr>
+          <w:ilvl w:val="0"/>
+          <w:numId w:val="27"/>
+        </w:numPr>
+        <w:spacing w:line="360" w:lineRule="auto"/>
+        <w:ind w:left="0" w:firstLine="720"/>
+        <w:mirrorIndents/>
+        <w:jc w:val="both"/>
+        <w:rPr>
+          <w:sz w:val="28"/>
+          <w:szCs w:val="28"/>
+        </w:rPr>
+      </w:pPr>
+      <w:r>
+        <w:rPr>
+          <w:sz w:val="28"/>
+          <w:szCs w:val="28"/>
+        </w:rPr>
+        <w:t>Перевірено сумісність створеного класу з різними типами компіляторів у Code::Blocks.</w:t>
+      </w:r>
+    </w:p>
+    <w:p>
+      <w:pPr>
+        <w:pStyle w:val="a8"/>
+        <w:numPr>
+          <w:ilvl w:val="0"/>
+          <w:numId w:val="27"/>
+        </w:numPr>
+        <w:spacing w:line="360" w:lineRule="auto"/>
+        <w:ind w:left="0" w:firstLine="720"/>
+        <w:mirrorIndents/>
+        <w:jc w:val="both"/>
+        <w:rPr>
+          <w:sz w:val="28"/>
+          <w:szCs w:val="28"/>
+        </w:rPr>
+      </w:pPr>
+      <w:r>
+        <w:rPr>
+          <w:sz w:val="28"/>
+          <w:szCs w:val="28"/>
+        </w:rPr>
+        <w:t>Досліджено механізм виділення пам'яті у стеку під автоматичні екземпляри розробленого класу.</w:t>
+      </w:r>
+    </w:p>
+    <w:p>
+      <w:pPr>
+        <w:pStyle w:val="a8"/>
+        <w:numPr>
+          <w:ilvl w:val="0"/>
+          <w:numId w:val="27"/>
+        </w:numPr>
+        <w:spacing w:line="360" w:lineRule="auto"/>
+        <w:ind w:left="0" w:firstLine="720"/>
+        <w:mirrorIndents/>
+        <w:jc w:val="both"/>
+        <w:rPr>
+          <w:sz w:val="28"/>
+          <w:szCs w:val="28"/>
+        </w:rPr>
+      </w:pPr>
+      <w:r>
+        <w:rPr>
+          <w:sz w:val="28"/>
+          <w:szCs w:val="28"/>
+        </w:rPr>
+        <w:t xml:space="preserve">Проаналізовано вплив інкапсуляції на підвищення безпеки та надійності програмного коду. </w:t>
+      </w:r>
+    </w:p>
+    <w:p>
+      <w:pPr>
+        <w:pStyle w:val="a8"/>
+        <w:numPr>
+          <w:ilvl w:val="0"/>
+          <w:numId w:val="27"/>
+        </w:numPr>
+        <w:spacing w:line="360" w:lineRule="auto"/>
+        <w:ind w:left="0" w:firstLine="720"/>
+        <w:mirrorIndents/>
+        <w:jc w:val="both"/>
+        <w:rPr>
+          <w:sz w:val="28"/>
+          <w:szCs w:val="28"/>
+        </w:rPr>
+      </w:pPr>
+      <w:r>
+        <w:rPr>
+          <w:sz w:val="28"/>
+          <w:szCs w:val="28"/>
+        </w:rPr>
+        <w:t xml:space="preserve">Доведено ефективність використання заголовкових файлів для повторного використання коду в інших проєктах. </w:t>
+      </w:r>
+    </w:p>
+    <w:p>
+      <w:pPr>
+        <w:pStyle w:val="a8"/>
+        <w:numPr>
+          <w:ilvl w:val="0"/>
+          <w:numId w:val="27"/>
+        </w:numPr>
+        <w:spacing w:line="360" w:lineRule="auto"/>
+        <w:ind w:left="0" w:firstLine="720"/>
+        <w:mirrorIndents/>
+        <w:jc w:val="both"/>
+        <w:rPr>
+          <w:sz w:val="28"/>
+          <w:szCs w:val="28"/>
+        </w:rPr>
+      </w:pPr>
+      <w:r>
+        <w:rPr>
+          <w:sz w:val="28"/>
+          <w:szCs w:val="28"/>
+        </w:rPr>
+        <w:t>Підтверджено працездатність програми Teacher.exe при обробці порожніх файлів тест-сьютів.</w:t>
+      </w:r>
+    </w:p>
+    <w:p>
+      <w:pPr>
+        <w:pStyle w:val="a8"/>
+        <w:numPr>
+          <w:ilvl w:val="0"/>
+          <w:numId w:val="27"/>
+        </w:numPr>
+        <w:spacing w:line="360" w:lineRule="auto"/>
+        <w:ind w:left="0" w:firstLine="720"/>
+        <w:mirrorIndents/>
+        <w:jc w:val="both"/>
+        <w:rPr>
+          <w:sz w:val="28"/>
+          <w:szCs w:val="28"/>
+        </w:rPr>
+      </w:pPr>
+      <w:r>
+        <w:rPr>
+          <w:sz w:val="28"/>
+          <w:szCs w:val="28"/>
+        </w:rPr>
+        <w:t>Закріплено навички написання інформативних коментарів до коду класу для полегшення його підтримки.</w:t>
+      </w:r>
+    </w:p>
+    <w:p>
+      <w:pPr>
+        <w:pStyle w:val="a8"/>
+        <w:numPr>
+          <w:ilvl w:val="0"/>
+          <w:numId w:val="27"/>
+        </w:numPr>
+        <w:spacing w:line="360" w:lineRule="auto"/>
+        <w:ind w:left="0" w:firstLine="720"/>
+        <w:mirrorIndents/>
+        <w:jc w:val="both"/>
+        <w:rPr>
+          <w:sz w:val="28"/>
+          <w:szCs w:val="28"/>
+        </w:rPr>
+      </w:pPr>
+      <w:r>
+        <w:rPr>
+          <w:sz w:val="28"/>
+          <w:szCs w:val="28"/>
+        </w:rPr>
+        <w:t>Успішно реалізовано алгоритм порівняння рядків при валідації результатів очікуваного тесту.</w:t>
+      </w:r>
+    </w:p>
+    <w:p>
+      <w:pPr>
+        <w:pStyle w:val="a8"/>
+        <w:numPr>
+          <w:ilvl w:val="0"/>
+          <w:numId w:val="27"/>
+        </w:numPr>
+        <w:spacing w:line="360" w:lineRule="auto"/>
+        <w:ind w:left="0" w:firstLine="720"/>
+        <w:mirrorIndents/>
+        <w:jc w:val="both"/>
+        <w:rPr>
+          <w:sz w:val="28"/>
+          <w:szCs w:val="28"/>
+        </w:rPr>
+      </w:pPr>
+      <w:r>
+        <w:rPr>
+          <w:sz w:val="28"/>
+          <w:szCs w:val="28"/>
+        </w:rPr>
+        <w:t xml:space="preserve">Засвоєно поняття інтерфейсу як контракту між розробником класу та його користувачем. </w:t>
+      </w:r>
+    </w:p>
+    <w:p>
+      <w:pPr>
+        <w:pStyle w:val="a8"/>
+        <w:numPr>
+          <w:ilvl w:val="0"/>
+          <w:numId w:val="27"/>
+        </w:numPr>
+        <w:spacing w:line="360" w:lineRule="auto"/>
+        <w:ind w:left="0" w:firstLine="720"/>
+        <w:mirrorIndents/>
+        <w:jc w:val="both"/>
+        <w:rPr>
+          <w:sz w:val="28"/>
+          <w:szCs w:val="28"/>
+        </w:rPr>
+      </w:pPr>
+      <w:r>
+        <w:rPr>
+          <w:sz w:val="28"/>
+          <w:szCs w:val="28"/>
+        </w:rPr>
+        <w:t>Перевірено відсутність побічних ефектів при одночасному створенні кількох екземплярів акваріумів.</w:t>
+      </w:r>
+    </w:p>
+    <w:p>
+      <w:pPr>
+        <w:pStyle w:val="a8"/>
+        <w:numPr>
+          <w:ilvl w:val="0"/>
+          <w:numId w:val="27"/>
+        </w:numPr>
+        <w:spacing w:line="360" w:lineRule="auto"/>
+        <w:ind w:left="0" w:firstLine="720"/>
+        <w:mirrorIndents/>
+        <w:jc w:val="both"/>
+        <w:rPr>
+          <w:sz w:val="28"/>
+          <w:szCs w:val="28"/>
+        </w:rPr>
+      </w:pPr>
+      <w:r>
+        <w:rPr>
+          <w:sz w:val="28"/>
+          <w:szCs w:val="28"/>
+        </w:rPr>
+        <w:t xml:space="preserve">Опановано структурування звіту за розділами відповідно до етапів життєвого циклу розробки ПЗ. </w:t>
+      </w:r>
+    </w:p>
+    <w:p>
+      <w:pPr>
+        <w:pStyle w:val="a8"/>
+        <w:numPr>
+          <w:ilvl w:val="0"/>
+          <w:numId w:val="27"/>
+        </w:numPr>
+        <w:spacing w:line="360" w:lineRule="auto"/>
+        <w:ind w:left="0" w:firstLine="720"/>
+        <w:mirrorIndents/>
+        <w:jc w:val="both"/>
+        <w:rPr>
+          <w:sz w:val="28"/>
+          <w:szCs w:val="28"/>
+        </w:rPr>
+      </w:pPr>
+      <w:r>
+        <w:rPr>
+          <w:sz w:val="28"/>
+          <w:szCs w:val="28"/>
+        </w:rPr>
+        <w:t>Доведено здатність розробленого класу коректно працювати з великими числовими значеннями розмірів.</w:t>
+      </w:r>
+    </w:p>
+    <w:p>
+      <w:pPr>
+        <w:pStyle w:val="a8"/>
+        <w:numPr>
+          <w:ilvl w:val="0"/>
+          <w:numId w:val="27"/>
+        </w:numPr>
+        <w:spacing w:line="360" w:lineRule="auto"/>
+        <w:ind w:left="0" w:firstLine="720"/>
+        <w:mirrorIndents/>
+        <w:jc w:val="both"/>
+        <w:rPr>
+          <w:sz w:val="28"/>
+          <w:szCs w:val="28"/>
+        </w:rPr>
+      </w:pPr>
+      <w:r>
+        <w:rPr>
+          <w:sz w:val="28"/>
+          <w:szCs w:val="28"/>
+        </w:rPr>
+        <w:t>Перевірено захист програми від ділення на нуль або невірних операцій під час розрахунку геометричних параметрів.</w:t>
+      </w:r>
+    </w:p>
+    <w:p>
+      <w:pPr>
+        <w:pStyle w:val="a8"/>
+        <w:numPr>
+          <w:ilvl w:val="0"/>
+          <w:numId w:val="27"/>
+        </w:numPr>
+        <w:spacing w:line="360" w:lineRule="auto"/>
+        <w:ind w:left="0" w:firstLine="720"/>
+        <w:mirrorIndents/>
+        <w:jc w:val="both"/>
+        <w:rPr>
+          <w:sz w:val="28"/>
+          <w:szCs w:val="28"/>
+        </w:rPr>
+      </w:pPr>
+      <w:r>
+        <w:rPr>
+          <w:sz w:val="28"/>
+          <w:szCs w:val="28"/>
+        </w:rPr>
+        <w:t>Засвоєно важливість суворого дотримання інженерної дисципліни під час виконання індивідуальних завдань.</w:t>
+      </w:r>
+    </w:p>
+    <w:p>
+      <w:pPr>
+        <w:pStyle w:val="a8"/>
+        <w:numPr>
+          <w:ilvl w:val="0"/>
+          <w:numId w:val="27"/>
+        </w:numPr>
+        <w:spacing w:line="360" w:lineRule="auto"/>
+        <w:ind w:left="0" w:firstLine="720"/>
+        <w:mirrorIndents/>
+        <w:jc w:val="both"/>
+        <w:rPr>
+          <w:sz w:val="28"/>
+          <w:szCs w:val="28"/>
+        </w:rPr>
+      </w:pPr>
+      <w:r>
+        <w:rPr>
+          <w:sz w:val="28"/>
+          <w:szCs w:val="28"/>
+        </w:rPr>
+        <w:t xml:space="preserve">Досліджено вплив препроцесорних директив на швидкість та оптимізацію компіляції коду. </w:t>
+      </w:r>
+    </w:p>
+    <w:p>
+      <w:pPr>
+        <w:pStyle w:val="a8"/>
+        <w:numPr>
+          <w:ilvl w:val="0"/>
+          <w:numId w:val="27"/>
+        </w:numPr>
+        <w:spacing w:line="360" w:lineRule="auto"/>
+        <w:ind w:left="0" w:firstLine="720"/>
+        <w:mirrorIndents/>
+        <w:jc w:val="both"/>
+        <w:rPr>
+          <w:sz w:val="28"/>
+          <w:szCs w:val="28"/>
+        </w:rPr>
+      </w:pPr>
+      <w:r>
+        <w:rPr>
+          <w:sz w:val="28"/>
+          <w:szCs w:val="28"/>
+        </w:rPr>
+        <w:t xml:space="preserve">Опановано методику перевірки працездатності ПЗ на нестандартних або екстремальних наборах даних. </w:t>
+      </w:r>
+    </w:p>
+    <w:p>
+      <w:pPr>
+        <w:pStyle w:val="a8"/>
+        <w:numPr>
+          <w:ilvl w:val="0"/>
+          <w:numId w:val="27"/>
+        </w:numPr>
+        <w:spacing w:line="360" w:lineRule="auto"/>
+        <w:ind w:left="0" w:firstLine="720"/>
+        <w:mirrorIndents/>
+        <w:jc w:val="both"/>
+        <w:rPr>
+          <w:sz w:val="28"/>
+          <w:szCs w:val="28"/>
+        </w:rPr>
+      </w:pPr>
+      <w:r>
+        <w:rPr>
+          <w:sz w:val="28"/>
+          <w:szCs w:val="28"/>
+        </w:rPr>
+        <w:lastRenderedPageBreak/>
+        <w:t>Перевірено автоматичне створення вихідних файлів з результатами, якщо вони відсутні на диску.</w:t>
+      </w:r>
+    </w:p>
+    <w:p>
+      <w:pPr>
+        <w:pStyle w:val="a8"/>
+        <w:numPr>
+          <w:ilvl w:val="0"/>
+          <w:numId w:val="27"/>
+        </w:numPr>
+        <w:spacing w:line="360" w:lineRule="auto"/>
+        <w:ind w:left="0" w:firstLine="720"/>
+        <w:mirrorIndents/>
+        <w:jc w:val="both"/>
+        <w:rPr>
+          <w:sz w:val="28"/>
+          <w:szCs w:val="28"/>
+        </w:rPr>
+      </w:pPr>
+      <w:r>
+        <w:rPr>
+          <w:sz w:val="28"/>
+          <w:szCs w:val="28"/>
+        </w:rPr>
+        <w:t xml:space="preserve">Успішно підготовлено весь проєкт до захисту перед викладачем у повному обсязі. </w:t>
+      </w:r>
+    </w:p>
+    <w:p>
+      <w:pPr>
+        <w:pStyle w:val="a8"/>
+        <w:numPr>
+          <w:ilvl w:val="0"/>
+          <w:numId w:val="27"/>
+        </w:numPr>
+        <w:spacing w:line="360" w:lineRule="auto"/>
+        <w:ind w:left="0" w:firstLine="720"/>
+        <w:mirrorIndents/>
+        <w:jc w:val="both"/>
+        <w:rPr>
+          <w:sz w:val="28"/>
+          <w:szCs w:val="28"/>
+        </w:rPr>
+      </w:pPr>
+      <w:r>
+        <w:rPr>
+          <w:sz w:val="28"/>
+          <w:szCs w:val="28"/>
+        </w:rPr>
+        <w:t xml:space="preserve">Головний підсумок: Завдання лабораторної роботи виконано повністю, набуто фундаментальних навичок ООП на мові С++. </w:t>
+      </w:r>
+    </w:p>
+    <w:p>
+      <w:pPr>
+        <w:rPr>
+          <w:sz w:val="28"/>
+          <w:szCs w:val="28"/>
+        </w:rPr>
+      </w:pPr>
+    </w:p>
+    <w:p>
+      <w:pPr>
+        <w:rPr>
+          <w:sz w:val="28"/>
+          <w:szCs w:val="28"/>
           <w:lang w:val="ru-RU"/>
         </w:rPr>
-        <w:t xml:space="preserve"> &lt;&lt; "Тестування успішно завершено! Результати записано в </w:t>
-      </w:r>
-      <w:r>
-        <w:rPr>
-          <w:rFonts w:ascii="Courier New" w:hAnsi="Courier New" w:cs="Courier New"/>
-          <w:sz w:val="20"/>
-          <w:szCs w:val="20"/>
-          <w:lang w:val="en-US"/>
-        </w:rPr>
-        <w:t>TestResults</w:t>
-      </w:r>
-      <w:r>
-        <w:rPr>
-          <w:rFonts w:ascii="Courier New" w:hAnsi="Courier New" w:cs="Courier New"/>
-          <w:sz w:val="20"/>
-          <w:szCs w:val="20"/>
-          <w:lang w:val="ru-RU"/>
-        </w:rPr>
-        <w:t>.</w:t>
-      </w:r>
-      <w:r>
-        <w:rPr>
-          <w:rFonts w:ascii="Courier New" w:hAnsi="Courier New" w:cs="Courier New"/>
-          <w:sz w:val="20"/>
-          <w:szCs w:val="20"/>
-          <w:lang w:val="en-US"/>
-        </w:rPr>
-        <w:t>txt</w:t>
-      </w:r>
-      <w:r>
-        <w:rPr>
-          <w:rFonts w:ascii="Courier New" w:hAnsi="Courier New" w:cs="Courier New"/>
-          <w:sz w:val="20"/>
-          <w:szCs w:val="20"/>
-          <w:lang w:val="ru-RU"/>
-        </w:rPr>
-        <w:t xml:space="preserve">" &lt;&lt; </w:t>
-      </w:r>
-      <w:r>
-        <w:rPr>
-          <w:rFonts w:ascii="Courier New" w:hAnsi="Courier New" w:cs="Courier New"/>
-          <w:sz w:val="20"/>
-          <w:szCs w:val="20"/>
-          <w:lang w:val="en-US"/>
-        </w:rPr>
-        <w:t>endl</w:t>
-      </w:r>
-      <w:r>
-        <w:rPr>
-          <w:rFonts w:ascii="Courier New" w:hAnsi="Courier New" w:cs="Courier New"/>
-          <w:sz w:val="20"/>
-          <w:szCs w:val="20"/>
-          <w:lang w:val="ru-RU"/>
-        </w:rPr>
-        <w:t>;</w:t>
-      </w:r>
-    </w:p>
-    <w:p>
-      <w:pPr>
-        <w:rPr>
-          <w:rFonts w:ascii="Courier New" w:hAnsi="Courier New" w:cs="Courier New"/>
-          <w:sz w:val="20"/>
-          <w:szCs w:val="20"/>
-          <w:lang w:val="en-US"/>
-        </w:rPr>
-      </w:pPr>
-      <w:r>
-        <w:rPr>
-          <w:rFonts w:ascii="Courier New" w:hAnsi="Courier New" w:cs="Courier New"/>
-          <w:sz w:val="20"/>
-          <w:szCs w:val="20"/>
-          <w:lang w:val="ru-RU"/>
-        </w:rPr>
-        <w:t xml:space="preserve">    </w:t>
-      </w:r>
-      <w:r>
-        <w:rPr>
-          <w:rFonts w:ascii="Courier New" w:hAnsi="Courier New" w:cs="Courier New"/>
-          <w:sz w:val="20"/>
-          <w:szCs w:val="20"/>
-          <w:lang w:val="en-US"/>
-        </w:rPr>
-        <w:t>return 0;</w:t>
-      </w:r>
-    </w:p>
-    <w:p>
-      <w:pPr>
-        <w:rPr>
-          <w:rFonts w:ascii="Courier New" w:hAnsi="Courier New" w:cs="Courier New"/>
-          <w:sz w:val="20"/>
-          <w:szCs w:val="20"/>
-          <w:lang w:val="en-US"/>
-        </w:rPr>
-      </w:pPr>
-      <w:r>
-        <w:rPr>
-          <w:rFonts w:ascii="Courier New" w:hAnsi="Courier New" w:cs="Courier New"/>
-          <w:sz w:val="20"/>
-          <w:szCs w:val="20"/>
-          <w:lang w:val="en-US"/>
-        </w:rPr>
-        <w:t>}</w:t>
-      </w:r>
-    </w:p>
-    <w:p>
-      <w:pPr>
-        <w:rPr>
-          <w:sz w:val="28"/>
-          <w:szCs w:val="28"/>
-          <w:lang w:val="ru-RU"/>
-        </w:rPr>
       </w:pPr>
     </w:p>
     <w:sectPr>
-      <w:headerReference w:type="even" r:id="rId8"/>
-      <w:headerReference w:type="default" r:id="rId9"/>
+      <w:headerReference w:type="even" r:id="rId9"/>
+      <w:headerReference w:type="default" r:id="rId10"/>
       <w:pgSz w:w="11906" w:h="16838" w:code="9"/>
       <w:pgMar w:top="567" w:right="567" w:bottom="567" w:left="1134" w:header="539" w:footer="539" w:gutter="0"/>
       <w:pgNumType w:start="0"/>

</xml_diff>